<commit_message>
Refine betterment levy estimate using itemized 2026 works pipeline
Use the actual Plan de Obras file (Obras y Espacios Publicos - Proyectos a
ejecutar 2026) item by item instead of an approximate cost base:

- Add Table 4: the 10 funded projects with budgets (ARS 6.85B total) and
  their planning-priority weights (EA 80%/20%); 12 unfunded projects excluded.
- Betterment cost base now = priority-weighted, betterment-eligible works
  (excl. network-level Cacique Guaymallen bridge) = ARS 3.49B (USD 2.81M).
- CPM potential recomputed: USD 0.70M/1.12M/1.40M (Low/Base/High).
- Combined annual revenue potential updated to USD 1.72M/2.62M/5.39M.
- Renumbered tables in reading order (3 realized, 4 works, 5 summary).
- README updated with the works pipeline breakdown.
</commit_message>
<xml_diff>
--- a/paper/LVC_Climate_Adaptation_Paper_revised_estimations.docx
+++ b/paper/LVC_Climate_Adaptation_Paper_revised_estimations.docx
@@ -3113,7 +3113,7 @@
     </w:p>
     <w:p>
       <w:r>
-        <w:t>This section reports revenue on two distinct evidentiary footings, and we are explicit about which is which. The first is realized revenue: amounts actually collected by the two instruments that are already operational—the water-and-sewer feasibility contribution and the vacant-land surcharge. These are drawn from municipal collection records for 2021–2025 and from the 2026 tax roll (padrón), and are expressed in inflation- and exchange-rate-adjusted US dollars using INDEC consumer-price and official ARS/USD series. The second is ex-ante potential: scenario-based estimates for the value-capture instruments that are designed but not yet sanctioned and applied—the betterment levy (Contribución por Mejoras), differential rent capture (Participación en la Valoración de Activos), and development-rights sales (Suelo Creado / CEODEC). Because no transactions exist for these instruments yet, their estimates combine the actual calculation formulas set out in the draft Ordinance of Urban-Economy Instruments with parameters calibrated against real municipal data: the 2026 public-works programme for the betterment levy, and the municipal land-value and fiscal-assessment maps for the development-rights and differential-rent instruments. The value of the Tax Unit (Unidad Tributaria, UT) is set at its real 2026 level of ARS 235 (Tarifaria 2026, Art. 54), and all figures are converted at the 2025 average exchange rate of ARS 1,244.17 per US dollar. We model three scenarios—conservative (Low), baseline (Base), and optimistic (High)—and emphasise that the ex-ante point estimates are illustrative: their contribution is the method and the realized-revenue evidence, not precise forecasts.</w:t>
+        <w:t>This section reports revenue on two distinct evidentiary footings, and we are explicit about which is which. The first is realized revenue: amounts actually collected by the two instruments that are already operational—the water-and-sewer feasibility contribution and the vacant-land surcharge. These are drawn from municipal collection records for 2021–2025 and from the 2026 tax roll (padrón), and are expressed in inflation- and exchange-rate-adjusted US dollars using INDEC consumer-price and official ARS/USD series. The second is ex-ante potential: scenario-based estimates for the value-capture instruments that are designed but not yet sanctioned and applied—the betterment levy (Contribución por Mejoras), differential rent capture (Participación en la Valoración de Activos), and development-rights sales (Suelo Creado / CEODEC). Because no transactions exist for these instruments yet, their estimates combine the actual calculation formulas set out in the draft Ordinance of Urban-Economy Instruments with parameters calibrated against real municipal data: the itemised 2026 public-works programme for the betterment levy, and the municipal land-value and fiscal-assessment maps for the development-rights and differential-rent instruments. The value of the Tax Unit (Unidad Tributaria, UT) is set at its real 2026 level of ARS 235 (Tarifaria 2026, Art. 54), and all figures are converted at the 2025 average exchange rate of ARS 1,244.17 per US dollar. We model three scenarios—conservative (Low), baseline (Base), and optimistic (High)—and emphasise that the ex-ante point estimates are illustrative: their contribution is the method and the realized-revenue evidence, not precise forecasts.</w:t>
       </w:r>
     </w:p>
     <w:p>
@@ -3499,17 +3499,7 @@
     </w:p>
     <w:p>
       <w:r>
-        <w:t>For the designed instruments we apply the ordinance formulas to real municipal parameters. The betterment levy is sized against the municipality’s actual 2026 public-works programme, which budgets approximately ARS 6.85 billion (about USD 5.5 million) across road, public-space, and infrastructure projects. Restricting the base to works that generate identifiable benefit to adjacent properties (≈ARS 4.85 billion, after excluding network-level works such as the Cacique Guaymallén canal bridge) and applying cost-recovery shares of 25 to 50 percent—within the ordinance’s legal ceilings, under which recovery may not exceed the value increment and aggregate betterment charges may not exceed 50 percent of assessed value—yields a betterment potential of roughly ARS 1.2 to 2.4 billion per year (USD 0.97–1.95 million).</w:t>
-      </w:r>
-    </w:p>
-    <w:p>
-      <w:r>
-        <w:t>Development-rights sales and differential rent capture are calibrated against the municipal land-value map, which records undeveloped land prices ranging from under USD 10 per square metre in the rural piedmont to more than USD 150 per square metre in consolidated urban zones. Pricing additional buildable area at 20 to 40 percent of zone land value (≈50–300 UT/m²) and assuming an annual pipeline of 2,000 to 20,000 m² of development rights yields a development-rights potential of ARS 24 to 1,410 million per year (USD 0.02–1.13 million). Applying analogous unit values to 5,000 to 50,000 m² of annual additional buildable demand created by rezoning gives a differential-rent potential of ARS 35 to 2,350 million per year (USD 0.03–1.89 million). The remaining two instruments are not separately quantified: transferable development rights depend on an as-yet-untraded market, and tax incentives operate as a net fiscal cost in the early years before becoming revenue-neutral.</w:t>
-      </w:r>
-    </w:p>
-    <w:p>
-      <w:r>
-        <w:t>Aggregating the three quantifiable value-capture instruments gives an ex-ante potential of approximately USD 1.0 million (Low), USD 2.1 million (Base), and USD 5.0 million (High) per year (Table 4). Combined with the roughly USD 0.97 million of realized operational revenue, the framework’s total annual revenue potential is on the order of USD 2.0 million (Low) to USD 5.9 million (High), with a baseline near USD 3.1 million. Notably, the betterment levy—anchored in a real, budgeted works programme—emerges as the single largest prospective contributor, followed by the already-operational water-and-sewer charge; this ordering is grounded in observed municipal data rather than assumed shares.</w:t>
+        <w:t>For the designed instruments we apply the ordinance formulas to real municipal parameters. The betterment levy is sized against the municipality’s actual 2026 public-works programme (Table 4), which budgets approximately ARS 6.85 billion (about USD 5.5 million) across ten funded road, public-space, and infrastructure projects; a further twelve projects carry no separate budget, being financed within the operating pavement budget or executed by the province, and are excluded from the base. Each funded project carries a planning-priority weight in the programme (80 percent for priority-1 works, 20 percent for priority-2). Applying these weights and excluding the network-level east–west canal bridge—the single largest item, whose benefit to land value is diffuse rather than localised—leaves a betterment-eligible, priority-weighted base of about ARS 3.49 billion (USD 2.81 million). Applying cost-recovery shares of 25 to 50 percent, within the ordinance’s legal ceilings (recovery may not exceed the value increment, and aggregate betterment charges may not exceed 50 percent of assessed value), yields a betterment potential of roughly ARS 0.87 to 1.75 billion per year (USD 0.70–1.40 million).</w:t>
       </w:r>
     </w:p>
     <w:tbl>
@@ -3535,7 +3525,7 @@
               <w:rPr>
                 <w:b/>
               </w:rPr>
-              <w:t>Instrument</w:t>
+              <w:t>ID</w:t>
             </w:r>
           </w:p>
         </w:tc>
@@ -3549,7 +3539,7 @@
               <w:rPr>
                 <w:b/>
               </w:rPr>
-              <w:t>Basis (real municipal data)</w:t>
+              <w:t>Project</w:t>
             </w:r>
           </w:p>
         </w:tc>
@@ -3563,7 +3553,7 @@
               <w:rPr>
                 <w:b/>
               </w:rPr>
-              <w:t>Low (USD/yr)</w:t>
+              <w:t>Programme</w:t>
             </w:r>
           </w:p>
         </w:tc>
@@ -3577,7 +3567,7 @@
               <w:rPr>
                 <w:b/>
               </w:rPr>
-              <w:t>Base (USD/yr)</w:t>
+              <w:t>Budget (ARS)</w:t>
             </w:r>
           </w:p>
         </w:tc>
@@ -3591,7 +3581,7 @@
               <w:rPr>
                 <w:b/>
               </w:rPr>
-              <w:t>High (USD/yr)</w:t>
+              <w:t>Priority (EA)</w:t>
             </w:r>
           </w:p>
         </w:tc>
@@ -3604,51 +3594,51 @@
           <w:p>
             <w:r/>
             <w:r>
-              <w:t>Betterment contributions (CPM)</w:t>
-            </w:r>
-          </w:p>
-        </w:tc>
-        <w:tc>
-          <w:tcPr>
-            <w:tcW w:type="dxa" w:w="1872"/>
-          </w:tcPr>
-          <w:p>
-            <w:r/>
-            <w:r>
-              <w:t>2026 works programme: ≈ARS 4.85 B eligible × 25–50%</w:t>
-            </w:r>
-          </w:p>
-        </w:tc>
-        <w:tc>
-          <w:tcPr>
-            <w:tcW w:type="dxa" w:w="1872"/>
-          </w:tcPr>
-          <w:p>
-            <w:r/>
-            <w:r>
-              <w:t>0.97 M</w:t>
-            </w:r>
-          </w:p>
-        </w:tc>
-        <w:tc>
-          <w:tcPr>
-            <w:tcW w:type="dxa" w:w="1872"/>
-          </w:tcPr>
-          <w:p>
-            <w:r/>
-            <w:r>
-              <w:t>1.56 M</w:t>
-            </w:r>
-          </w:p>
-        </w:tc>
-        <w:tc>
-          <w:tcPr>
-            <w:tcW w:type="dxa" w:w="1872"/>
-          </w:tcPr>
-          <w:p>
-            <w:r/>
-            <w:r>
-              <w:t>1.95 M</w:t>
+              <w:t>1274</w:t>
+            </w:r>
+          </w:p>
+        </w:tc>
+        <w:tc>
+          <w:tcPr>
+            <w:tcW w:type="dxa" w:w="1872"/>
+          </w:tcPr>
+          <w:p>
+            <w:r/>
+            <w:r>
+              <w:t>Cacique Guaymallén canal bridge (E–W integration)</w:t>
+            </w:r>
+          </w:p>
+        </w:tc>
+        <w:tc>
+          <w:tcPr>
+            <w:tcW w:type="dxa" w:w="1872"/>
+          </w:tcPr>
+          <w:p>
+            <w:r/>
+            <w:r>
+              <w:t>Road works</w:t>
+            </w:r>
+          </w:p>
+        </w:tc>
+        <w:tc>
+          <w:tcPr>
+            <w:tcW w:type="dxa" w:w="1872"/>
+          </w:tcPr>
+          <w:p>
+            <w:r/>
+            <w:r>
+              <w:t>2,000,000,000</w:t>
+            </w:r>
+          </w:p>
+        </w:tc>
+        <w:tc>
+          <w:tcPr>
+            <w:tcW w:type="dxa" w:w="1872"/>
+          </w:tcPr>
+          <w:p>
+            <w:r/>
+            <w:r>
+              <w:t>1 (80%)</w:t>
             </w:r>
           </w:p>
         </w:tc>
@@ -3661,51 +3651,51 @@
           <w:p>
             <w:r/>
             <w:r>
-              <w:t>Differential rent capture (PVA)</w:t>
-            </w:r>
-          </w:p>
-        </w:tc>
-        <w:tc>
-          <w:tcPr>
-            <w:tcW w:type="dxa" w:w="1872"/>
-          </w:tcPr>
-          <w:p>
-            <w:r/>
-            <w:r>
-              <w:t>Land-value map; 5–50k m² × 30–200 UT/m²</w:t>
-            </w:r>
-          </w:p>
-        </w:tc>
-        <w:tc>
-          <w:tcPr>
-            <w:tcW w:type="dxa" w:w="1872"/>
-          </w:tcPr>
-          <w:p>
-            <w:r/>
-            <w:r>
-              <w:t>0.03 M</w:t>
-            </w:r>
-          </w:p>
-        </w:tc>
-        <w:tc>
-          <w:tcPr>
-            <w:tcW w:type="dxa" w:w="1872"/>
-          </w:tcPr>
-          <w:p>
-            <w:r/>
-            <w:r>
-              <w:t>0.30 M</w:t>
-            </w:r>
-          </w:p>
-        </w:tc>
-        <w:tc>
-          <w:tcPr>
-            <w:tcW w:type="dxa" w:w="1872"/>
-          </w:tcPr>
-          <w:p>
-            <w:r/>
-            <w:r>
-              <w:t>1.89 M</w:t>
+              <w:t>395</w:t>
+            </w:r>
+          </w:p>
+        </w:tc>
+        <w:tc>
+          <w:tcPr>
+            <w:tcW w:type="dxa" w:w="1872"/>
+          </w:tcPr>
+          <w:p>
+            <w:r/>
+            <w:r>
+              <w:t>Urban centrality — street/pedestrian/drainage upgrade</w:t>
+            </w:r>
+          </w:p>
+        </w:tc>
+        <w:tc>
+          <w:tcPr>
+            <w:tcW w:type="dxa" w:w="1872"/>
+          </w:tcPr>
+          <w:p>
+            <w:r/>
+            <w:r>
+              <w:t>Urban centrality</w:t>
+            </w:r>
+          </w:p>
+        </w:tc>
+        <w:tc>
+          <w:tcPr>
+            <w:tcW w:type="dxa" w:w="1872"/>
+          </w:tcPr>
+          <w:p>
+            <w:r/>
+            <w:r>
+              <w:t>1,500,000,000</w:t>
+            </w:r>
+          </w:p>
+        </w:tc>
+        <w:tc>
+          <w:tcPr>
+            <w:tcW w:type="dxa" w:w="1872"/>
+          </w:tcPr>
+          <w:p>
+            <w:r/>
+            <w:r>
+              <w:t>1 (80%)</w:t>
             </w:r>
           </w:p>
         </w:tc>
@@ -3718,51 +3708,51 @@
           <w:p>
             <w:r/>
             <w:r>
-              <w:t>Development-rights sales (Suelo Creado)</w:t>
-            </w:r>
-          </w:p>
-        </w:tc>
-        <w:tc>
-          <w:tcPr>
-            <w:tcW w:type="dxa" w:w="1872"/>
-          </w:tcPr>
-          <w:p>
-            <w:r/>
-            <w:r>
-              <w:t>Land-value map; 2–20k m² × 50–300 UT/m²</w:t>
-            </w:r>
-          </w:p>
-        </w:tc>
-        <w:tc>
-          <w:tcPr>
-            <w:tcW w:type="dxa" w:w="1872"/>
-          </w:tcPr>
-          <w:p>
-            <w:r/>
-            <w:r>
-              <w:t>0.02 M</w:t>
-            </w:r>
-          </w:p>
-        </w:tc>
-        <w:tc>
-          <w:tcPr>
-            <w:tcW w:type="dxa" w:w="1872"/>
-          </w:tcPr>
-          <w:p>
-            <w:r/>
-            <w:r>
-              <w:t>0.23 M</w:t>
-            </w:r>
-          </w:p>
-        </w:tc>
-        <w:tc>
-          <w:tcPr>
-            <w:tcW w:type="dxa" w:w="1872"/>
-          </w:tcPr>
-          <w:p>
-            <w:r/>
-            <w:r>
-              <w:t>1.13 M</w:t>
+              <w:t>773</w:t>
+            </w:r>
+          </w:p>
+        </w:tc>
+        <w:tc>
+          <w:tcPr>
+            <w:tcW w:type="dxa" w:w="1872"/>
+          </w:tcPr>
+          <w:p>
+            <w:r/>
+            <w:r>
+              <w:t>Saenz Peña–La Carrodilla / Ruta 15 centrality</w:t>
+            </w:r>
+          </w:p>
+        </w:tc>
+        <w:tc>
+          <w:tcPr>
+            <w:tcW w:type="dxa" w:w="1872"/>
+          </w:tcPr>
+          <w:p>
+            <w:r/>
+            <w:r>
+              <w:t>Urban centrality</w:t>
+            </w:r>
+          </w:p>
+        </w:tc>
+        <w:tc>
+          <w:tcPr>
+            <w:tcW w:type="dxa" w:w="1872"/>
+          </w:tcPr>
+          <w:p>
+            <w:r/>
+            <w:r>
+              <w:t>1,500,000,000</w:t>
+            </w:r>
+          </w:p>
+        </w:tc>
+        <w:tc>
+          <w:tcPr>
+            <w:tcW w:type="dxa" w:w="1872"/>
+          </w:tcPr>
+          <w:p>
+            <w:r/>
+            <w:r>
+              <w:t>1 (80%)</w:t>
             </w:r>
           </w:p>
         </w:tc>
@@ -3775,49 +3765,51 @@
           <w:p>
             <w:r/>
             <w:r>
-              <w:t>Subtotal — value capture (ex-ante)</w:t>
-            </w:r>
-          </w:p>
-        </w:tc>
-        <w:tc>
-          <w:tcPr>
-            <w:tcW w:type="dxa" w:w="1872"/>
-          </w:tcPr>
-          <w:p>
-            <w:r/>
-            <w:r/>
-          </w:p>
-        </w:tc>
-        <w:tc>
-          <w:tcPr>
-            <w:tcW w:type="dxa" w:w="1872"/>
-          </w:tcPr>
-          <w:p>
-            <w:r/>
-            <w:r>
-              <w:t>1.02 M</w:t>
-            </w:r>
-          </w:p>
-        </w:tc>
-        <w:tc>
-          <w:tcPr>
-            <w:tcW w:type="dxa" w:w="1872"/>
-          </w:tcPr>
-          <w:p>
-            <w:r/>
-            <w:r>
-              <w:t>2.09 M</w:t>
-            </w:r>
-          </w:p>
-        </w:tc>
-        <w:tc>
-          <w:tcPr>
-            <w:tcW w:type="dxa" w:w="1872"/>
-          </w:tcPr>
-          <w:p>
-            <w:r/>
-            <w:r>
-              <w:t>4.97 M</w:t>
+              <w:t>865</w:t>
+            </w:r>
+          </w:p>
+        </w:tc>
+        <w:tc>
+          <w:tcPr>
+            <w:tcW w:type="dxa" w:w="1872"/>
+          </w:tcPr>
+          <w:p>
+            <w:r/>
+            <w:r>
+              <w:t>Microplazas (20 planned; ~10 in 2026)</w:t>
+            </w:r>
+          </w:p>
+        </w:tc>
+        <w:tc>
+          <w:tcPr>
+            <w:tcW w:type="dxa" w:w="1872"/>
+          </w:tcPr>
+          <w:p>
+            <w:r/>
+            <w:r>
+              <w:t>Parks &amp; squares</w:t>
+            </w:r>
+          </w:p>
+        </w:tc>
+        <w:tc>
+          <w:tcPr>
+            <w:tcW w:type="dxa" w:w="1872"/>
+          </w:tcPr>
+          <w:p>
+            <w:r/>
+            <w:r>
+              <w:t>1,200,000,000</w:t>
+            </w:r>
+          </w:p>
+        </w:tc>
+        <w:tc>
+          <w:tcPr>
+            <w:tcW w:type="dxa" w:w="1872"/>
+          </w:tcPr>
+          <w:p>
+            <w:r/>
+            <w:r>
+              <w:t>1 (80%)</w:t>
             </w:r>
           </w:p>
         </w:tc>
@@ -3830,51 +3822,51 @@
           <w:p>
             <w:r/>
             <w:r>
-              <w:t>Realized operational (water &amp; sewer + vacant land)</w:t>
-            </w:r>
-          </w:p>
-        </w:tc>
-        <w:tc>
-          <w:tcPr>
-            <w:tcW w:type="dxa" w:w="1872"/>
-          </w:tcPr>
-          <w:p>
-            <w:r/>
-            <w:r>
-              <w:t>Municipal records (2025 / 2026)</w:t>
-            </w:r>
-          </w:p>
-        </w:tc>
-        <w:tc>
-          <w:tcPr>
-            <w:tcW w:type="dxa" w:w="1872"/>
-          </w:tcPr>
-          <w:p>
-            <w:r/>
-            <w:r>
-              <w:t>0.97 M</w:t>
-            </w:r>
-          </w:p>
-        </w:tc>
-        <w:tc>
-          <w:tcPr>
-            <w:tcW w:type="dxa" w:w="1872"/>
-          </w:tcPr>
-          <w:p>
-            <w:r/>
-            <w:r>
-              <w:t>0.97 M</w:t>
-            </w:r>
-          </w:p>
-        </w:tc>
-        <w:tc>
-          <w:tcPr>
-            <w:tcW w:type="dxa" w:w="1872"/>
-          </w:tcPr>
-          <w:p>
-            <w:r/>
-            <w:r>
-              <w:t>0.97 M</w:t>
+              <w:t>993</w:t>
+            </w:r>
+          </w:p>
+        </w:tc>
+        <w:tc>
+          <w:tcPr>
+            <w:tcW w:type="dxa" w:w="1872"/>
+          </w:tcPr>
+          <w:p>
+            <w:r/>
+            <w:r>
+              <w:t>Speed reducers / safe prefabricated crossings</w:t>
+            </w:r>
+          </w:p>
+        </w:tc>
+        <w:tc>
+          <w:tcPr>
+            <w:tcW w:type="dxa" w:w="1872"/>
+          </w:tcPr>
+          <w:p>
+            <w:r/>
+            <w:r>
+              <w:t>Road works</w:t>
+            </w:r>
+          </w:p>
+        </w:tc>
+        <w:tc>
+          <w:tcPr>
+            <w:tcW w:type="dxa" w:w="1872"/>
+          </w:tcPr>
+          <w:p>
+            <w:r/>
+            <w:r>
+              <w:t>350,000,000</w:t>
+            </w:r>
+          </w:p>
+        </w:tc>
+        <w:tc>
+          <w:tcPr>
+            <w:tcW w:type="dxa" w:w="1872"/>
+          </w:tcPr>
+          <w:p>
+            <w:r/>
+            <w:r>
+              <w:t>2 (20%)</w:t>
             </w:r>
           </w:p>
         </w:tc>
@@ -3887,50 +3879,433 @@
           <w:p>
             <w:r/>
             <w:r>
-              <w:t>Total annual revenue potential</w:t>
-            </w:r>
-          </w:p>
-        </w:tc>
-        <w:tc>
-          <w:tcPr>
-            <w:tcW w:type="dxa" w:w="1872"/>
-          </w:tcPr>
-          <w:p>
-            <w:r/>
-            <w:r/>
-          </w:p>
-        </w:tc>
-        <w:tc>
-          <w:tcPr>
-            <w:tcW w:type="dxa" w:w="1872"/>
-          </w:tcPr>
-          <w:p>
-            <w:r/>
-            <w:r>
-              <w:t>1.99 M</w:t>
-            </w:r>
-          </w:p>
-        </w:tc>
-        <w:tc>
-          <w:tcPr>
-            <w:tcW w:type="dxa" w:w="1872"/>
-          </w:tcPr>
-          <w:p>
-            <w:r/>
-            <w:r>
-              <w:t>3.06 M</w:t>
-            </w:r>
-          </w:p>
-        </w:tc>
-        <w:tc>
-          <w:tcPr>
-            <w:tcW w:type="dxa" w:w="1872"/>
-          </w:tcPr>
-          <w:p>
-            <w:r/>
-            <w:r>
-              <w:t>5.94 M</w:t>
-            </w:r>
+              <w:t>994</w:t>
+            </w:r>
+          </w:p>
+        </w:tc>
+        <w:tc>
+          <w:tcPr>
+            <w:tcW w:type="dxa" w:w="1872"/>
+          </w:tcPr>
+          <w:p>
+            <w:r/>
+            <w:r>
+              <w:t>Secure monitored infrastructure points (5 stops)</w:t>
+            </w:r>
+          </w:p>
+        </w:tc>
+        <w:tc>
+          <w:tcPr>
+            <w:tcW w:type="dxa" w:w="1872"/>
+          </w:tcPr>
+          <w:p>
+            <w:r/>
+            <w:r>
+              <w:t>Infrastructure</w:t>
+            </w:r>
+          </w:p>
+        </w:tc>
+        <w:tc>
+          <w:tcPr>
+            <w:tcW w:type="dxa" w:w="1872"/>
+          </w:tcPr>
+          <w:p>
+            <w:r/>
+            <w:r>
+              <w:t>200,000,000</w:t>
+            </w:r>
+          </w:p>
+        </w:tc>
+        <w:tc>
+          <w:tcPr>
+            <w:tcW w:type="dxa" w:w="1872"/>
+          </w:tcPr>
+          <w:p>
+            <w:r/>
+            <w:r>
+              <w:t>2 (20%)</w:t>
+            </w:r>
+          </w:p>
+        </w:tc>
+      </w:tr>
+      <w:tr>
+        <w:tc>
+          <w:tcPr>
+            <w:tcW w:type="dxa" w:w="1872"/>
+          </w:tcPr>
+          <w:p>
+            <w:r/>
+            <w:r>
+              <w:t>464</w:t>
+            </w:r>
+          </w:p>
+        </w:tc>
+        <w:tc>
+          <w:tcPr>
+            <w:tcW w:type="dxa" w:w="1872"/>
+          </w:tcPr>
+          <w:p>
+            <w:r/>
+            <w:r>
+              <w:t>Connected bus shelters</w:t>
+            </w:r>
+          </w:p>
+        </w:tc>
+        <w:tc>
+          <w:tcPr>
+            <w:tcW w:type="dxa" w:w="1872"/>
+          </w:tcPr>
+          <w:p>
+            <w:r/>
+            <w:r>
+              <w:t>Public space</w:t>
+            </w:r>
+          </w:p>
+        </w:tc>
+        <w:tc>
+          <w:tcPr>
+            <w:tcW w:type="dxa" w:w="1872"/>
+          </w:tcPr>
+          <w:p>
+            <w:r/>
+            <w:r>
+              <w:t>33,750,000</w:t>
+            </w:r>
+          </w:p>
+        </w:tc>
+        <w:tc>
+          <w:tcPr>
+            <w:tcW w:type="dxa" w:w="1872"/>
+          </w:tcPr>
+          <w:p>
+            <w:r/>
+            <w:r>
+              <w:t>2 (20%)</w:t>
+            </w:r>
+          </w:p>
+        </w:tc>
+      </w:tr>
+      <w:tr>
+        <w:tc>
+          <w:tcPr>
+            <w:tcW w:type="dxa" w:w="1872"/>
+          </w:tcPr>
+          <w:p>
+            <w:r/>
+            <w:r>
+              <w:t>452</w:t>
+            </w:r>
+          </w:p>
+        </w:tc>
+        <w:tc>
+          <w:tcPr>
+            <w:tcW w:type="dxa" w:w="1872"/>
+          </w:tcPr>
+          <w:p>
+            <w:r/>
+            <w:r>
+              <w:t>Sidewalks Zapiola &amp; Pueyrredón (1,750 m)</w:t>
+            </w:r>
+          </w:p>
+        </w:tc>
+        <w:tc>
+          <w:tcPr>
+            <w:tcW w:type="dxa" w:w="1872"/>
+          </w:tcPr>
+          <w:p>
+            <w:r/>
+            <w:r>
+              <w:t>Maintenance</w:t>
+            </w:r>
+          </w:p>
+        </w:tc>
+        <w:tc>
+          <w:tcPr>
+            <w:tcW w:type="dxa" w:w="1872"/>
+          </w:tcPr>
+          <w:p>
+            <w:r/>
+            <w:r>
+              <w:t>30,562,500</w:t>
+            </w:r>
+          </w:p>
+        </w:tc>
+        <w:tc>
+          <w:tcPr>
+            <w:tcW w:type="dxa" w:w="1872"/>
+          </w:tcPr>
+          <w:p>
+            <w:r/>
+            <w:r>
+              <w:t>2 (20%)</w:t>
+            </w:r>
+          </w:p>
+        </w:tc>
+      </w:tr>
+      <w:tr>
+        <w:tc>
+          <w:tcPr>
+            <w:tcW w:type="dxa" w:w="1872"/>
+          </w:tcPr>
+          <w:p>
+            <w:r/>
+            <w:r>
+              <w:t>575</w:t>
+            </w:r>
+          </w:p>
+        </w:tc>
+        <w:tc>
+          <w:tcPr>
+            <w:tcW w:type="dxa" w:w="1872"/>
+          </w:tcPr>
+          <w:p>
+            <w:r/>
+            <w:r>
+              <w:t>Boulevard Tierra del Fuego (400 m)</w:t>
+            </w:r>
+          </w:p>
+        </w:tc>
+        <w:tc>
+          <w:tcPr>
+            <w:tcW w:type="dxa" w:w="1872"/>
+          </w:tcPr>
+          <w:p>
+            <w:r/>
+            <w:r>
+              <w:t>Maintenance</w:t>
+            </w:r>
+          </w:p>
+        </w:tc>
+        <w:tc>
+          <w:tcPr>
+            <w:tcW w:type="dxa" w:w="1872"/>
+          </w:tcPr>
+          <w:p>
+            <w:r/>
+            <w:r>
+              <w:t>24,570,000</w:t>
+            </w:r>
+          </w:p>
+        </w:tc>
+        <w:tc>
+          <w:tcPr>
+            <w:tcW w:type="dxa" w:w="1872"/>
+          </w:tcPr>
+          <w:p>
+            <w:r/>
+            <w:r>
+              <w:t>2 (20%)</w:t>
+            </w:r>
+          </w:p>
+        </w:tc>
+      </w:tr>
+      <w:tr>
+        <w:tc>
+          <w:tcPr>
+            <w:tcW w:type="dxa" w:w="1872"/>
+          </w:tcPr>
+          <w:p>
+            <w:r/>
+            <w:r>
+              <w:t>463</w:t>
+            </w:r>
+          </w:p>
+        </w:tc>
+        <w:tc>
+          <w:tcPr>
+            <w:tcW w:type="dxa" w:w="1872"/>
+          </w:tcPr>
+          <w:p>
+            <w:r/>
+            <w:r>
+              <w:t>Polideportivo sidewalk (600 m)</w:t>
+            </w:r>
+          </w:p>
+        </w:tc>
+        <w:tc>
+          <w:tcPr>
+            <w:tcW w:type="dxa" w:w="1872"/>
+          </w:tcPr>
+          <w:p>
+            <w:r/>
+            <w:r>
+              <w:t>Parks &amp; squares</w:t>
+            </w:r>
+          </w:p>
+        </w:tc>
+        <w:tc>
+          <w:tcPr>
+            <w:tcW w:type="dxa" w:w="1872"/>
+          </w:tcPr>
+          <w:p>
+            <w:r/>
+            <w:r>
+              <w:t>15,000,000</w:t>
+            </w:r>
+          </w:p>
+        </w:tc>
+        <w:tc>
+          <w:tcPr>
+            <w:tcW w:type="dxa" w:w="1872"/>
+          </w:tcPr>
+          <w:p>
+            <w:r/>
+            <w:r>
+              <w:t>2 (20%)</w:t>
+            </w:r>
+          </w:p>
+        </w:tc>
+      </w:tr>
+      <w:tr>
+        <w:tc>
+          <w:tcPr>
+            <w:tcW w:type="dxa" w:w="1872"/>
+          </w:tcPr>
+          <w:p>
+            <w:r/>
+            <w:r/>
+          </w:p>
+        </w:tc>
+        <w:tc>
+          <w:tcPr>
+            <w:tcW w:type="dxa" w:w="1872"/>
+          </w:tcPr>
+          <w:p>
+            <w:r/>
+            <w:r>
+              <w:t>Total funded programme</w:t>
+            </w:r>
+          </w:p>
+        </w:tc>
+        <w:tc>
+          <w:tcPr>
+            <w:tcW w:type="dxa" w:w="1872"/>
+          </w:tcPr>
+          <w:p>
+            <w:r/>
+            <w:r/>
+          </w:p>
+        </w:tc>
+        <w:tc>
+          <w:tcPr>
+            <w:tcW w:type="dxa" w:w="1872"/>
+          </w:tcPr>
+          <w:p>
+            <w:r/>
+            <w:r>
+              <w:t>6,853,882,500</w:t>
+            </w:r>
+          </w:p>
+        </w:tc>
+        <w:tc>
+          <w:tcPr>
+            <w:tcW w:type="dxa" w:w="1872"/>
+          </w:tcPr>
+          <w:p>
+            <w:r/>
+            <w:r/>
+          </w:p>
+        </w:tc>
+      </w:tr>
+      <w:tr>
+        <w:tc>
+          <w:tcPr>
+            <w:tcW w:type="dxa" w:w="1872"/>
+          </w:tcPr>
+          <w:p>
+            <w:r/>
+            <w:r/>
+          </w:p>
+        </w:tc>
+        <w:tc>
+          <w:tcPr>
+            <w:tcW w:type="dxa" w:w="1872"/>
+          </w:tcPr>
+          <w:p>
+            <w:r/>
+            <w:r>
+              <w:t>Priority-weighted (EA 80/20)</w:t>
+            </w:r>
+          </w:p>
+        </w:tc>
+        <w:tc>
+          <w:tcPr>
+            <w:tcW w:type="dxa" w:w="1872"/>
+          </w:tcPr>
+          <w:p>
+            <w:r/>
+            <w:r/>
+          </w:p>
+        </w:tc>
+        <w:tc>
+          <w:tcPr>
+            <w:tcW w:type="dxa" w:w="1872"/>
+          </w:tcPr>
+          <w:p>
+            <w:r/>
+            <w:r>
+              <w:t>5,090,776,500</w:t>
+            </w:r>
+          </w:p>
+        </w:tc>
+        <w:tc>
+          <w:tcPr>
+            <w:tcW w:type="dxa" w:w="1872"/>
+          </w:tcPr>
+          <w:p>
+            <w:r/>
+            <w:r/>
+          </w:p>
+        </w:tc>
+      </w:tr>
+      <w:tr>
+        <w:tc>
+          <w:tcPr>
+            <w:tcW w:type="dxa" w:w="1872"/>
+          </w:tcPr>
+          <w:p>
+            <w:r/>
+            <w:r/>
+          </w:p>
+        </w:tc>
+        <w:tc>
+          <w:tcPr>
+            <w:tcW w:type="dxa" w:w="1872"/>
+          </w:tcPr>
+          <w:p>
+            <w:r/>
+            <w:r>
+              <w:t>Betterment-eligible, weighted (excl. ID 1274)</w:t>
+            </w:r>
+          </w:p>
+        </w:tc>
+        <w:tc>
+          <w:tcPr>
+            <w:tcW w:type="dxa" w:w="1872"/>
+          </w:tcPr>
+          <w:p>
+            <w:r/>
+            <w:r/>
+          </w:p>
+        </w:tc>
+        <w:tc>
+          <w:tcPr>
+            <w:tcW w:type="dxa" w:w="1872"/>
+          </w:tcPr>
+          <w:p>
+            <w:r/>
+            <w:r>
+              <w:t>3,490,776,500</w:t>
+            </w:r>
+          </w:p>
+        </w:tc>
+        <w:tc>
+          <w:tcPr>
+            <w:tcW w:type="dxa" w:w="1872"/>
+          </w:tcPr>
+          <w:p>
+            <w:r/>
+            <w:r/>
           </w:p>
         </w:tc>
       </w:tr>
@@ -3941,7 +4316,449 @@
           <w:i/>
           <w:sz w:val="18"/>
         </w:rPr>
-        <w:t>Table 4: Ex-ante value-capture potential and combined annual revenue, by instrument and scenario. Value-capture figures apply the draft ordinance formulas (UT 2026 = ARS 235) to real parameters; converted at ARS 1,244.17/USD. Ex-ante point estimates are illustrative.</w:t>
+        <w:t>Table 4: 2026 municipal public-works programme — the betterment-levy cost base. Source: Plan de Obras, “Obras y Espacios Públicos — Proyectos a ejecutar 2026.” Twelve further projects carry no separate 2026 budget (operating pavement budget or provincial execution) and are excluded.</w:t>
+      </w:r>
+    </w:p>
+    <w:p>
+      <w:r>
+        <w:t>Development-rights sales and differential rent capture are calibrated against the municipal land-value map, which records undeveloped land prices ranging from under USD 10 per square metre in the rural piedmont to more than USD 150 per square metre in consolidated urban zones. Pricing additional buildable area at 20 to 40 percent of zone land value (≈50–300 UT/m²) and assuming an annual pipeline of 2,000 to 20,000 m² of development rights yields a development-rights potential of ARS 24 to 1,410 million per year (USD 0.02–1.13 million). Applying analogous unit values to 5,000 to 50,000 m² of annual additional buildable demand created by rezoning gives a differential-rent potential of ARS 35 to 2,350 million per year (USD 0.03–1.89 million). The remaining two instruments are not separately quantified: transferable development rights depend on an as-yet-untraded market, and tax incentives operate as a net fiscal cost in the early years before becoming revenue-neutral.</w:t>
+      </w:r>
+    </w:p>
+    <w:p>
+      <w:r>
+        <w:t>Aggregating the three quantifiable value-capture instruments gives an ex-ante potential of approximately USD 0.7 million (Low), USD 1.7 million (Base), and USD 4.4 million (High) per year (Table 5). Combined with the roughly USD 0.97 million of realized operational revenue, the framework’s total annual revenue potential is on the order of USD 1.7 million (Low) to USD 5.4 million (High), with a baseline near USD 2.6 million. At the baseline, the betterment levy—anchored in the real, budgeted works programme—is the single largest prospective contributor, ahead of the already-operational water-and-sewer charge; the differential-rent instrument becomes the largest only in the optimistic scenario. This ordering is grounded in observed municipal data rather than assumed shares.</w:t>
+      </w:r>
+    </w:p>
+    <w:tbl>
+      <w:tblPr>
+        <w:tblW w:type="auto" w:w="0"/>
+        <w:tblLook w:firstColumn="1" w:firstRow="1" w:lastColumn="0" w:lastRow="0" w:noHBand="0" w:noVBand="1" w:val="04A0"/>
+      </w:tblPr>
+      <w:tblGrid>
+        <w:gridCol w:w="1872"/>
+        <w:gridCol w:w="1872"/>
+        <w:gridCol w:w="1872"/>
+        <w:gridCol w:w="1872"/>
+        <w:gridCol w:w="1872"/>
+      </w:tblGrid>
+      <w:tr>
+        <w:tc>
+          <w:tcPr>
+            <w:tcW w:type="dxa" w:w="1872"/>
+          </w:tcPr>
+          <w:p>
+            <w:r/>
+            <w:r>
+              <w:rPr>
+                <w:b/>
+              </w:rPr>
+              <w:t>Instrument</w:t>
+            </w:r>
+          </w:p>
+        </w:tc>
+        <w:tc>
+          <w:tcPr>
+            <w:tcW w:type="dxa" w:w="1872"/>
+          </w:tcPr>
+          <w:p>
+            <w:r/>
+            <w:r>
+              <w:rPr>
+                <w:b/>
+              </w:rPr>
+              <w:t>Basis (real municipal data)</w:t>
+            </w:r>
+          </w:p>
+        </w:tc>
+        <w:tc>
+          <w:tcPr>
+            <w:tcW w:type="dxa" w:w="1872"/>
+          </w:tcPr>
+          <w:p>
+            <w:r/>
+            <w:r>
+              <w:rPr>
+                <w:b/>
+              </w:rPr>
+              <w:t>Low (USD/yr)</w:t>
+            </w:r>
+          </w:p>
+        </w:tc>
+        <w:tc>
+          <w:tcPr>
+            <w:tcW w:type="dxa" w:w="1872"/>
+          </w:tcPr>
+          <w:p>
+            <w:r/>
+            <w:r>
+              <w:rPr>
+                <w:b/>
+              </w:rPr>
+              <w:t>Base (USD/yr)</w:t>
+            </w:r>
+          </w:p>
+        </w:tc>
+        <w:tc>
+          <w:tcPr>
+            <w:tcW w:type="dxa" w:w="1872"/>
+          </w:tcPr>
+          <w:p>
+            <w:r/>
+            <w:r>
+              <w:rPr>
+                <w:b/>
+              </w:rPr>
+              <w:t>High (USD/yr)</w:t>
+            </w:r>
+          </w:p>
+        </w:tc>
+      </w:tr>
+      <w:tr>
+        <w:tc>
+          <w:tcPr>
+            <w:tcW w:type="dxa" w:w="1872"/>
+          </w:tcPr>
+          <w:p>
+            <w:r/>
+            <w:r>
+              <w:t>Betterment contributions (CPM)</w:t>
+            </w:r>
+          </w:p>
+        </w:tc>
+        <w:tc>
+          <w:tcPr>
+            <w:tcW w:type="dxa" w:w="1872"/>
+          </w:tcPr>
+          <w:p>
+            <w:r/>
+            <w:r>
+              <w:t>2026 works programme: ARS 3.49 B eligible (EA-weighted) × 25–50%</w:t>
+            </w:r>
+          </w:p>
+        </w:tc>
+        <w:tc>
+          <w:tcPr>
+            <w:tcW w:type="dxa" w:w="1872"/>
+          </w:tcPr>
+          <w:p>
+            <w:r/>
+            <w:r>
+              <w:t>0.70 M</w:t>
+            </w:r>
+          </w:p>
+        </w:tc>
+        <w:tc>
+          <w:tcPr>
+            <w:tcW w:type="dxa" w:w="1872"/>
+          </w:tcPr>
+          <w:p>
+            <w:r/>
+            <w:r>
+              <w:t>1.12 M</w:t>
+            </w:r>
+          </w:p>
+        </w:tc>
+        <w:tc>
+          <w:tcPr>
+            <w:tcW w:type="dxa" w:w="1872"/>
+          </w:tcPr>
+          <w:p>
+            <w:r/>
+            <w:r>
+              <w:t>1.40 M</w:t>
+            </w:r>
+          </w:p>
+        </w:tc>
+      </w:tr>
+      <w:tr>
+        <w:tc>
+          <w:tcPr>
+            <w:tcW w:type="dxa" w:w="1872"/>
+          </w:tcPr>
+          <w:p>
+            <w:r/>
+            <w:r>
+              <w:t>Differential rent capture (PVA)</w:t>
+            </w:r>
+          </w:p>
+        </w:tc>
+        <w:tc>
+          <w:tcPr>
+            <w:tcW w:type="dxa" w:w="1872"/>
+          </w:tcPr>
+          <w:p>
+            <w:r/>
+            <w:r>
+              <w:t>Land-value map; 5–50k m² × 30–200 UT/m²</w:t>
+            </w:r>
+          </w:p>
+        </w:tc>
+        <w:tc>
+          <w:tcPr>
+            <w:tcW w:type="dxa" w:w="1872"/>
+          </w:tcPr>
+          <w:p>
+            <w:r/>
+            <w:r>
+              <w:t>0.03 M</w:t>
+            </w:r>
+          </w:p>
+        </w:tc>
+        <w:tc>
+          <w:tcPr>
+            <w:tcW w:type="dxa" w:w="1872"/>
+          </w:tcPr>
+          <w:p>
+            <w:r/>
+            <w:r>
+              <w:t>0.30 M</w:t>
+            </w:r>
+          </w:p>
+        </w:tc>
+        <w:tc>
+          <w:tcPr>
+            <w:tcW w:type="dxa" w:w="1872"/>
+          </w:tcPr>
+          <w:p>
+            <w:r/>
+            <w:r>
+              <w:t>1.89 M</w:t>
+            </w:r>
+          </w:p>
+        </w:tc>
+      </w:tr>
+      <w:tr>
+        <w:tc>
+          <w:tcPr>
+            <w:tcW w:type="dxa" w:w="1872"/>
+          </w:tcPr>
+          <w:p>
+            <w:r/>
+            <w:r>
+              <w:t>Development-rights sales (Suelo Creado)</w:t>
+            </w:r>
+          </w:p>
+        </w:tc>
+        <w:tc>
+          <w:tcPr>
+            <w:tcW w:type="dxa" w:w="1872"/>
+          </w:tcPr>
+          <w:p>
+            <w:r/>
+            <w:r>
+              <w:t>Land-value map; 2–20k m² × 50–300 UT/m²</w:t>
+            </w:r>
+          </w:p>
+        </w:tc>
+        <w:tc>
+          <w:tcPr>
+            <w:tcW w:type="dxa" w:w="1872"/>
+          </w:tcPr>
+          <w:p>
+            <w:r/>
+            <w:r>
+              <w:t>0.02 M</w:t>
+            </w:r>
+          </w:p>
+        </w:tc>
+        <w:tc>
+          <w:tcPr>
+            <w:tcW w:type="dxa" w:w="1872"/>
+          </w:tcPr>
+          <w:p>
+            <w:r/>
+            <w:r>
+              <w:t>0.23 M</w:t>
+            </w:r>
+          </w:p>
+        </w:tc>
+        <w:tc>
+          <w:tcPr>
+            <w:tcW w:type="dxa" w:w="1872"/>
+          </w:tcPr>
+          <w:p>
+            <w:r/>
+            <w:r>
+              <w:t>1.13 M</w:t>
+            </w:r>
+          </w:p>
+        </w:tc>
+      </w:tr>
+      <w:tr>
+        <w:tc>
+          <w:tcPr>
+            <w:tcW w:type="dxa" w:w="1872"/>
+          </w:tcPr>
+          <w:p>
+            <w:r/>
+            <w:r>
+              <w:t>Subtotal — value capture (ex-ante)</w:t>
+            </w:r>
+          </w:p>
+        </w:tc>
+        <w:tc>
+          <w:tcPr>
+            <w:tcW w:type="dxa" w:w="1872"/>
+          </w:tcPr>
+          <w:p>
+            <w:r/>
+            <w:r/>
+          </w:p>
+        </w:tc>
+        <w:tc>
+          <w:tcPr>
+            <w:tcW w:type="dxa" w:w="1872"/>
+          </w:tcPr>
+          <w:p>
+            <w:r/>
+            <w:r>
+              <w:t>0.75 M</w:t>
+            </w:r>
+          </w:p>
+        </w:tc>
+        <w:tc>
+          <w:tcPr>
+            <w:tcW w:type="dxa" w:w="1872"/>
+          </w:tcPr>
+          <w:p>
+            <w:r/>
+            <w:r>
+              <w:t>1.65 M</w:t>
+            </w:r>
+          </w:p>
+        </w:tc>
+        <w:tc>
+          <w:tcPr>
+            <w:tcW w:type="dxa" w:w="1872"/>
+          </w:tcPr>
+          <w:p>
+            <w:r/>
+            <w:r>
+              <w:t>4.42 M</w:t>
+            </w:r>
+          </w:p>
+        </w:tc>
+      </w:tr>
+      <w:tr>
+        <w:tc>
+          <w:tcPr>
+            <w:tcW w:type="dxa" w:w="1872"/>
+          </w:tcPr>
+          <w:p>
+            <w:r/>
+            <w:r>
+              <w:t>Realized operational (water &amp; sewer + vacant land)</w:t>
+            </w:r>
+          </w:p>
+        </w:tc>
+        <w:tc>
+          <w:tcPr>
+            <w:tcW w:type="dxa" w:w="1872"/>
+          </w:tcPr>
+          <w:p>
+            <w:r/>
+            <w:r>
+              <w:t>Municipal records (2025 / 2026)</w:t>
+            </w:r>
+          </w:p>
+        </w:tc>
+        <w:tc>
+          <w:tcPr>
+            <w:tcW w:type="dxa" w:w="1872"/>
+          </w:tcPr>
+          <w:p>
+            <w:r/>
+            <w:r>
+              <w:t>0.97 M</w:t>
+            </w:r>
+          </w:p>
+        </w:tc>
+        <w:tc>
+          <w:tcPr>
+            <w:tcW w:type="dxa" w:w="1872"/>
+          </w:tcPr>
+          <w:p>
+            <w:r/>
+            <w:r>
+              <w:t>0.97 M</w:t>
+            </w:r>
+          </w:p>
+        </w:tc>
+        <w:tc>
+          <w:tcPr>
+            <w:tcW w:type="dxa" w:w="1872"/>
+          </w:tcPr>
+          <w:p>
+            <w:r/>
+            <w:r>
+              <w:t>0.97 M</w:t>
+            </w:r>
+          </w:p>
+        </w:tc>
+      </w:tr>
+      <w:tr>
+        <w:tc>
+          <w:tcPr>
+            <w:tcW w:type="dxa" w:w="1872"/>
+          </w:tcPr>
+          <w:p>
+            <w:r/>
+            <w:r>
+              <w:t>Total annual revenue potential</w:t>
+            </w:r>
+          </w:p>
+        </w:tc>
+        <w:tc>
+          <w:tcPr>
+            <w:tcW w:type="dxa" w:w="1872"/>
+          </w:tcPr>
+          <w:p>
+            <w:r/>
+            <w:r/>
+          </w:p>
+        </w:tc>
+        <w:tc>
+          <w:tcPr>
+            <w:tcW w:type="dxa" w:w="1872"/>
+          </w:tcPr>
+          <w:p>
+            <w:r/>
+            <w:r>
+              <w:t>1.72 M</w:t>
+            </w:r>
+          </w:p>
+        </w:tc>
+        <w:tc>
+          <w:tcPr>
+            <w:tcW w:type="dxa" w:w="1872"/>
+          </w:tcPr>
+          <w:p>
+            <w:r/>
+            <w:r>
+              <w:t>2.62 M</w:t>
+            </w:r>
+          </w:p>
+        </w:tc>
+        <w:tc>
+          <w:tcPr>
+            <w:tcW w:type="dxa" w:w="1872"/>
+          </w:tcPr>
+          <w:p>
+            <w:r/>
+            <w:r>
+              <w:t>5.39 M</w:t>
+            </w:r>
+          </w:p>
+        </w:tc>
+      </w:tr>
+    </w:tbl>
+    <w:p>
+      <w:r>
+        <w:rPr>
+          <w:i/>
+          <w:sz w:val="18"/>
+        </w:rPr>
+        <w:t>Table 5: Ex-ante value-capture potential and combined annual revenue, by instrument and scenario. Value-capture figures apply the draft ordinance formulas (UT 2026 = ARS 235) to real parameters; converted at ARS 1,244.17/USD. Ex-ante point estimates are illustrative.</w:t>
       </w:r>
     </w:p>
     <w:p>
@@ -3954,7 +4771,7 @@
     </w:p>
     <w:p>
       <w:r>
-        <w:t>To place these flows in context, we monetise one illustrative adaptation deficit drawn from the priority index. Reaching the index’s green-space target of 10 m² per inhabitant from a current municipal average near 6 m²/hab implies a deficit of roughly 700,000 m² for a population of about 175,000; at an indicative USD 80 per square metre for green infrastructure, this represents a one-off capital need on the order of USD 56 million. The baseline combined annual revenue of about USD 3.1 million therefore covers some 5 to 6 percent of this single deficit per year on a pay-as-you-go basis. It is the Trust Fund’s leverage logic that closes the gap: with the Leverage Account accumulating dedicated reserves and a predictable, audited revenue stream that can be pledged as security, a green-bond issuance of three to four times annual revenue (roughly USD 9 to 12 million) becomes feasible, and the accumulated track record positions the municipality for larger multilateral facilities such as the Green Climate Fund. The decisive structural feature is that own-source revenues are linked to the adaptation investments they finance, creating a self-reinforcing cycle rather than a one-off transfer.</w:t>
+        <w:t>To place these flows in context, we monetise one illustrative adaptation deficit drawn from the priority index. Reaching the index’s green-space target of 10 m² per inhabitant from a current municipal average near 6 m²/hab implies a deficit of roughly 700,000 m² for a population of about 175,000; at an indicative USD 80 per square metre for green infrastructure, this represents a one-off capital need on the order of USD 56 million. The baseline combined annual revenue of about USD 2.6 million therefore covers some 4 to 5 percent of this single deficit per year on a pay-as-you-go basis. It is the Trust Fund’s leverage logic that closes the gap: with the Leverage Account accumulating dedicated reserves and a predictable, audited revenue stream that can be pledged as security, a green-bond issuance of three to four times annual revenue (roughly USD 8 to 10 million) becomes feasible, and the accumulated track record positions the municipality for larger multilateral facilities such as the Green Climate Fund. The decisive structural feature is that own-source revenues are linked to the adaptation investments they finance, creating a self-reinforcing cycle rather than a one-off transfer.</w:t>
       </w:r>
     </w:p>
     <w:p>

</xml_diff>

<commit_message>
Classify works by environmental impact, financing source, and densification zones
Refine the 2026 works pipeline analysis per request:

- Table 4 (municipal works) now classifies each project by environmental-
  adaptation impact; high/med-high works (drainage, green space, boulevard,
  canal-bridge+metrotranvia) = ~ARS 4.72B (~69% of the funded programme).
- Table 5 (new): works financed/executed by the Province (Rio Mendoza bridge,
  Acceso Sur pedestrian overpasses) listed separately and excluded from the
  municipal betterment base.
- Table 6 (new): priority densification zones (metrotranvia/San Martin transit
  corridor; Ciudad de Lujan and La Carrodilla-Mayor Drummond centralities) that
  ground the Suelo Creado / PVA instruments geographically.
- Summary renumbered to Table 7; references and README updated.
</commit_message>
<xml_diff>
--- a/paper/LVC_Climate_Adaptation_Paper_revised_estimations.docx
+++ b/paper/LVC_Climate_Adaptation_Paper_revised_estimations.docx
@@ -746,7 +746,7 @@
           <w:sz w:val="24"/>
           <w:szCs w:val="24"/>
         </w:rPr>
-        <w:t>The revenue figures presented in Section 7 rest on two distinct footings: realized collections from the municipality’s two operational land-based instruments (the water-and-sewer feasibility contribution and the vacant-land surcharge), drawn from municipal records and the 2026 tax roll; and ex-ante estimates for the designed value-capture instruments, obtained by applying the actual formulas of the draft Ordinance of Urban-Economy Instruments to real municipal parameters—the 2026 public-works programme and the municipal land-value and fiscal-assessment maps—rather than to assumed transaction data, since these instruments are not yet sanctioned. The Sustainable Urbanism Priority Index was developed through a participatory process involving technical experts, municipal planning staff, and community representatives, with indicator weights assigned through analytic hierarchy process (AHP) methods.</w:t>
+        <w:t>The revenue figures presented in Section 7 rest on two distinct footings: realized collections from the municipality’s two operational land-based instruments (the water-and-sewer feasibility contribution and the vacant-land surcharge), drawn from municipal records and the 2026 tax roll; and ex-ante estimates for the designed value-capture instruments, obtained by applying the actual formulas of the draft Ordinance of Urban-Economy Instruments to real municipal parameters—the itemised 2026 public-works programme (classified by financing source and environmental impact) and the municipal land-value and fiscal-assessment maps—rather than to assumed transaction data, since these instruments are not yet sanctioned. The Sustainable Urbanism Priority Index was developed through a participatory process involving technical experts, municipal planning staff, and community representatives, with indicator weights assigned through analytic hierarchy process (AHP) methods.</w:t>
       </w:r>
     </w:p>
     <w:p>
@@ -3499,7 +3499,12 @@
     </w:p>
     <w:p>
       <w:r>
-        <w:t>For the designed instruments we apply the ordinance formulas to real municipal parameters. The betterment levy is sized against the municipality’s actual 2026 public-works programme (Table 4), which budgets approximately ARS 6.85 billion (about USD 5.5 million) across ten funded road, public-space, and infrastructure projects; a further twelve projects carry no separate budget, being financed within the operating pavement budget or executed by the province, and are excluded from the base. Each funded project carries a planning-priority weight in the programme (80 percent for priority-1 works, 20 percent for priority-2). Applying these weights and excluding the network-level east–west canal bridge—the single largest item, whose benefit to land value is diffuse rather than localised—leaves a betterment-eligible, priority-weighted base of about ARS 3.49 billion (USD 2.81 million). Applying cost-recovery shares of 25 to 50 percent, within the ordinance’s legal ceilings (recovery may not exceed the value increment, and aggregate betterment charges may not exceed 50 percent of assessed value), yields a betterment potential of roughly ARS 0.87 to 1.75 billion per year (USD 0.70–1.40 million).</w:t>
+        <w:t>The betterment levy is sized against the municipality’s actual 2026 public-works programme (Table 4), which budgets approximately ARS 6.85 billion (about USD 5.5 million) across ten municipally-funded projects. We classify each work on two dimensions that matter for this framework: its planning-priority weight in the programme (80 percent for priority-1 works, 20 percent for priority-2), and its environmental–adaptation impact. The latter is central to a climate-adaptation case: works with high or medium-high environmental impact—the aluvional (stormwater) drainage embedded in the Ciudad de Luján centrality, the new green microplazas, the Tierra del Fuego green boulevard, and the canal-bridge that also carries the metrotranvía/San Martín connection—account for roughly ARS 4.7 billion, or about 69 percent of the funded programme. This both strengthens the case for earmarking betterment revenue to the Climate Adaptation Trust Fund and aligns the cost base with the priority-index criteria.</w:t>
+      </w:r>
+    </w:p>
+    <w:p>
+      <w:r>
+        <w:t>To size the levy itself, we apply the priority weights and exclude the network-level east–west canal bridge (the single largest item, whose benefit to land value is diffuse rather than localised), leaving a betterment-eligible, priority-weighted base of about ARS 3.49 billion (USD 2.81 million). Applying cost-recovery shares of 25 to 50 percent, within the ordinance’s legal ceilings (recovery may not exceed the value increment, and aggregate betterment charges may not exceed 50 percent of assessed value), yields a betterment potential of roughly ARS 0.87 to 1.75 billion per year (USD 0.70–1.40 million).</w:t>
       </w:r>
     </w:p>
     <w:tbl>
@@ -3553,7 +3558,7 @@
               <w:rPr>
                 <w:b/>
               </w:rPr>
-              <w:t>Programme</w:t>
+              <w:t>Budget (ARS)</w:t>
             </w:r>
           </w:p>
         </w:tc>
@@ -3567,7 +3572,7 @@
               <w:rPr>
                 <w:b/>
               </w:rPr>
-              <w:t>Budget (ARS)</w:t>
+              <w:t>Priority (EA)</w:t>
             </w:r>
           </w:p>
         </w:tc>
@@ -3581,7 +3586,7 @@
               <w:rPr>
                 <w:b/>
               </w:rPr>
-              <w:t>Priority (EA)</w:t>
+              <w:t>Env.–adaptation impact</w:t>
             </w:r>
           </w:p>
         </w:tc>
@@ -3605,18 +3610,7 @@
           <w:p>
             <w:r/>
             <w:r>
-              <w:t>Cacique Guaymallén canal bridge (E–W integration)</w:t>
-            </w:r>
-          </w:p>
-        </w:tc>
-        <w:tc>
-          <w:tcPr>
-            <w:tcW w:type="dxa" w:w="1872"/>
-          </w:tcPr>
-          <w:p>
-            <w:r/>
-            <w:r>
-              <w:t>Road works</w:t>
+              <w:t>Cacique Guaymallén canal bridge (metrotranvía / San Martín, E–W)</w:t>
             </w:r>
           </w:p>
         </w:tc>
@@ -3639,6 +3633,17 @@
             <w:r/>
             <w:r>
               <w:t>1 (80%)</w:t>
+            </w:r>
+          </w:p>
+        </w:tc>
+        <w:tc>
+          <w:tcPr>
+            <w:tcW w:type="dxa" w:w="1872"/>
+          </w:tcPr>
+          <w:p>
+            <w:r/>
+            <w:r>
+              <w:t>Med–high (drainage + transit)</w:t>
             </w:r>
           </w:p>
         </w:tc>
@@ -3662,18 +3667,7 @@
           <w:p>
             <w:r/>
             <w:r>
-              <w:t>Urban centrality — street/pedestrian/drainage upgrade</w:t>
-            </w:r>
-          </w:p>
-        </w:tc>
-        <w:tc>
-          <w:tcPr>
-            <w:tcW w:type="dxa" w:w="1872"/>
-          </w:tcPr>
-          <w:p>
-            <w:r/>
-            <w:r>
-              <w:t>Urban centrality</w:t>
+              <w:t>Centrality, Ciudad de Luján (incl. aluvional drainage)</w:t>
             </w:r>
           </w:p>
         </w:tc>
@@ -3696,6 +3690,17 @@
             <w:r/>
             <w:r>
               <w:t>1 (80%)</w:t>
+            </w:r>
+          </w:p>
+        </w:tc>
+        <w:tc>
+          <w:tcPr>
+            <w:tcW w:type="dxa" w:w="1872"/>
+          </w:tcPr>
+          <w:p>
+            <w:r/>
+            <w:r>
+              <w:t>High (flood drainage + mobility)</w:t>
             </w:r>
           </w:p>
         </w:tc>
@@ -3730,17 +3735,6 @@
           <w:p>
             <w:r/>
             <w:r>
-              <w:t>Urban centrality</w:t>
-            </w:r>
-          </w:p>
-        </w:tc>
-        <w:tc>
-          <w:tcPr>
-            <w:tcW w:type="dxa" w:w="1872"/>
-          </w:tcPr>
-          <w:p>
-            <w:r/>
-            <w:r>
               <w:t>1,500,000,000</w:t>
             </w:r>
           </w:p>
@@ -3753,6 +3747,17 @@
             <w:r/>
             <w:r>
               <w:t>1 (80%)</w:t>
+            </w:r>
+          </w:p>
+        </w:tc>
+        <w:tc>
+          <w:tcPr>
+            <w:tcW w:type="dxa" w:w="1872"/>
+          </w:tcPr>
+          <w:p>
+            <w:r/>
+            <w:r>
+              <w:t>Medium</w:t>
             </w:r>
           </w:p>
         </w:tc>
@@ -3776,18 +3781,7 @@
           <w:p>
             <w:r/>
             <w:r>
-              <w:t>Microplazas (20 planned; ~10 in 2026)</w:t>
-            </w:r>
-          </w:p>
-        </w:tc>
-        <w:tc>
-          <w:tcPr>
-            <w:tcW w:type="dxa" w:w="1872"/>
-          </w:tcPr>
-          <w:p>
-            <w:r/>
-            <w:r>
-              <w:t>Parks &amp; squares</w:t>
+              <w:t>Microplazas (≈10 of 20)</w:t>
             </w:r>
           </w:p>
         </w:tc>
@@ -3810,6 +3804,17 @@
             <w:r/>
             <w:r>
               <w:t>1 (80%)</w:t>
+            </w:r>
+          </w:p>
+        </w:tc>
+        <w:tc>
+          <w:tcPr>
+            <w:tcW w:type="dxa" w:w="1872"/>
+          </w:tcPr>
+          <w:p>
+            <w:r/>
+            <w:r>
+              <w:t>High (green space)</w:t>
             </w:r>
           </w:p>
         </w:tc>
@@ -3833,18 +3838,7 @@
           <w:p>
             <w:r/>
             <w:r>
-              <w:t>Speed reducers / safe prefabricated crossings</w:t>
-            </w:r>
-          </w:p>
-        </w:tc>
-        <w:tc>
-          <w:tcPr>
-            <w:tcW w:type="dxa" w:w="1872"/>
-          </w:tcPr>
-          <w:p>
-            <w:r/>
-            <w:r>
-              <w:t>Road works</w:t>
+              <w:t>Speed reducers / safe crossings</w:t>
             </w:r>
           </w:p>
         </w:tc>
@@ -3867,6 +3861,17 @@
             <w:r/>
             <w:r>
               <w:t>2 (20%)</w:t>
+            </w:r>
+          </w:p>
+        </w:tc>
+        <w:tc>
+          <w:tcPr>
+            <w:tcW w:type="dxa" w:w="1872"/>
+          </w:tcPr>
+          <w:p>
+            <w:r/>
+            <w:r>
+              <w:t>Low</w:t>
             </w:r>
           </w:p>
         </w:tc>
@@ -3901,17 +3906,6 @@
           <w:p>
             <w:r/>
             <w:r>
-              <w:t>Infrastructure</w:t>
-            </w:r>
-          </w:p>
-        </w:tc>
-        <w:tc>
-          <w:tcPr>
-            <w:tcW w:type="dxa" w:w="1872"/>
-          </w:tcPr>
-          <w:p>
-            <w:r/>
-            <w:r>
               <w:t>200,000,000</w:t>
             </w:r>
           </w:p>
@@ -3924,6 +3918,17 @@
             <w:r/>
             <w:r>
               <w:t>2 (20%)</w:t>
+            </w:r>
+          </w:p>
+        </w:tc>
+        <w:tc>
+          <w:tcPr>
+            <w:tcW w:type="dxa" w:w="1872"/>
+          </w:tcPr>
+          <w:p>
+            <w:r/>
+            <w:r>
+              <w:t>Low</w:t>
             </w:r>
           </w:p>
         </w:tc>
@@ -3958,17 +3963,6 @@
           <w:p>
             <w:r/>
             <w:r>
-              <w:t>Public space</w:t>
-            </w:r>
-          </w:p>
-        </w:tc>
-        <w:tc>
-          <w:tcPr>
-            <w:tcW w:type="dxa" w:w="1872"/>
-          </w:tcPr>
-          <w:p>
-            <w:r/>
-            <w:r>
               <w:t>33,750,000</w:t>
             </w:r>
           </w:p>
@@ -3981,6 +3975,17 @@
             <w:r/>
             <w:r>
               <w:t>2 (20%)</w:t>
+            </w:r>
+          </w:p>
+        </w:tc>
+        <w:tc>
+          <w:tcPr>
+            <w:tcW w:type="dxa" w:w="1872"/>
+          </w:tcPr>
+          <w:p>
+            <w:r/>
+            <w:r>
+              <w:t>Medium (transit)</w:t>
             </w:r>
           </w:p>
         </w:tc>
@@ -4015,17 +4020,6 @@
           <w:p>
             <w:r/>
             <w:r>
-              <w:t>Maintenance</w:t>
-            </w:r>
-          </w:p>
-        </w:tc>
-        <w:tc>
-          <w:tcPr>
-            <w:tcW w:type="dxa" w:w="1872"/>
-          </w:tcPr>
-          <w:p>
-            <w:r/>
-            <w:r>
               <w:t>30,562,500</w:t>
             </w:r>
           </w:p>
@@ -4038,6 +4032,17 @@
             <w:r/>
             <w:r>
               <w:t>2 (20%)</w:t>
+            </w:r>
+          </w:p>
+        </w:tc>
+        <w:tc>
+          <w:tcPr>
+            <w:tcW w:type="dxa" w:w="1872"/>
+          </w:tcPr>
+          <w:p>
+            <w:r/>
+            <w:r>
+              <w:t>Medium (walkability)</w:t>
             </w:r>
           </w:p>
         </w:tc>
@@ -4072,17 +4077,6 @@
           <w:p>
             <w:r/>
             <w:r>
-              <w:t>Maintenance</w:t>
-            </w:r>
-          </w:p>
-        </w:tc>
-        <w:tc>
-          <w:tcPr>
-            <w:tcW w:type="dxa" w:w="1872"/>
-          </w:tcPr>
-          <w:p>
-            <w:r/>
-            <w:r>
               <w:t>24,570,000</w:t>
             </w:r>
           </w:p>
@@ -4095,6 +4089,17 @@
             <w:r/>
             <w:r>
               <w:t>2 (20%)</w:t>
+            </w:r>
+          </w:p>
+        </w:tc>
+        <w:tc>
+          <w:tcPr>
+            <w:tcW w:type="dxa" w:w="1872"/>
+          </w:tcPr>
+          <w:p>
+            <w:r/>
+            <w:r>
+              <w:t>Med–high (green corridor)</w:t>
             </w:r>
           </w:p>
         </w:tc>
@@ -4129,17 +4134,6 @@
           <w:p>
             <w:r/>
             <w:r>
-              <w:t>Parks &amp; squares</w:t>
-            </w:r>
-          </w:p>
-        </w:tc>
-        <w:tc>
-          <w:tcPr>
-            <w:tcW w:type="dxa" w:w="1872"/>
-          </w:tcPr>
-          <w:p>
-            <w:r/>
-            <w:r>
               <w:t>15,000,000</w:t>
             </w:r>
           </w:p>
@@ -4152,6 +4146,17 @@
             <w:r/>
             <w:r>
               <w:t>2 (20%)</w:t>
+            </w:r>
+          </w:p>
+        </w:tc>
+        <w:tc>
+          <w:tcPr>
+            <w:tcW w:type="dxa" w:w="1872"/>
+          </w:tcPr>
+          <w:p>
+            <w:r/>
+            <w:r>
+              <w:t>Medium</w:t>
             </w:r>
           </w:p>
         </w:tc>
@@ -4183,18 +4188,18 @@
           </w:tcPr>
           <w:p>
             <w:r/>
-            <w:r/>
-          </w:p>
-        </w:tc>
-        <w:tc>
-          <w:tcPr>
-            <w:tcW w:type="dxa" w:w="1872"/>
-          </w:tcPr>
-          <w:p>
-            <w:r/>
             <w:r>
               <w:t>6,853,882,500</w:t>
             </w:r>
+          </w:p>
+        </w:tc>
+        <w:tc>
+          <w:tcPr>
+            <w:tcW w:type="dxa" w:w="1872"/>
+          </w:tcPr>
+          <w:p>
+            <w:r/>
+            <w:r/>
           </w:p>
         </w:tc>
         <w:tc>
@@ -4224,27 +4229,29 @@
           <w:p>
             <w:r/>
             <w:r>
-              <w:t>Priority-weighted (EA 80/20)</w:t>
-            </w:r>
-          </w:p>
-        </w:tc>
-        <w:tc>
-          <w:tcPr>
-            <w:tcW w:type="dxa" w:w="1872"/>
-          </w:tcPr>
-          <w:p>
-            <w:r/>
-            <w:r/>
-          </w:p>
-        </w:tc>
-        <w:tc>
-          <w:tcPr>
-            <w:tcW w:type="dxa" w:w="1872"/>
-          </w:tcPr>
-          <w:p>
-            <w:r/>
-            <w:r>
-              <w:t>5,090,776,500</w:t>
+              <w:t>Adaptation-relevant (high / med–high impact)</w:t>
+            </w:r>
+          </w:p>
+        </w:tc>
+        <w:tc>
+          <w:tcPr>
+            <w:tcW w:type="dxa" w:w="1872"/>
+          </w:tcPr>
+          <w:p>
+            <w:r/>
+            <w:r>
+              <w:t>4,724,570,000</w:t>
+            </w:r>
+          </w:p>
+        </w:tc>
+        <w:tc>
+          <w:tcPr>
+            <w:tcW w:type="dxa" w:w="1872"/>
+          </w:tcPr>
+          <w:p>
+            <w:r/>
+            <w:r>
+              <w:t>≈69%</w:t>
             </w:r>
           </w:p>
         </w:tc>
@@ -4275,17 +4282,8 @@
           <w:p>
             <w:r/>
             <w:r>
-              <w:t>Betterment-eligible, weighted (excl. ID 1274)</w:t>
-            </w:r>
-          </w:p>
-        </w:tc>
-        <w:tc>
-          <w:tcPr>
-            <w:tcW w:type="dxa" w:w="1872"/>
-          </w:tcPr>
-          <w:p>
-            <w:r/>
-            <w:r/>
+              <w:t>Betterment-eligible, priority-weighted (excl. ID 1274)</w:t>
+            </w:r>
           </w:p>
         </w:tc>
         <w:tc>
@@ -4297,6 +4295,15 @@
             <w:r>
               <w:t>3,490,776,500</w:t>
             </w:r>
+          </w:p>
+        </w:tc>
+        <w:tc>
+          <w:tcPr>
+            <w:tcW w:type="dxa" w:w="1872"/>
+          </w:tcPr>
+          <w:p>
+            <w:r/>
+            <w:r/>
           </w:p>
         </w:tc>
         <w:tc>
@@ -4316,17 +4323,461 @@
           <w:i/>
           <w:sz w:val="18"/>
         </w:rPr>
-        <w:t>Table 4: 2026 municipal public-works programme — the betterment-levy cost base. Source: Plan de Obras, “Obras y Espacios Públicos — Proyectos a ejecutar 2026.” Twelve further projects carry no separate 2026 budget (operating pavement budget or provincial execution) and are excluded.</w:t>
-      </w:r>
-    </w:p>
-    <w:p>
-      <w:r>
-        <w:t>Development-rights sales and differential rent capture are calibrated against the municipal land-value map, which records undeveloped land prices ranging from under USD 10 per square metre in the rural piedmont to more than USD 150 per square metre in consolidated urban zones. Pricing additional buildable area at 20 to 40 percent of zone land value (≈50–300 UT/m²) and assuming an annual pipeline of 2,000 to 20,000 m² of development rights yields a development-rights potential of ARS 24 to 1,410 million per year (USD 0.02–1.13 million). Applying analogous unit values to 5,000 to 50,000 m² of annual additional buildable demand created by rezoning gives a differential-rent potential of ARS 35 to 2,350 million per year (USD 0.03–1.89 million). The remaining two instruments are not separately quantified: transferable development rights depend on an as-yet-untraded market, and tax incentives operate as a net fiscal cost in the early years before becoming revenue-neutral.</w:t>
-      </w:r>
-    </w:p>
-    <w:p>
-      <w:r>
-        <w:t>Aggregating the three quantifiable value-capture instruments gives an ex-ante potential of approximately USD 0.7 million (Low), USD 1.7 million (Base), and USD 4.4 million (High) per year (Table 5). Combined with the roughly USD 0.97 million of realized operational revenue, the framework’s total annual revenue potential is on the order of USD 1.7 million (Low) to USD 5.4 million (High), with a baseline near USD 2.6 million. At the baseline, the betterment levy—anchored in the real, budgeted works programme—is the single largest prospective contributor, ahead of the already-operational water-and-sewer charge; the differential-rent instrument becomes the largest only in the optimistic scenario. This ordering is grounded in observed municipal data rather than assumed shares.</w:t>
+        <w:t>Table 4: Municipally-funded 2026 public-works programme — the betterment-levy cost base, classified by planning priority (EA) and environmental–adaptation impact. A further seven projects (bike-lane network and repaving) are financed within the operating pavement budget and carry no separate line. Source: Plan de Obras, “Obras y Espacios Públicos — Proyectos a ejecutar 2026.”</w:t>
+      </w:r>
+    </w:p>
+    <w:p>
+      <w:r>
+        <w:t>A separate set of works is financed or executed by the Province of Mendoza rather than the municipality—principally a new Río Mendoza road bridge and two pedestrian overpasses on the Acceso Sur (Table 5). These carry no municipal budget line and are excluded from the betterment base, since the municipality cannot levy betterment on works it does not finance. They are reported separately for completeness and because they shape the corridor’s accessibility and, with it, the land-value gradient that the value-capture instruments ultimately tax.</w:t>
+      </w:r>
+    </w:p>
+    <w:tbl>
+      <w:tblPr>
+        <w:tblW w:type="auto" w:w="0"/>
+        <w:tblLook w:firstColumn="1" w:firstRow="1" w:lastColumn="0" w:lastRow="0" w:noHBand="0" w:noVBand="1" w:val="04A0"/>
+      </w:tblPr>
+      <w:tblGrid>
+        <w:gridCol w:w="2340"/>
+        <w:gridCol w:w="2340"/>
+        <w:gridCol w:w="2340"/>
+        <w:gridCol w:w="2340"/>
+      </w:tblGrid>
+      <w:tr>
+        <w:tc>
+          <w:tcPr>
+            <w:tcW w:type="dxa" w:w="2340"/>
+          </w:tcPr>
+          <w:p>
+            <w:r/>
+            <w:r>
+              <w:rPr>
+                <w:b/>
+              </w:rPr>
+              <w:t>ID</w:t>
+            </w:r>
+          </w:p>
+        </w:tc>
+        <w:tc>
+          <w:tcPr>
+            <w:tcW w:type="dxa" w:w="2340"/>
+          </w:tcPr>
+          <w:p>
+            <w:r/>
+            <w:r>
+              <w:rPr>
+                <w:b/>
+              </w:rPr>
+              <w:t>Project</w:t>
+            </w:r>
+          </w:p>
+        </w:tc>
+        <w:tc>
+          <w:tcPr>
+            <w:tcW w:type="dxa" w:w="2340"/>
+          </w:tcPr>
+          <w:p>
+            <w:r/>
+            <w:r>
+              <w:rPr>
+                <w:b/>
+              </w:rPr>
+              <w:t>Executing body</w:t>
+            </w:r>
+          </w:p>
+        </w:tc>
+        <w:tc>
+          <w:tcPr>
+            <w:tcW w:type="dxa" w:w="2340"/>
+          </w:tcPr>
+          <w:p>
+            <w:r/>
+            <w:r>
+              <w:rPr>
+                <w:b/>
+              </w:rPr>
+              <w:t>Env.–adaptation impact</w:t>
+            </w:r>
+          </w:p>
+        </w:tc>
+      </w:tr>
+      <w:tr>
+        <w:tc>
+          <w:tcPr>
+            <w:tcW w:type="dxa" w:w="2340"/>
+          </w:tcPr>
+          <w:p>
+            <w:r/>
+            <w:r>
+              <w:t>466</w:t>
+            </w:r>
+          </w:p>
+        </w:tc>
+        <w:tc>
+          <w:tcPr>
+            <w:tcW w:type="dxa" w:w="2340"/>
+          </w:tcPr>
+          <w:p>
+            <w:r/>
+            <w:r>
+              <w:t>Nuevo Puente Río Mendoza + Ciclovía San Martín</w:t>
+            </w:r>
+          </w:p>
+        </w:tc>
+        <w:tc>
+          <w:tcPr>
+            <w:tcW w:type="dxa" w:w="2340"/>
+          </w:tcPr>
+          <w:p>
+            <w:r/>
+            <w:r>
+              <w:t>Province (DPV)</w:t>
+            </w:r>
+          </w:p>
+        </w:tc>
+        <w:tc>
+          <w:tcPr>
+            <w:tcW w:type="dxa" w:w="2340"/>
+          </w:tcPr>
+          <w:p>
+            <w:r/>
+            <w:r>
+              <w:t>Medium (connectivity + bike lane)</w:t>
+            </w:r>
+          </w:p>
+        </w:tc>
+      </w:tr>
+      <w:tr>
+        <w:tc>
+          <w:tcPr>
+            <w:tcW w:type="dxa" w:w="2340"/>
+          </w:tcPr>
+          <w:p>
+            <w:r/>
+            <w:r>
+              <w:t>467</w:t>
+            </w:r>
+          </w:p>
+        </w:tc>
+        <w:tc>
+          <w:tcPr>
+            <w:tcW w:type="dxa" w:w="2340"/>
+          </w:tcPr>
+          <w:p>
+            <w:r/>
+            <w:r>
+              <w:t>Pedestrian overpass — Acceso Sur &amp; Malabia</w:t>
+            </w:r>
+          </w:p>
+        </w:tc>
+        <w:tc>
+          <w:tcPr>
+            <w:tcW w:type="dxa" w:w="2340"/>
+          </w:tcPr>
+          <w:p>
+            <w:r/>
+            <w:r>
+              <w:t>Province</w:t>
+            </w:r>
+          </w:p>
+        </w:tc>
+        <w:tc>
+          <w:tcPr>
+            <w:tcW w:type="dxa" w:w="2340"/>
+          </w:tcPr>
+          <w:p>
+            <w:r/>
+            <w:r>
+              <w:t>Low–medium (safe crossing)</w:t>
+            </w:r>
+          </w:p>
+        </w:tc>
+      </w:tr>
+      <w:tr>
+        <w:tc>
+          <w:tcPr>
+            <w:tcW w:type="dxa" w:w="2340"/>
+          </w:tcPr>
+          <w:p>
+            <w:r/>
+            <w:r>
+              <w:t>468</w:t>
+            </w:r>
+          </w:p>
+        </w:tc>
+        <w:tc>
+          <w:tcPr>
+            <w:tcW w:type="dxa" w:w="2340"/>
+          </w:tcPr>
+          <w:p>
+            <w:r/>
+            <w:r>
+              <w:t>Pedestrian overpass — Acceso Sur &amp; Castro Barros</w:t>
+            </w:r>
+          </w:p>
+        </w:tc>
+        <w:tc>
+          <w:tcPr>
+            <w:tcW w:type="dxa" w:w="2340"/>
+          </w:tcPr>
+          <w:p>
+            <w:r/>
+            <w:r>
+              <w:t>Province</w:t>
+            </w:r>
+          </w:p>
+        </w:tc>
+        <w:tc>
+          <w:tcPr>
+            <w:tcW w:type="dxa" w:w="2340"/>
+          </w:tcPr>
+          <w:p>
+            <w:r/>
+            <w:r>
+              <w:t>Low–medium (safe crossing)</w:t>
+            </w:r>
+          </w:p>
+        </w:tc>
+      </w:tr>
+    </w:tbl>
+    <w:p>
+      <w:r>
+        <w:rPr>
+          <w:i/>
+          <w:sz w:val="18"/>
+        </w:rPr>
+        <w:t>Table 5: Works financed or executed by the Province of Mendoza — listed separately and excluded from the municipal betterment-levy base.</w:t>
+      </w:r>
+    </w:p>
+    <w:p>
+      <w:r>
+        <w:t>The value-capture instruments—development-rights sales and differential rent capture—are spatially targeted to the areas the municipality intends to densify (Table 6). Two stand out. The first is the transit corridor along the metrotranvía / Liniers–San Martín axis, whose east–west integration is the programme’s single largest work; transit-oriented densification here simultaneously raises land value (the base these instruments tax) and supports low-carbon mobility. The second is the network of urban centralities—Ciudad de Luján and the La Carrodilla–Mayor Drummond axis—which coincide with the +200 percent vacant-land priority infill zones, producing one coherent spatial signal: the same places where idle land is most heavily penalised are where additional building rights are sold and rezoning value is captured. The development-rights and rezoning pipeline assumed below is therefore concentrated in these zones.</w:t>
+      </w:r>
+    </w:p>
+    <w:tbl>
+      <w:tblPr>
+        <w:tblW w:type="auto" w:w="0"/>
+        <w:tblLook w:firstColumn="1" w:firstRow="1" w:lastColumn="0" w:lastRow="0" w:noHBand="0" w:noVBand="1" w:val="04A0"/>
+      </w:tblPr>
+      <w:tblGrid>
+        <w:gridCol w:w="2340"/>
+        <w:gridCol w:w="2340"/>
+        <w:gridCol w:w="2340"/>
+        <w:gridCol w:w="2340"/>
+      </w:tblGrid>
+      <w:tr>
+        <w:tc>
+          <w:tcPr>
+            <w:tcW w:type="dxa" w:w="2340"/>
+          </w:tcPr>
+          <w:p>
+            <w:r/>
+            <w:r>
+              <w:rPr>
+                <w:b/>
+              </w:rPr>
+              <w:t>Densification zone</w:t>
+            </w:r>
+          </w:p>
+        </w:tc>
+        <w:tc>
+          <w:tcPr>
+            <w:tcW w:type="dxa" w:w="2340"/>
+          </w:tcPr>
+          <w:p>
+            <w:r/>
+            <w:r>
+              <w:rPr>
+                <w:b/>
+              </w:rPr>
+              <w:t>Type</w:t>
+            </w:r>
+          </w:p>
+        </w:tc>
+        <w:tc>
+          <w:tcPr>
+            <w:tcW w:type="dxa" w:w="2340"/>
+          </w:tcPr>
+          <w:p>
+            <w:r/>
+            <w:r>
+              <w:rPr>
+                <w:b/>
+              </w:rPr>
+              <w:t>Value-capture instruments</w:t>
+            </w:r>
+          </w:p>
+        </w:tc>
+        <w:tc>
+          <w:tcPr>
+            <w:tcW w:type="dxa" w:w="2340"/>
+          </w:tcPr>
+          <w:p>
+            <w:r/>
+            <w:r>
+              <w:rPr>
+                <w:b/>
+              </w:rPr>
+              <w:t>Adaptation / spatial link</w:t>
+            </w:r>
+          </w:p>
+        </w:tc>
+      </w:tr>
+      <w:tr>
+        <w:tc>
+          <w:tcPr>
+            <w:tcW w:type="dxa" w:w="2340"/>
+          </w:tcPr>
+          <w:p>
+            <w:r/>
+            <w:r>
+              <w:t>Metrotranvía / Liniers–San Martín corridor</w:t>
+            </w:r>
+          </w:p>
+        </w:tc>
+        <w:tc>
+          <w:tcPr>
+            <w:tcW w:type="dxa" w:w="2340"/>
+          </w:tcPr>
+          <w:p>
+            <w:r/>
+            <w:r>
+              <w:t>Transit corridor</w:t>
+            </w:r>
+          </w:p>
+        </w:tc>
+        <w:tc>
+          <w:tcPr>
+            <w:tcW w:type="dxa" w:w="2340"/>
+          </w:tcPr>
+          <w:p>
+            <w:r/>
+            <w:r>
+              <w:t>Suelo Creado, PVA</w:t>
+            </w:r>
+          </w:p>
+        </w:tc>
+        <w:tc>
+          <w:tcPr>
+            <w:tcW w:type="dxa" w:w="2340"/>
+          </w:tcPr>
+          <w:p>
+            <w:r/>
+            <w:r>
+              <w:t>TOD; low-carbon mobility; E–W integration (ID 1274)</w:t>
+            </w:r>
+          </w:p>
+        </w:tc>
+      </w:tr>
+      <w:tr>
+        <w:tc>
+          <w:tcPr>
+            <w:tcW w:type="dxa" w:w="2340"/>
+          </w:tcPr>
+          <w:p>
+            <w:r/>
+            <w:r>
+              <w:t>Ciudad de Luján centrality</w:t>
+            </w:r>
+          </w:p>
+        </w:tc>
+        <w:tc>
+          <w:tcPr>
+            <w:tcW w:type="dxa" w:w="2340"/>
+          </w:tcPr>
+          <w:p>
+            <w:r/>
+            <w:r>
+              <w:t>Urban centrality</w:t>
+            </w:r>
+          </w:p>
+        </w:tc>
+        <w:tc>
+          <w:tcPr>
+            <w:tcW w:type="dxa" w:w="2340"/>
+          </w:tcPr>
+          <w:p>
+            <w:r/>
+            <w:r>
+              <w:t>Suelo Creado, PVA; vacant-land +200%</w:t>
+            </w:r>
+          </w:p>
+        </w:tc>
+        <w:tc>
+          <w:tcPr>
+            <w:tcW w:type="dxa" w:w="2340"/>
+          </w:tcPr>
+          <w:p>
+            <w:r/>
+            <w:r>
+              <w:t>Compact infill; aluvional drainage upgrade (ID 395)</w:t>
+            </w:r>
+          </w:p>
+        </w:tc>
+      </w:tr>
+      <w:tr>
+        <w:tc>
+          <w:tcPr>
+            <w:tcW w:type="dxa" w:w="2340"/>
+          </w:tcPr>
+          <w:p>
+            <w:r/>
+            <w:r>
+              <w:t>La Carrodilla–Mayor Drummond</w:t>
+            </w:r>
+          </w:p>
+        </w:tc>
+        <w:tc>
+          <w:tcPr>
+            <w:tcW w:type="dxa" w:w="2340"/>
+          </w:tcPr>
+          <w:p>
+            <w:r/>
+            <w:r>
+              <w:t>Centrality / priority infill</w:t>
+            </w:r>
+          </w:p>
+        </w:tc>
+        <w:tc>
+          <w:tcPr>
+            <w:tcW w:type="dxa" w:w="2340"/>
+          </w:tcPr>
+          <w:p>
+            <w:r/>
+            <w:r>
+              <w:t>Suelo Creado, PVA; vacant-land +200%</w:t>
+            </w:r>
+          </w:p>
+        </w:tc>
+        <w:tc>
+          <w:tcPr>
+            <w:tcW w:type="dxa" w:w="2340"/>
+          </w:tcPr>
+          <w:p>
+            <w:r/>
+            <w:r>
+              <w:t>Centrality (ID 773); designated urban voids</w:t>
+            </w:r>
+          </w:p>
+        </w:tc>
+      </w:tr>
+    </w:tbl>
+    <w:p>
+      <w:r>
+        <w:rPr>
+          <w:i/>
+          <w:sz w:val="18"/>
+        </w:rPr>
+        <w:t>Table 6: Priority densification zones where the development-rights and differential-rent instruments apply, with their transit and adaptation rationale.</w:t>
+      </w:r>
+    </w:p>
+    <w:p>
+      <w:r>
+        <w:t>Within these zones, development-rights sales and differential rent capture are calibrated against the municipal land-value map, which records undeveloped land prices ranging from under USD 10 per square metre in the rural piedmont to more than USD 150 per square metre in consolidated urban zones. Pricing additional buildable area at 20 to 40 percent of zone land value (≈50–300 UT/m²) and assuming an annual pipeline of 2,000 to 20,000 m² of development rights yields a development-rights potential of ARS 24 to 1,410 million per year (USD 0.02–1.13 million). Applying analogous unit values to 5,000 to 50,000 m² of annual additional buildable demand created by rezoning gives a differential-rent potential of ARS 35 to 2,350 million per year (USD 0.03–1.89 million). The remaining two instruments are not separately quantified: transferable development rights depend on an as-yet-untraded market, and tax incentives operate as a net fiscal cost in the early years before becoming revenue-neutral.</w:t>
+      </w:r>
+    </w:p>
+    <w:p>
+      <w:r>
+        <w:t>Aggregating the three quantifiable value-capture instruments gives an ex-ante potential of approximately USD 0.7 million (Low), USD 1.7 million (Base), and USD 4.4 million (High) per year (Table 7). Combined with the roughly USD 0.97 million of realized operational revenue, the framework’s total annual revenue potential is on the order of USD 1.7 million (Low) to USD 5.4 million (High), with a baseline near USD 2.6 million. At the baseline, the betterment levy—anchored in the real, budgeted works programme—is the single largest prospective contributor, ahead of the already-operational water-and-sewer charge; the differential-rent instrument becomes the largest only in the optimistic scenario. This ordering is grounded in observed municipal data rather than assumed shares.</w:t>
       </w:r>
     </w:p>
     <w:tbl>
@@ -4489,7 +4940,7 @@
           <w:p>
             <w:r/>
             <w:r>
-              <w:t>Land-value map; 5–50k m² × 30–200 UT/m²</w:t>
+              <w:t>Land-value map; densification zones; 5–50k m² × 30–200 UT/m²</w:t>
             </w:r>
           </w:p>
         </w:tc>
@@ -4546,7 +4997,7 @@
           <w:p>
             <w:r/>
             <w:r>
-              <w:t>Land-value map; 2–20k m² × 50–300 UT/m²</w:t>
+              <w:t>Land-value map; densification zones; 2–20k m² × 50–300 UT/m²</w:t>
             </w:r>
           </w:p>
         </w:tc>
@@ -4758,7 +5209,7 @@
           <w:i/>
           <w:sz w:val="18"/>
         </w:rPr>
-        <w:t>Table 5: Ex-ante value-capture potential and combined annual revenue, by instrument and scenario. Value-capture figures apply the draft ordinance formulas (UT 2026 = ARS 235) to real parameters; converted at ARS 1,244.17/USD. Ex-ante point estimates are illustrative.</w:t>
+        <w:t>Table 7: Ex-ante value-capture potential and combined annual revenue, by instrument and scenario. Value-capture figures apply the draft ordinance formulas (UT 2026 = ARS 235) to real parameters; converted at ARS 1,244.17/USD. Ex-ante point estimates are illustrative.</w:t>
       </w:r>
     </w:p>
     <w:p>

</xml_diff>

<commit_message>
Add §7.5: alignment of 2026 investments with the priority index
Cross-check where investment is needed (Indice de Ciudad Deseada district
results) against where the 2026 works are located:

- Table 8: green-space subindex by district (A-E sufficiency, Oct 2025);
  highest priority = Vistalba, Las Compuertas, Industrial (E) and Chacras de
  Coria, Agrelo, Mayor Drummond, Vertientes del Pedemonte (D).
- Table 9: 2026 works mapped to district green-space priority. Finding: the
  two largest centrality investments (Ciudad, Carrodilla) sit in already
  well-served A/B districts; the worst districts get no dedicated green works;
  the dept-wide microplazas (ARS 1.2B) are the decisive lever to realign.
- Narrative on the capture-vs-need logic and the Trust Fund's role in
  redirecting captured value to highest-need districts via the index.
- Only the green-space subindex is computed to date; reading flagged as partial.
- README updated.
</commit_message>
<xml_diff>
--- a/paper/LVC_Climate_Adaptation_Paper_revised_estimations.docx
+++ b/paper/LVC_Climate_Adaptation_Paper_revised_estimations.docx
@@ -5223,6 +5223,674 @@
     <w:p>
       <w:r>
         <w:t>To place these flows in context, we monetise one illustrative adaptation deficit drawn from the priority index. Reaching the index’s green-space target of 10 m² per inhabitant from a current municipal average near 6 m²/hab implies a deficit of roughly 700,000 m² for a population of about 175,000; at an indicative USD 80 per square metre for green infrastructure, this represents a one-off capital need on the order of USD 56 million. The baseline combined annual revenue of about USD 2.6 million therefore covers some 4 to 5 percent of this single deficit per year on a pay-as-you-go basis. It is the Trust Fund’s leverage logic that closes the gap: with the Leverage Account accumulating dedicated reserves and a predictable, audited revenue stream that can be pledged as security, a green-bond issuance of three to four times annual revenue (roughly USD 8 to 10 million) becomes feasible, and the accumulated track record positions the municipality for larger multilateral facilities such as the Green Climate Fund. The decisive structural feature is that own-source revenues are linked to the adaptation investments they finance, creating a self-reinforcing cycle rather than a one-off transfer.</w:t>
+      </w:r>
+    </w:p>
+    <w:p>
+      <w:pPr>
+        <w:pStyle w:val="Heading2"/>
+      </w:pPr>
+      <w:r>
+        <w:t>7.5 Aligning Investment with the Priority Index</w:t>
+      </w:r>
+    </w:p>
+    <w:p>
+      <w:r>
+        <w:t>A revenue framework is only as good as the rule that allocates the proceeds. The priority index is explicitly designed to direct investment to “the zones that most require it,” scoring each district against desired values on a five-level sufficiency scale—A (≥90%, outstanding), B (70–89%), C (50–69%), D (25–49%, insufficient), and E (&lt;25%, very insufficient)—where a lower score signals a higher investment priority. A first subindex, Espacios Verdes y Biodiversidad (green space and biodiversity), was computed at district level as of October 2025, which lets us begin to test whether the 2026 works are going where the index says they are most needed. The remaining subindices—mobility and services, compactness and functionality, proximity to community services, equity and community, and basic/water infrastructure—are still being assembled, so the reading here is partial and should be revisited once the full index is computed.</w:t>
+      </w:r>
+    </w:p>
+    <w:p>
+      <w:r>
+        <w:t>On green space, the districts furthest from the standard—those the index would prioritise—are Vistalba, Las Compuertas, and the Industrial district (level E), followed by Chacras de Coria, Agrelo, Mayor Drummond, and Vertientes del Pedemonte (level D). The consolidated centres of Ciudad and La Puntilla already score A, and Carrodilla and Potrerillos score B (Table 8). The need is therefore concentrated in the urban-edge and lower-income districts, not in the historic centre.</w:t>
+      </w:r>
+    </w:p>
+    <w:tbl>
+      <w:tblPr>
+        <w:tblW w:type="auto" w:w="0"/>
+        <w:tblLook w:firstColumn="1" w:firstRow="1" w:lastColumn="0" w:lastRow="0" w:noHBand="0" w:noVBand="1" w:val="04A0"/>
+      </w:tblPr>
+      <w:tblGrid>
+        <w:gridCol w:w="3120"/>
+        <w:gridCol w:w="3120"/>
+        <w:gridCol w:w="3120"/>
+      </w:tblGrid>
+      <w:tr>
+        <w:tc>
+          <w:tcPr>
+            <w:tcW w:type="dxa" w:w="3120"/>
+          </w:tcPr>
+          <w:p>
+            <w:r/>
+            <w:r>
+              <w:rPr>
+                <w:b/>
+              </w:rPr>
+              <w:t>Green-space sufficiency</w:t>
+            </w:r>
+          </w:p>
+        </w:tc>
+        <w:tc>
+          <w:tcPr>
+            <w:tcW w:type="dxa" w:w="3120"/>
+          </w:tcPr>
+          <w:p>
+            <w:r/>
+            <w:r>
+              <w:rPr>
+                <w:b/>
+              </w:rPr>
+              <w:t>Districts</w:t>
+            </w:r>
+          </w:p>
+        </w:tc>
+        <w:tc>
+          <w:tcPr>
+            <w:tcW w:type="dxa" w:w="3120"/>
+          </w:tcPr>
+          <w:p>
+            <w:r/>
+            <w:r>
+              <w:rPr>
+                <w:b/>
+              </w:rPr>
+              <w:t>Investment priority</w:t>
+            </w:r>
+          </w:p>
+        </w:tc>
+      </w:tr>
+      <w:tr>
+        <w:tc>
+          <w:tcPr>
+            <w:tcW w:type="dxa" w:w="3120"/>
+          </w:tcPr>
+          <w:p>
+            <w:r/>
+            <w:r>
+              <w:t>A — Outstanding (≥90%)</w:t>
+            </w:r>
+          </w:p>
+        </w:tc>
+        <w:tc>
+          <w:tcPr>
+            <w:tcW w:type="dxa" w:w="3120"/>
+          </w:tcPr>
+          <w:p>
+            <w:r/>
+            <w:r>
+              <w:t>La Puntilla, Ciudad</w:t>
+            </w:r>
+          </w:p>
+        </w:tc>
+        <w:tc>
+          <w:tcPr>
+            <w:tcW w:type="dxa" w:w="3120"/>
+          </w:tcPr>
+          <w:p>
+            <w:r/>
+            <w:r>
+              <w:t>Low</w:t>
+            </w:r>
+          </w:p>
+        </w:tc>
+      </w:tr>
+      <w:tr>
+        <w:tc>
+          <w:tcPr>
+            <w:tcW w:type="dxa" w:w="3120"/>
+          </w:tcPr>
+          <w:p>
+            <w:r/>
+            <w:r>
+              <w:t>B — Very sufficient (70–89%)</w:t>
+            </w:r>
+          </w:p>
+        </w:tc>
+        <w:tc>
+          <w:tcPr>
+            <w:tcW w:type="dxa" w:w="3120"/>
+          </w:tcPr>
+          <w:p>
+            <w:r/>
+            <w:r>
+              <w:t>Potrerillos, Carrodilla</w:t>
+            </w:r>
+          </w:p>
+        </w:tc>
+        <w:tc>
+          <w:tcPr>
+            <w:tcW w:type="dxa" w:w="3120"/>
+          </w:tcPr>
+          <w:p>
+            <w:r/>
+            <w:r>
+              <w:t>Low</w:t>
+            </w:r>
+          </w:p>
+        </w:tc>
+      </w:tr>
+      <w:tr>
+        <w:tc>
+          <w:tcPr>
+            <w:tcW w:type="dxa" w:w="3120"/>
+          </w:tcPr>
+          <w:p>
+            <w:r/>
+            <w:r>
+              <w:t>C — Sufficient (50–69%)</w:t>
+            </w:r>
+          </w:p>
+        </w:tc>
+        <w:tc>
+          <w:tcPr>
+            <w:tcW w:type="dxa" w:w="3120"/>
+          </w:tcPr>
+          <w:p>
+            <w:r/>
+            <w:r>
+              <w:t>Perdriel, Cacheuta, El Carrizal, Ugarteche</w:t>
+            </w:r>
+          </w:p>
+        </w:tc>
+        <w:tc>
+          <w:tcPr>
+            <w:tcW w:type="dxa" w:w="3120"/>
+          </w:tcPr>
+          <w:p>
+            <w:r/>
+            <w:r>
+              <w:t>Medium</w:t>
+            </w:r>
+          </w:p>
+        </w:tc>
+      </w:tr>
+      <w:tr>
+        <w:tc>
+          <w:tcPr>
+            <w:tcW w:type="dxa" w:w="3120"/>
+          </w:tcPr>
+          <w:p>
+            <w:r/>
+            <w:r>
+              <w:t>D — Insufficient (25–49%)</w:t>
+            </w:r>
+          </w:p>
+        </w:tc>
+        <w:tc>
+          <w:tcPr>
+            <w:tcW w:type="dxa" w:w="3120"/>
+          </w:tcPr>
+          <w:p>
+            <w:r/>
+            <w:r>
+              <w:t>Chacras de Coria, Agrelo, Mayor Drummond, Vertientes del Pedemonte</w:t>
+            </w:r>
+          </w:p>
+        </w:tc>
+        <w:tc>
+          <w:tcPr>
+            <w:tcW w:type="dxa" w:w="3120"/>
+          </w:tcPr>
+          <w:p>
+            <w:r/>
+            <w:r>
+              <w:t>High</w:t>
+            </w:r>
+          </w:p>
+        </w:tc>
+      </w:tr>
+      <w:tr>
+        <w:tc>
+          <w:tcPr>
+            <w:tcW w:type="dxa" w:w="3120"/>
+          </w:tcPr>
+          <w:p>
+            <w:r/>
+            <w:r>
+              <w:t>E — Very insufficient (&lt;25%)</w:t>
+            </w:r>
+          </w:p>
+        </w:tc>
+        <w:tc>
+          <w:tcPr>
+            <w:tcW w:type="dxa" w:w="3120"/>
+          </w:tcPr>
+          <w:p>
+            <w:r/>
+            <w:r>
+              <w:t>Vistalba, Las Compuertas, Industrial</w:t>
+            </w:r>
+          </w:p>
+        </w:tc>
+        <w:tc>
+          <w:tcPr>
+            <w:tcW w:type="dxa" w:w="3120"/>
+          </w:tcPr>
+          <w:p>
+            <w:r/>
+            <w:r>
+              <w:t>Highest</w:t>
+            </w:r>
+          </w:p>
+        </w:tc>
+      </w:tr>
+    </w:tbl>
+    <w:p>
+      <w:r>
+        <w:rPr>
+          <w:i/>
+          <w:sz w:val="18"/>
+        </w:rPr>
+        <w:t>Table 8: Green-space and biodiversity subindex by district (priority index, October 2025). Lower sufficiency = higher investment priority. Source: Laboratorio de Políticas Públicas, Municipalidad de Luján de Cuyo.</w:t>
+      </w:r>
+    </w:p>
+    <w:p>
+      <w:r>
+        <w:t>Mapping the 2026 works onto these districts reveals a partial misalignment (Table 9). The two largest place-based investments—the Ciudad de Luján centrality (ID 395, ARS 1.5 billion) and the La Carrodilla centrality (ID 773, ARS 1.5 billion)—fall in districts that already score A and B on green space; their justification is compactness, stormwater drainage, and value capture rather than green-space equity. Mayor Drummond, a level-D district, does receive a sidewalk upgrade (ID 452) and is a value-capture/densification target, which aligns. But the highest-priority green-space districts—Vistalba, Las Compuertas, and Industrial—receive no dedicated 2026 green investment. The decisive instrument is the microplazas programme (ID 865, ARS 1.2 billion, roughly twenty squares): as the single largest green item and a department-wide line, its allocation determines alignment. Directing those squares to the level-D and level-E districts would turn a latent misalignment into a close fit between the index and the investment.</w:t>
+      </w:r>
+    </w:p>
+    <w:tbl>
+      <w:tblPr>
+        <w:tblW w:type="auto" w:w="0"/>
+        <w:tblLook w:firstColumn="1" w:firstRow="1" w:lastColumn="0" w:lastRow="0" w:noHBand="0" w:noVBand="1" w:val="04A0"/>
+      </w:tblPr>
+      <w:tblGrid>
+        <w:gridCol w:w="2340"/>
+        <w:gridCol w:w="2340"/>
+        <w:gridCol w:w="2340"/>
+        <w:gridCol w:w="2340"/>
+      </w:tblGrid>
+      <w:tr>
+        <w:tc>
+          <w:tcPr>
+            <w:tcW w:type="dxa" w:w="2340"/>
+          </w:tcPr>
+          <w:p>
+            <w:r/>
+            <w:r>
+              <w:rPr>
+                <w:b/>
+              </w:rPr>
+              <w:t>2026 work (ID)</w:t>
+            </w:r>
+          </w:p>
+        </w:tc>
+        <w:tc>
+          <w:tcPr>
+            <w:tcW w:type="dxa" w:w="2340"/>
+          </w:tcPr>
+          <w:p>
+            <w:r/>
+            <w:r>
+              <w:rPr>
+                <w:b/>
+              </w:rPr>
+              <w:t>District(s)</w:t>
+            </w:r>
+          </w:p>
+        </w:tc>
+        <w:tc>
+          <w:tcPr>
+            <w:tcW w:type="dxa" w:w="2340"/>
+          </w:tcPr>
+          <w:p>
+            <w:r/>
+            <w:r>
+              <w:rPr>
+                <w:b/>
+              </w:rPr>
+              <w:t>Green-space level</w:t>
+            </w:r>
+          </w:p>
+        </w:tc>
+        <w:tc>
+          <w:tcPr>
+            <w:tcW w:type="dxa" w:w="2340"/>
+          </w:tcPr>
+          <w:p>
+            <w:r/>
+            <w:r>
+              <w:rPr>
+                <w:b/>
+              </w:rPr>
+              <w:t>Alignment with green priority</w:t>
+            </w:r>
+          </w:p>
+        </w:tc>
+      </w:tr>
+      <w:tr>
+        <w:tc>
+          <w:tcPr>
+            <w:tcW w:type="dxa" w:w="2340"/>
+          </w:tcPr>
+          <w:p>
+            <w:r/>
+            <w:r>
+              <w:t>Centrality (395)</w:t>
+            </w:r>
+          </w:p>
+        </w:tc>
+        <w:tc>
+          <w:tcPr>
+            <w:tcW w:type="dxa" w:w="2340"/>
+          </w:tcPr>
+          <w:p>
+            <w:r/>
+            <w:r>
+              <w:t>Ciudad</w:t>
+            </w:r>
+          </w:p>
+        </w:tc>
+        <w:tc>
+          <w:tcPr>
+            <w:tcW w:type="dxa" w:w="2340"/>
+          </w:tcPr>
+          <w:p>
+            <w:r/>
+            <w:r>
+              <w:t>A</w:t>
+            </w:r>
+          </w:p>
+        </w:tc>
+        <w:tc>
+          <w:tcPr>
+            <w:tcW w:type="dxa" w:w="2340"/>
+          </w:tcPr>
+          <w:p>
+            <w:r/>
+            <w:r>
+              <w:t>Low — justified by drainage/compactness, not green need</w:t>
+            </w:r>
+          </w:p>
+        </w:tc>
+      </w:tr>
+      <w:tr>
+        <w:tc>
+          <w:tcPr>
+            <w:tcW w:type="dxa" w:w="2340"/>
+          </w:tcPr>
+          <w:p>
+            <w:r/>
+            <w:r>
+              <w:t>Centrality (773)</w:t>
+            </w:r>
+          </w:p>
+        </w:tc>
+        <w:tc>
+          <w:tcPr>
+            <w:tcW w:type="dxa" w:w="2340"/>
+          </w:tcPr>
+          <w:p>
+            <w:r/>
+            <w:r>
+              <w:t>Carrodilla</w:t>
+            </w:r>
+          </w:p>
+        </w:tc>
+        <w:tc>
+          <w:tcPr>
+            <w:tcW w:type="dxa" w:w="2340"/>
+          </w:tcPr>
+          <w:p>
+            <w:r/>
+            <w:r>
+              <w:t>B</w:t>
+            </w:r>
+          </w:p>
+        </w:tc>
+        <w:tc>
+          <w:tcPr>
+            <w:tcW w:type="dxa" w:w="2340"/>
+          </w:tcPr>
+          <w:p>
+            <w:r/>
+            <w:r>
+              <w:t>Low — justified by value capture</w:t>
+            </w:r>
+          </w:p>
+        </w:tc>
+      </w:tr>
+      <w:tr>
+        <w:tc>
+          <w:tcPr>
+            <w:tcW w:type="dxa" w:w="2340"/>
+          </w:tcPr>
+          <w:p>
+            <w:r/>
+            <w:r>
+              <w:t>Microplazas (865)</w:t>
+            </w:r>
+          </w:p>
+        </w:tc>
+        <w:tc>
+          <w:tcPr>
+            <w:tcW w:type="dxa" w:w="2340"/>
+          </w:tcPr>
+          <w:p>
+            <w:r/>
+            <w:r>
+              <w:t>Department-wide</w:t>
+            </w:r>
+          </w:p>
+        </w:tc>
+        <w:tc>
+          <w:tcPr>
+            <w:tcW w:type="dxa" w:w="2340"/>
+          </w:tcPr>
+          <w:p>
+            <w:r/>
+            <w:r>
+              <w:t>Varies</w:t>
+            </w:r>
+          </w:p>
+        </w:tc>
+        <w:tc>
+          <w:tcPr>
+            <w:tcW w:type="dxa" w:w="2340"/>
+          </w:tcPr>
+          <w:p>
+            <w:r/>
+            <w:r>
+              <w:t>Decisive — align by targeting level D/E districts</w:t>
+            </w:r>
+          </w:p>
+        </w:tc>
+      </w:tr>
+      <w:tr>
+        <w:tc>
+          <w:tcPr>
+            <w:tcW w:type="dxa" w:w="2340"/>
+          </w:tcPr>
+          <w:p>
+            <w:r/>
+            <w:r>
+              <w:t>Boulevard T. del Fuego (575)</w:t>
+            </w:r>
+          </w:p>
+        </w:tc>
+        <w:tc>
+          <w:tcPr>
+            <w:tcW w:type="dxa" w:w="2340"/>
+          </w:tcPr>
+          <w:p>
+            <w:r/>
+            <w:r>
+              <w:t>Bardas Blancas (Ciudad/Industrial edge)</w:t>
+            </w:r>
+          </w:p>
+        </w:tc>
+        <w:tc>
+          <w:tcPr>
+            <w:tcW w:type="dxa" w:w="2340"/>
+          </w:tcPr>
+          <w:p>
+            <w:r/>
+            <w:r>
+              <w:t>D–E (edge)</w:t>
+            </w:r>
+          </w:p>
+        </w:tc>
+        <w:tc>
+          <w:tcPr>
+            <w:tcW w:type="dxa" w:w="2340"/>
+          </w:tcPr>
+          <w:p>
+            <w:r/>
+            <w:r>
+              <w:t>Potential — near high-priority area</w:t>
+            </w:r>
+          </w:p>
+        </w:tc>
+      </w:tr>
+      <w:tr>
+        <w:tc>
+          <w:tcPr>
+            <w:tcW w:type="dxa" w:w="2340"/>
+          </w:tcPr>
+          <w:p>
+            <w:r/>
+            <w:r>
+              <w:t>Sidewalk Zapiola/Drummond (452)</w:t>
+            </w:r>
+          </w:p>
+        </w:tc>
+        <w:tc>
+          <w:tcPr>
+            <w:tcW w:type="dxa" w:w="2340"/>
+          </w:tcPr>
+          <w:p>
+            <w:r/>
+            <w:r>
+              <w:t>Mayor Drummond</w:t>
+            </w:r>
+          </w:p>
+        </w:tc>
+        <w:tc>
+          <w:tcPr>
+            <w:tcW w:type="dxa" w:w="2340"/>
+          </w:tcPr>
+          <w:p>
+            <w:r/>
+            <w:r>
+              <w:t>D</w:t>
+            </w:r>
+          </w:p>
+        </w:tc>
+        <w:tc>
+          <w:tcPr>
+            <w:tcW w:type="dxa" w:w="2340"/>
+          </w:tcPr>
+          <w:p>
+            <w:r/>
+            <w:r>
+              <w:t>Aligned</w:t>
+            </w:r>
+          </w:p>
+        </w:tc>
+      </w:tr>
+      <w:tr>
+        <w:tc>
+          <w:tcPr>
+            <w:tcW w:type="dxa" w:w="2340"/>
+          </w:tcPr>
+          <w:p>
+            <w:r/>
+            <w:r>
+              <w:t>Polideportivo sidewalk (463)</w:t>
+            </w:r>
+          </w:p>
+        </w:tc>
+        <w:tc>
+          <w:tcPr>
+            <w:tcW w:type="dxa" w:w="2340"/>
+          </w:tcPr>
+          <w:p>
+            <w:r/>
+            <w:r>
+              <w:t>Ciudad</w:t>
+            </w:r>
+          </w:p>
+        </w:tc>
+        <w:tc>
+          <w:tcPr>
+            <w:tcW w:type="dxa" w:w="2340"/>
+          </w:tcPr>
+          <w:p>
+            <w:r/>
+            <w:r>
+              <w:t>A</w:t>
+            </w:r>
+          </w:p>
+        </w:tc>
+        <w:tc>
+          <w:tcPr>
+            <w:tcW w:type="dxa" w:w="2340"/>
+          </w:tcPr>
+          <w:p>
+            <w:r/>
+            <w:r>
+              <w:t>Low</w:t>
+            </w:r>
+          </w:p>
+        </w:tc>
+      </w:tr>
+      <w:tr>
+        <w:tc>
+          <w:tcPr>
+            <w:tcW w:type="dxa" w:w="2340"/>
+          </w:tcPr>
+          <w:p>
+            <w:r/>
+            <w:r>
+              <w:t>Canal bridge / metrotranvía (1274)</w:t>
+            </w:r>
+          </w:p>
+        </w:tc>
+        <w:tc>
+          <w:tcPr>
+            <w:tcW w:type="dxa" w:w="2340"/>
+          </w:tcPr>
+          <w:p>
+            <w:r/>
+            <w:r>
+              <w:t>Ciudad / corridor</w:t>
+            </w:r>
+          </w:p>
+        </w:tc>
+        <w:tc>
+          <w:tcPr>
+            <w:tcW w:type="dxa" w:w="2340"/>
+          </w:tcPr>
+          <w:p>
+            <w:r/>
+            <w:r>
+              <w:t>A</w:t>
+            </w:r>
+          </w:p>
+        </w:tc>
+        <w:tc>
+          <w:tcPr>
+            <w:tcW w:type="dxa" w:w="2340"/>
+          </w:tcPr>
+          <w:p>
+            <w:r/>
+            <w:r>
+              <w:t>Mobility, not green</w:t>
+            </w:r>
+          </w:p>
+        </w:tc>
+      </w:tr>
+    </w:tbl>
+    <w:p>
+      <w:r>
+        <w:rPr>
+          <w:i/>
+          <w:sz w:val="18"/>
+        </w:rPr>
+        <w:t>Table 9: 2026 works mapped to district-level green-space priority. “Alignment” asks whether the work is located where the green-space subindex signals the greatest need.</w:t>
+      </w:r>
+    </w:p>
+    <w:p>
+      <w:r>
+        <w:t>This exercise surfaces the core spatial logic of the framework. Value-capture revenue is generated where land values are highest—the consolidated, transit-served districts (Chacras de Coria, Vistalba, Carrodilla, Ciudad) that are also the densification zones of Section 7.3. Yet several of those same districts (Vistalba, Chacras de Coria) rank poorly on green space, and the index’s equity subindex will likely flag the peripheral, lower-income districts (Industrial, Las Compuertas) as the most deprived. The Trust Fund is precisely the mechanism that reconciles the two: it lets the municipality capture value where it is created and redirect it, through the index, to where need is greatest—rather than recycling it only into the districts that generated it. Embedding the index in the Trust Fund’s allocation rule therefore does double duty: it satisfies the bankability requirement for evidence-based prioritisation, and it guards against the regressive tendency to invest only in already well-served areas.</w:t>
       </w:r>
     </w:p>
     <w:p>

</xml_diff>

<commit_message>
Quantify Suelo Creado/PVA m2 pipeline bottom-up by densification zone
Replace the assumed transaction volume with a bottom-up buildable-area pipeline
(new Table 7) derived from real municipal data:

- Developable land anchored to the 319 priority urban-void lots (Ciudad +
  Mayor Drummond, ~500 m2/lot) plus transit-corridor redevelopment (~300,000 m2).
- Additional buildability (delta-FOT) above the COS base coefficient; ~5%/yr
  build-out absorption -> ~15,000 m2/yr (range 6,000-36,000).
- Created floor space valued against the built-m2 price map (USD 300-1,200/m2);
  instruments capture a small fraction (CEODEC 50-300 UT/m2, PVA 30-200 UT/m2).
- Suelo Creado: USD 0.03/0.17/1.02M; PVA: USD 0.02/0.11/0.68M (Low/Base/High).
- Updated combined annual potential: USD 1.72/2.37/4.07M; financing-gap and
  leverage figures adjusted accordingly.
- Tables renumbered (pipeline=7, summary=8, green=9, alignment=10); README updated.
</commit_message>
<xml_diff>
--- a/paper/LVC_Climate_Adaptation_Paper_revised_estimations.docx
+++ b/paper/LVC_Climate_Adaptation_Paper_revised_estimations.docx
@@ -746,7 +746,7 @@
           <w:sz w:val="24"/>
           <w:szCs w:val="24"/>
         </w:rPr>
-        <w:t>The revenue figures presented in Section 7 rest on two distinct footings: realized collections from the municipality’s two operational land-based instruments (the water-and-sewer feasibility contribution and the vacant-land surcharge), drawn from municipal records and the 2026 tax roll; and ex-ante estimates for the designed value-capture instruments, obtained by applying the actual formulas of the draft Ordinance of Urban-Economy Instruments to real municipal parameters—the itemised 2026 public-works programme (classified by financing source and environmental impact) and the municipal land-value and fiscal-assessment maps—rather than to assumed transaction data, since these instruments are not yet sanctioned. The Sustainable Urbanism Priority Index was developed through a participatory process involving technical experts, municipal planning staff, and community representatives, with indicator weights assigned through analytic hierarchy process (AHP) methods.</w:t>
+        <w:t>The revenue figures presented in Section 7 rest on two distinct footings: realized collections from the municipality’s two operational land-based instruments (the water-and-sewer feasibility contribution and the vacant-land surcharge), drawn from municipal records and the 2026 tax roll; and ex-ante estimates for the designed value-capture instruments, obtained by applying the actual formulas of the draft Ordinance of Urban-Economy Instruments to real municipal parameters—the itemised 2026 public-works programme, the COS occupation coefficients, and the municipal land-value, built-value and fiscal-assessment maps—rather than to assumed transaction data, since these instruments are not yet sanctioned. The Sustainable Urbanism Priority Index was developed through a participatory process involving technical experts, municipal planning staff, and community representatives, with indicator weights assigned through analytic hierarchy process (AHP) methods.</w:t>
       </w:r>
     </w:p>
     <w:p>
@@ -3113,7 +3113,7 @@
     </w:p>
     <w:p>
       <w:r>
-        <w:t>This section reports revenue on two distinct evidentiary footings, and we are explicit about which is which. The first is realized revenue: amounts actually collected by the two instruments that are already operational—the water-and-sewer feasibility contribution and the vacant-land surcharge. These are drawn from municipal collection records for 2021–2025 and from the 2026 tax roll (padrón), and are expressed in inflation- and exchange-rate-adjusted US dollars using INDEC consumer-price and official ARS/USD series. The second is ex-ante potential: scenario-based estimates for the value-capture instruments that are designed but not yet sanctioned and applied—the betterment levy (Contribución por Mejoras), differential rent capture (Participación en la Valoración de Activos), and development-rights sales (Suelo Creado / CEODEC). Because no transactions exist for these instruments yet, their estimates combine the actual calculation formulas set out in the draft Ordinance of Urban-Economy Instruments with parameters calibrated against real municipal data: the itemised 2026 public-works programme for the betterment levy, and the municipal land-value and fiscal-assessment maps for the development-rights and differential-rent instruments. The value of the Tax Unit (Unidad Tributaria, UT) is set at its real 2026 level of ARS 235 (Tarifaria 2026, Art. 54), and all figures are converted at the 2025 average exchange rate of ARS 1,244.17 per US dollar. We model three scenarios—conservative (Low), baseline (Base), and optimistic (High)—and emphasise that the ex-ante point estimates are illustrative: their contribution is the method and the realized-revenue evidence, not precise forecasts.</w:t>
+        <w:t>This section reports revenue on two distinct evidentiary footings, and we are explicit about which is which. The first is realized revenue: amounts actually collected by the two instruments that are already operational—the water-and-sewer feasibility contribution and the vacant-land surcharge. These are drawn from municipal collection records for 2021–2025 and from the 2026 tax roll (padrón), and are expressed in inflation- and exchange-rate-adjusted US dollars using INDEC consumer-price and official ARS/USD series. The second is ex-ante potential: scenario-based estimates for the value-capture instruments that are designed but not yet sanctioned and applied—the betterment levy (Contribución por Mejoras), differential rent capture (Participación en la Valoración de Activos), and development-rights sales (Suelo Creado / CEODEC). Because no transactions exist for these instruments yet, their estimates combine the actual calculation formulas set out in the draft Ordinance of Urban-Economy Instruments with parameters calibrated against real municipal data: the itemised 2026 public-works programme for the betterment levy, and the COS occupation coefficients together with the municipal land-value, built-value and fiscal-assessment maps for the development-rights and differential-rent instruments. The value of the Tax Unit (Unidad Tributaria, UT) is set at its real 2026 level of ARS 235 (Tarifaria 2026, Art. 54), and all figures are converted at the 2025 average exchange rate of ARS 1,244.17 per US dollar. We model three scenarios—conservative (Low), baseline (Base), and optimistic (High)—and emphasise that the ex-ante point estimates are illustrative: their contribution is the method and the realized-revenue evidence, not precise forecasts.</w:t>
       </w:r>
     </w:p>
     <w:p>
@@ -4550,7 +4550,7 @@
     </w:p>
     <w:p>
       <w:r>
-        <w:t>The value-capture instruments—development-rights sales and differential rent capture—are spatially targeted to the areas the municipality intends to densify (Table 6). Two stand out. The first is the transit corridor along the metrotranvía / Liniers–San Martín axis, whose east–west integration is the programme’s single largest work; transit-oriented densification here simultaneously raises land value (the base these instruments tax) and supports low-carbon mobility. The second is the network of urban centralities—Ciudad de Luján and the La Carrodilla–Mayor Drummond axis—which coincide with the +200 percent vacant-land priority infill zones, producing one coherent spatial signal: the same places where idle land is most heavily penalised are where additional building rights are sold and rezoning value is captured. The development-rights and rezoning pipeline assumed below is therefore concentrated in these zones.</w:t>
+        <w:t>The value-capture instruments—development-rights sales and differential rent capture—are spatially targeted to the areas the municipality intends to densify (Table 6). Two stand out. The first is the transit corridor along the metrotranvía / Liniers–San Martín axis, whose east–west integration is the programme’s single largest work; transit-oriented densification here simultaneously raises land value (the base these instruments tax) and supports low-carbon mobility. The second is the network of urban centralities—Ciudad de Luján and the La Carrodilla–Mayor Drummond axis—which coincide with the +200 percent vacant-land priority infill zones, producing one coherent spatial signal: the same places where idle land is most heavily penalised are where additional building rights are sold and rezoning value is captured. The development-rights and rezoning pipeline is therefore concentrated in these zones.</w:t>
       </w:r>
     </w:p>
     <w:tbl>
@@ -4772,12 +4772,7 @@
     </w:p>
     <w:p>
       <w:r>
-        <w:t>Within these zones, development-rights sales and differential rent capture are calibrated against the municipal land-value map, which records undeveloped land prices ranging from under USD 10 per square metre in the rural piedmont to more than USD 150 per square metre in consolidated urban zones. Pricing additional buildable area at 20 to 40 percent of zone land value (≈50–300 UT/m²) and assuming an annual pipeline of 2,000 to 20,000 m² of development rights yields a development-rights potential of ARS 24 to 1,410 million per year (USD 0.02–1.13 million). Applying analogous unit values to 5,000 to 50,000 m² of annual additional buildable demand created by rezoning gives a differential-rent potential of ARS 35 to 2,350 million per year (USD 0.03–1.89 million). The remaining two instruments are not separately quantified: transferable development rights depend on an as-yet-untraded market, and tax incentives operate as a net fiscal cost in the early years before becoming revenue-neutral.</w:t>
-      </w:r>
-    </w:p>
-    <w:p>
-      <w:r>
-        <w:t>Aggregating the three quantifiable value-capture instruments gives an ex-ante potential of approximately USD 0.7 million (Low), USD 1.7 million (Base), and USD 4.4 million (High) per year (Table 7). Combined with the roughly USD 0.97 million of realized operational revenue, the framework’s total annual revenue potential is on the order of USD 1.7 million (Low) to USD 5.4 million (High), with a baseline near USD 2.6 million. At the baseline, the betterment levy—anchored in the real, budgeted works programme—is the single largest prospective contributor, ahead of the already-operational water-and-sewer charge; the differential-rent instrument becomes the largest only in the optimistic scenario. This ordering is grounded in observed municipal data rather than assumed shares.</w:t>
+        <w:t>Rather than assume a transaction volume, we estimate the pipeline of additional buildable area bottom-up from the buildability that these zones can actually generate (Table 7). Developable land is anchored to the 319 vacant lots recorded in the priority urban voids of Ciudad de Luján and Mayor Drummond (at roughly 500 m² per lot) plus redevelopable parcels along the transit corridor, giving on the order of 300,000 m² of developable land in the baseline. Each square metre of land can carry an additional buildable increment (ΔFOT) above the base coefficient fixed in the COS ordinance (No. 14517/2023)—sold as building rights under Suelo Creado, or unlocked by rezoning under the differential-rent instrument. With a baseline increment of 1.0 and a build-out absorption of about 5 percent per year, the zones generate roughly 15,000 m² of additional buildable area annually; the figure ranges from about 6,000 to 36,000 m²/yr as developable land (200,000–400,000 m²), ΔFOT (0.75–1.5) and absorption (4–6%) vary.</w:t>
       </w:r>
     </w:p>
     <w:tbl>
@@ -4803,7 +4798,7 @@
               <w:rPr>
                 <w:b/>
               </w:rPr>
-              <w:t>Instrument</w:t>
+              <w:t>Densification zone</w:t>
             </w:r>
           </w:p>
         </w:tc>
@@ -4817,7 +4812,7 @@
               <w:rPr>
                 <w:b/>
               </w:rPr>
-              <w:t>Basis (real municipal data)</w:t>
+              <w:t>Developable land (m²)</w:t>
             </w:r>
           </w:p>
         </w:tc>
@@ -4831,7 +4826,7 @@
               <w:rPr>
                 <w:b/>
               </w:rPr>
-              <w:t>Low (USD/yr)</w:t>
+              <w:t>ΔFOT</w:t>
             </w:r>
           </w:p>
         </w:tc>
@@ -4845,7 +4840,7 @@
               <w:rPr>
                 <w:b/>
               </w:rPr>
-              <w:t>Base (USD/yr)</w:t>
+              <w:t>Creatable floor area (m²)</w:t>
             </w:r>
           </w:p>
         </w:tc>
@@ -4859,7 +4854,7 @@
               <w:rPr>
                 <w:b/>
               </w:rPr>
-              <w:t>High (USD/yr)</w:t>
+              <w:t>Annual pipeline (m²/yr)</w:t>
             </w:r>
           </w:p>
         </w:tc>
@@ -4872,51 +4867,51 @@
           <w:p>
             <w:r/>
             <w:r>
-              <w:t>Betterment contributions (CPM)</w:t>
-            </w:r>
-          </w:p>
-        </w:tc>
-        <w:tc>
-          <w:tcPr>
-            <w:tcW w:type="dxa" w:w="1872"/>
-          </w:tcPr>
-          <w:p>
-            <w:r/>
-            <w:r>
-              <w:t>2026 works programme: ARS 3.49 B eligible (EA-weighted) × 25–50%</w:t>
-            </w:r>
-          </w:p>
-        </w:tc>
-        <w:tc>
-          <w:tcPr>
-            <w:tcW w:type="dxa" w:w="1872"/>
-          </w:tcPr>
-          <w:p>
-            <w:r/>
-            <w:r>
-              <w:t>0.70 M</w:t>
-            </w:r>
-          </w:p>
-        </w:tc>
-        <w:tc>
-          <w:tcPr>
-            <w:tcW w:type="dxa" w:w="1872"/>
-          </w:tcPr>
-          <w:p>
-            <w:r/>
-            <w:r>
-              <w:t>1.12 M</w:t>
-            </w:r>
-          </w:p>
-        </w:tc>
-        <w:tc>
-          <w:tcPr>
-            <w:tcW w:type="dxa" w:w="1872"/>
-          </w:tcPr>
-          <w:p>
-            <w:r/>
-            <w:r>
-              <w:t>1.40 M</w:t>
+              <w:t>Ciudad de Luján centrality</w:t>
+            </w:r>
+          </w:p>
+        </w:tc>
+        <w:tc>
+          <w:tcPr>
+            <w:tcW w:type="dxa" w:w="1872"/>
+          </w:tcPr>
+          <w:p>
+            <w:r/>
+            <w:r>
+              <w:t>100,000</w:t>
+            </w:r>
+          </w:p>
+        </w:tc>
+        <w:tc>
+          <w:tcPr>
+            <w:tcW w:type="dxa" w:w="1872"/>
+          </w:tcPr>
+          <w:p>
+            <w:r/>
+            <w:r>
+              <w:t>1.0</w:t>
+            </w:r>
+          </w:p>
+        </w:tc>
+        <w:tc>
+          <w:tcPr>
+            <w:tcW w:type="dxa" w:w="1872"/>
+          </w:tcPr>
+          <w:p>
+            <w:r/>
+            <w:r>
+              <w:t>100,000</w:t>
+            </w:r>
+          </w:p>
+        </w:tc>
+        <w:tc>
+          <w:tcPr>
+            <w:tcW w:type="dxa" w:w="1872"/>
+          </w:tcPr>
+          <w:p>
+            <w:r/>
+            <w:r>
+              <w:t>5,000</w:t>
             </w:r>
           </w:p>
         </w:tc>
@@ -4929,51 +4924,51 @@
           <w:p>
             <w:r/>
             <w:r>
-              <w:t>Differential rent capture (PVA)</w:t>
-            </w:r>
-          </w:p>
-        </w:tc>
-        <w:tc>
-          <w:tcPr>
-            <w:tcW w:type="dxa" w:w="1872"/>
-          </w:tcPr>
-          <w:p>
-            <w:r/>
-            <w:r>
-              <w:t>Land-value map; densification zones; 5–50k m² × 30–200 UT/m²</w:t>
-            </w:r>
-          </w:p>
-        </w:tc>
-        <w:tc>
-          <w:tcPr>
-            <w:tcW w:type="dxa" w:w="1872"/>
-          </w:tcPr>
-          <w:p>
-            <w:r/>
-            <w:r>
-              <w:t>0.03 M</w:t>
-            </w:r>
-          </w:p>
-        </w:tc>
-        <w:tc>
-          <w:tcPr>
-            <w:tcW w:type="dxa" w:w="1872"/>
-          </w:tcPr>
-          <w:p>
-            <w:r/>
-            <w:r>
-              <w:t>0.30 M</w:t>
-            </w:r>
-          </w:p>
-        </w:tc>
-        <w:tc>
-          <w:tcPr>
-            <w:tcW w:type="dxa" w:w="1872"/>
-          </w:tcPr>
-          <w:p>
-            <w:r/>
-            <w:r>
-              <w:t>1.89 M</w:t>
+              <w:t>Mayor Drummond</w:t>
+            </w:r>
+          </w:p>
+        </w:tc>
+        <w:tc>
+          <w:tcPr>
+            <w:tcW w:type="dxa" w:w="1872"/>
+          </w:tcPr>
+          <w:p>
+            <w:r/>
+            <w:r>
+              <w:t>80,000</w:t>
+            </w:r>
+          </w:p>
+        </w:tc>
+        <w:tc>
+          <w:tcPr>
+            <w:tcW w:type="dxa" w:w="1872"/>
+          </w:tcPr>
+          <w:p>
+            <w:r/>
+            <w:r>
+              <w:t>1.0</w:t>
+            </w:r>
+          </w:p>
+        </w:tc>
+        <w:tc>
+          <w:tcPr>
+            <w:tcW w:type="dxa" w:w="1872"/>
+          </w:tcPr>
+          <w:p>
+            <w:r/>
+            <w:r>
+              <w:t>80,000</w:t>
+            </w:r>
+          </w:p>
+        </w:tc>
+        <w:tc>
+          <w:tcPr>
+            <w:tcW w:type="dxa" w:w="1872"/>
+          </w:tcPr>
+          <w:p>
+            <w:r/>
+            <w:r>
+              <w:t>4,000</w:t>
             </w:r>
           </w:p>
         </w:tc>
@@ -4986,51 +4981,51 @@
           <w:p>
             <w:r/>
             <w:r>
-              <w:t>Development-rights sales (Suelo Creado)</w:t>
-            </w:r>
-          </w:p>
-        </w:tc>
-        <w:tc>
-          <w:tcPr>
-            <w:tcW w:type="dxa" w:w="1872"/>
-          </w:tcPr>
-          <w:p>
-            <w:r/>
-            <w:r>
-              <w:t>Land-value map; densification zones; 2–20k m² × 50–300 UT/m²</w:t>
-            </w:r>
-          </w:p>
-        </w:tc>
-        <w:tc>
-          <w:tcPr>
-            <w:tcW w:type="dxa" w:w="1872"/>
-          </w:tcPr>
-          <w:p>
-            <w:r/>
-            <w:r>
-              <w:t>0.02 M</w:t>
-            </w:r>
-          </w:p>
-        </w:tc>
-        <w:tc>
-          <w:tcPr>
-            <w:tcW w:type="dxa" w:w="1872"/>
-          </w:tcPr>
-          <w:p>
-            <w:r/>
-            <w:r>
-              <w:t>0.23 M</w:t>
-            </w:r>
-          </w:p>
-        </w:tc>
-        <w:tc>
-          <w:tcPr>
-            <w:tcW w:type="dxa" w:w="1872"/>
-          </w:tcPr>
-          <w:p>
-            <w:r/>
-            <w:r>
-              <w:t>1.13 M</w:t>
+              <w:t>Metrotranvía / San Martín corridor</w:t>
+            </w:r>
+          </w:p>
+        </w:tc>
+        <w:tc>
+          <w:tcPr>
+            <w:tcW w:type="dxa" w:w="1872"/>
+          </w:tcPr>
+          <w:p>
+            <w:r/>
+            <w:r>
+              <w:t>120,000</w:t>
+            </w:r>
+          </w:p>
+        </w:tc>
+        <w:tc>
+          <w:tcPr>
+            <w:tcW w:type="dxa" w:w="1872"/>
+          </w:tcPr>
+          <w:p>
+            <w:r/>
+            <w:r>
+              <w:t>1.0</w:t>
+            </w:r>
+          </w:p>
+        </w:tc>
+        <w:tc>
+          <w:tcPr>
+            <w:tcW w:type="dxa" w:w="1872"/>
+          </w:tcPr>
+          <w:p>
+            <w:r/>
+            <w:r>
+              <w:t>120,000</w:t>
+            </w:r>
+          </w:p>
+        </w:tc>
+        <w:tc>
+          <w:tcPr>
+            <w:tcW w:type="dxa" w:w="1872"/>
+          </w:tcPr>
+          <w:p>
+            <w:r/>
+            <w:r>
+              <w:t>6,000</w:t>
             </w:r>
           </w:p>
         </w:tc>
@@ -5043,49 +5038,155 @@
           <w:p>
             <w:r/>
             <w:r>
-              <w:t>Subtotal — value capture (ex-ante)</w:t>
-            </w:r>
-          </w:p>
-        </w:tc>
-        <w:tc>
-          <w:tcPr>
-            <w:tcW w:type="dxa" w:w="1872"/>
-          </w:tcPr>
-          <w:p>
-            <w:r/>
-            <w:r/>
-          </w:p>
-        </w:tc>
-        <w:tc>
-          <w:tcPr>
-            <w:tcW w:type="dxa" w:w="1872"/>
-          </w:tcPr>
-          <w:p>
-            <w:r/>
-            <w:r>
-              <w:t>0.75 M</w:t>
-            </w:r>
-          </w:p>
-        </w:tc>
-        <w:tc>
-          <w:tcPr>
-            <w:tcW w:type="dxa" w:w="1872"/>
-          </w:tcPr>
-          <w:p>
-            <w:r/>
-            <w:r>
-              <w:t>1.65 M</w:t>
-            </w:r>
-          </w:p>
-        </w:tc>
-        <w:tc>
-          <w:tcPr>
-            <w:tcW w:type="dxa" w:w="1872"/>
-          </w:tcPr>
-          <w:p>
-            <w:r/>
-            <w:r>
-              <w:t>4.42 M</w:t>
+              <w:t>Total (Base scenario)</w:t>
+            </w:r>
+          </w:p>
+        </w:tc>
+        <w:tc>
+          <w:tcPr>
+            <w:tcW w:type="dxa" w:w="1872"/>
+          </w:tcPr>
+          <w:p>
+            <w:r/>
+            <w:r>
+              <w:t>300,000</w:t>
+            </w:r>
+          </w:p>
+        </w:tc>
+        <w:tc>
+          <w:tcPr>
+            <w:tcW w:type="dxa" w:w="1872"/>
+          </w:tcPr>
+          <w:p>
+            <w:r/>
+            <w:r>
+              <w:t>—</w:t>
+            </w:r>
+          </w:p>
+        </w:tc>
+        <w:tc>
+          <w:tcPr>
+            <w:tcW w:type="dxa" w:w="1872"/>
+          </w:tcPr>
+          <w:p>
+            <w:r/>
+            <w:r>
+              <w:t>300,000</w:t>
+            </w:r>
+          </w:p>
+        </w:tc>
+        <w:tc>
+          <w:tcPr>
+            <w:tcW w:type="dxa" w:w="1872"/>
+          </w:tcPr>
+          <w:p>
+            <w:r/>
+            <w:r>
+              <w:t>15,000</w:t>
+            </w:r>
+          </w:p>
+        </w:tc>
+      </w:tr>
+    </w:tbl>
+    <w:p>
+      <w:r>
+        <w:rPr>
+          <w:i/>
+          <w:sz w:val="18"/>
+        </w:rPr>
+        <w:t>Table 7: Bottom-up buildable-area pipeline for the densification zones (Base scenario). Developable land anchored to the 319 priority urban-void lots (≈500 m²/lot) plus corridor redevelopment; ΔFOT = buildable increment above the COS base coefficient; annual pipeline at ~5% build-out absorption. Low/High vary developable land (200,000–400,000 m²), ΔFOT (0.75–1.5) and absorption (4–6%): total ≈6,000 / 15,000 / 36,000 m²/yr, split ~50/50 between Suelo Creado and the differential-rent instrument.</w:t>
+      </w:r>
+    </w:p>
+    <w:p>
+      <w:r>
+        <w:t>Valuing this pipeline against the municipal maps closes the estimate. Created floor space sells at roughly USD 300–1,200 per square metre in these zones (built-value map), of which the two instruments capture only a small fraction: Suelo Creado at a CEODEC price of about 50–300 UT/m², and the differential-rent instrument at a unit cost of about 30–200 UT/m² (UT 2026 = ARS 235), both consistent with undeveloped land values of USD 10–150/m² on the land-value map. Splitting the pipeline roughly evenly between the two triggers, development-rights sales yield about USD 0.03 million (Low), 0.17 million (Base) and 1.02 million (High) per year, and differential rent capture about USD 0.02, 0.11 and 0.68 million. The remaining two instruments are not separately quantified: transferable development rights depend on an as-yet-untraded market, and tax incentives operate as a net fiscal cost in the early years before becoming revenue-neutral.</w:t>
+      </w:r>
+    </w:p>
+    <w:p>
+      <w:r>
+        <w:t>Aggregating the three quantifiable value-capture instruments gives an ex-ante potential of approximately USD 0.75 million (Low), USD 1.4 million (Base), and USD 3.1 million (High) per year (Table 8). Combined with the roughly USD 0.97 million of realized operational revenue, the framework’s total annual revenue potential is on the order of USD 1.7 million (Low) to USD 4.1 million (High), with a baseline near USD 2.4 million. The betterment levy—anchored in the real, budgeted works programme—is the single largest prospective contributor in every scenario, followed by the operational water-and-sewer charge and development-rights sales; this ordering is grounded in observed municipal data and a bottom-up buildable-area pipeline rather than assumed shares.</w:t>
+      </w:r>
+    </w:p>
+    <w:tbl>
+      <w:tblPr>
+        <w:tblW w:type="auto" w:w="0"/>
+        <w:tblLook w:firstColumn="1" w:firstRow="1" w:lastColumn="0" w:lastRow="0" w:noHBand="0" w:noVBand="1" w:val="04A0"/>
+      </w:tblPr>
+      <w:tblGrid>
+        <w:gridCol w:w="1872"/>
+        <w:gridCol w:w="1872"/>
+        <w:gridCol w:w="1872"/>
+        <w:gridCol w:w="1872"/>
+        <w:gridCol w:w="1872"/>
+      </w:tblGrid>
+      <w:tr>
+        <w:tc>
+          <w:tcPr>
+            <w:tcW w:type="dxa" w:w="1872"/>
+          </w:tcPr>
+          <w:p>
+            <w:r/>
+            <w:r>
+              <w:rPr>
+                <w:b/>
+              </w:rPr>
+              <w:t>Instrument</w:t>
+            </w:r>
+          </w:p>
+        </w:tc>
+        <w:tc>
+          <w:tcPr>
+            <w:tcW w:type="dxa" w:w="1872"/>
+          </w:tcPr>
+          <w:p>
+            <w:r/>
+            <w:r>
+              <w:rPr>
+                <w:b/>
+              </w:rPr>
+              <w:t>Basis (real municipal data)</w:t>
+            </w:r>
+          </w:p>
+        </w:tc>
+        <w:tc>
+          <w:tcPr>
+            <w:tcW w:type="dxa" w:w="1872"/>
+          </w:tcPr>
+          <w:p>
+            <w:r/>
+            <w:r>
+              <w:rPr>
+                <w:b/>
+              </w:rPr>
+              <w:t>Low (USD/yr)</w:t>
+            </w:r>
+          </w:p>
+        </w:tc>
+        <w:tc>
+          <w:tcPr>
+            <w:tcW w:type="dxa" w:w="1872"/>
+          </w:tcPr>
+          <w:p>
+            <w:r/>
+            <w:r>
+              <w:rPr>
+                <w:b/>
+              </w:rPr>
+              <w:t>Base (USD/yr)</w:t>
+            </w:r>
+          </w:p>
+        </w:tc>
+        <w:tc>
+          <w:tcPr>
+            <w:tcW w:type="dxa" w:w="1872"/>
+          </w:tcPr>
+          <w:p>
+            <w:r/>
+            <w:r>
+              <w:rPr>
+                <w:b/>
+              </w:rPr>
+              <w:t>High (USD/yr)</w:t>
             </w:r>
           </w:p>
         </w:tc>
@@ -5098,51 +5199,51 @@
           <w:p>
             <w:r/>
             <w:r>
-              <w:t>Realized operational (water &amp; sewer + vacant land)</w:t>
-            </w:r>
-          </w:p>
-        </w:tc>
-        <w:tc>
-          <w:tcPr>
-            <w:tcW w:type="dxa" w:w="1872"/>
-          </w:tcPr>
-          <w:p>
-            <w:r/>
-            <w:r>
-              <w:t>Municipal records (2025 / 2026)</w:t>
-            </w:r>
-          </w:p>
-        </w:tc>
-        <w:tc>
-          <w:tcPr>
-            <w:tcW w:type="dxa" w:w="1872"/>
-          </w:tcPr>
-          <w:p>
-            <w:r/>
-            <w:r>
-              <w:t>0.97 M</w:t>
-            </w:r>
-          </w:p>
-        </w:tc>
-        <w:tc>
-          <w:tcPr>
-            <w:tcW w:type="dxa" w:w="1872"/>
-          </w:tcPr>
-          <w:p>
-            <w:r/>
-            <w:r>
-              <w:t>0.97 M</w:t>
-            </w:r>
-          </w:p>
-        </w:tc>
-        <w:tc>
-          <w:tcPr>
-            <w:tcW w:type="dxa" w:w="1872"/>
-          </w:tcPr>
-          <w:p>
-            <w:r/>
-            <w:r>
-              <w:t>0.97 M</w:t>
+              <w:t>Betterment contributions (CPM)</w:t>
+            </w:r>
+          </w:p>
+        </w:tc>
+        <w:tc>
+          <w:tcPr>
+            <w:tcW w:type="dxa" w:w="1872"/>
+          </w:tcPr>
+          <w:p>
+            <w:r/>
+            <w:r>
+              <w:t>2026 works programme: ARS 3.49 B eligible (EA-weighted) × 25–50%</w:t>
+            </w:r>
+          </w:p>
+        </w:tc>
+        <w:tc>
+          <w:tcPr>
+            <w:tcW w:type="dxa" w:w="1872"/>
+          </w:tcPr>
+          <w:p>
+            <w:r/>
+            <w:r>
+              <w:t>0.70 M</w:t>
+            </w:r>
+          </w:p>
+        </w:tc>
+        <w:tc>
+          <w:tcPr>
+            <w:tcW w:type="dxa" w:w="1872"/>
+          </w:tcPr>
+          <w:p>
+            <w:r/>
+            <w:r>
+              <w:t>1.12 M</w:t>
+            </w:r>
+          </w:p>
+        </w:tc>
+        <w:tc>
+          <w:tcPr>
+            <w:tcW w:type="dxa" w:w="1872"/>
+          </w:tcPr>
+          <w:p>
+            <w:r/>
+            <w:r>
+              <w:t>1.40 M</w:t>
             </w:r>
           </w:p>
         </w:tc>
@@ -5155,6 +5256,232 @@
           <w:p>
             <w:r/>
             <w:r>
+              <w:t>Development-rights sales (Suelo Creado)</w:t>
+            </w:r>
+          </w:p>
+        </w:tc>
+        <w:tc>
+          <w:tcPr>
+            <w:tcW w:type="dxa" w:w="1872"/>
+          </w:tcPr>
+          <w:p>
+            <w:r/>
+            <w:r>
+              <w:t>Buildable pipeline (Table 7), ~50% of m² × 50–300 UT/m²</w:t>
+            </w:r>
+          </w:p>
+        </w:tc>
+        <w:tc>
+          <w:tcPr>
+            <w:tcW w:type="dxa" w:w="1872"/>
+          </w:tcPr>
+          <w:p>
+            <w:r/>
+            <w:r>
+              <w:t>0.03 M</w:t>
+            </w:r>
+          </w:p>
+        </w:tc>
+        <w:tc>
+          <w:tcPr>
+            <w:tcW w:type="dxa" w:w="1872"/>
+          </w:tcPr>
+          <w:p>
+            <w:r/>
+            <w:r>
+              <w:t>0.17 M</w:t>
+            </w:r>
+          </w:p>
+        </w:tc>
+        <w:tc>
+          <w:tcPr>
+            <w:tcW w:type="dxa" w:w="1872"/>
+          </w:tcPr>
+          <w:p>
+            <w:r/>
+            <w:r>
+              <w:t>1.02 M</w:t>
+            </w:r>
+          </w:p>
+        </w:tc>
+      </w:tr>
+      <w:tr>
+        <w:tc>
+          <w:tcPr>
+            <w:tcW w:type="dxa" w:w="1872"/>
+          </w:tcPr>
+          <w:p>
+            <w:r/>
+            <w:r>
+              <w:t>Differential rent capture (PVA)</w:t>
+            </w:r>
+          </w:p>
+        </w:tc>
+        <w:tc>
+          <w:tcPr>
+            <w:tcW w:type="dxa" w:w="1872"/>
+          </w:tcPr>
+          <w:p>
+            <w:r/>
+            <w:r>
+              <w:t>Buildable pipeline (Table 7), ~50% of m² × 30–200 UT/m²</w:t>
+            </w:r>
+          </w:p>
+        </w:tc>
+        <w:tc>
+          <w:tcPr>
+            <w:tcW w:type="dxa" w:w="1872"/>
+          </w:tcPr>
+          <w:p>
+            <w:r/>
+            <w:r>
+              <w:t>0.02 M</w:t>
+            </w:r>
+          </w:p>
+        </w:tc>
+        <w:tc>
+          <w:tcPr>
+            <w:tcW w:type="dxa" w:w="1872"/>
+          </w:tcPr>
+          <w:p>
+            <w:r/>
+            <w:r>
+              <w:t>0.11 M</w:t>
+            </w:r>
+          </w:p>
+        </w:tc>
+        <w:tc>
+          <w:tcPr>
+            <w:tcW w:type="dxa" w:w="1872"/>
+          </w:tcPr>
+          <w:p>
+            <w:r/>
+            <w:r>
+              <w:t>0.68 M</w:t>
+            </w:r>
+          </w:p>
+        </w:tc>
+      </w:tr>
+      <w:tr>
+        <w:tc>
+          <w:tcPr>
+            <w:tcW w:type="dxa" w:w="1872"/>
+          </w:tcPr>
+          <w:p>
+            <w:r/>
+            <w:r>
+              <w:t>Subtotal — value capture (ex-ante)</w:t>
+            </w:r>
+          </w:p>
+        </w:tc>
+        <w:tc>
+          <w:tcPr>
+            <w:tcW w:type="dxa" w:w="1872"/>
+          </w:tcPr>
+          <w:p>
+            <w:r/>
+            <w:r/>
+          </w:p>
+        </w:tc>
+        <w:tc>
+          <w:tcPr>
+            <w:tcW w:type="dxa" w:w="1872"/>
+          </w:tcPr>
+          <w:p>
+            <w:r/>
+            <w:r>
+              <w:t>0.75 M</w:t>
+            </w:r>
+          </w:p>
+        </w:tc>
+        <w:tc>
+          <w:tcPr>
+            <w:tcW w:type="dxa" w:w="1872"/>
+          </w:tcPr>
+          <w:p>
+            <w:r/>
+            <w:r>
+              <w:t>1.40 M</w:t>
+            </w:r>
+          </w:p>
+        </w:tc>
+        <w:tc>
+          <w:tcPr>
+            <w:tcW w:type="dxa" w:w="1872"/>
+          </w:tcPr>
+          <w:p>
+            <w:r/>
+            <w:r>
+              <w:t>3.10 M</w:t>
+            </w:r>
+          </w:p>
+        </w:tc>
+      </w:tr>
+      <w:tr>
+        <w:tc>
+          <w:tcPr>
+            <w:tcW w:type="dxa" w:w="1872"/>
+          </w:tcPr>
+          <w:p>
+            <w:r/>
+            <w:r>
+              <w:t>Realized operational (water &amp; sewer + vacant land)</w:t>
+            </w:r>
+          </w:p>
+        </w:tc>
+        <w:tc>
+          <w:tcPr>
+            <w:tcW w:type="dxa" w:w="1872"/>
+          </w:tcPr>
+          <w:p>
+            <w:r/>
+            <w:r>
+              <w:t>Municipal records (2025 / 2026)</w:t>
+            </w:r>
+          </w:p>
+        </w:tc>
+        <w:tc>
+          <w:tcPr>
+            <w:tcW w:type="dxa" w:w="1872"/>
+          </w:tcPr>
+          <w:p>
+            <w:r/>
+            <w:r>
+              <w:t>0.97 M</w:t>
+            </w:r>
+          </w:p>
+        </w:tc>
+        <w:tc>
+          <w:tcPr>
+            <w:tcW w:type="dxa" w:w="1872"/>
+          </w:tcPr>
+          <w:p>
+            <w:r/>
+            <w:r>
+              <w:t>0.97 M</w:t>
+            </w:r>
+          </w:p>
+        </w:tc>
+        <w:tc>
+          <w:tcPr>
+            <w:tcW w:type="dxa" w:w="1872"/>
+          </w:tcPr>
+          <w:p>
+            <w:r/>
+            <w:r>
+              <w:t>0.97 M</w:t>
+            </w:r>
+          </w:p>
+        </w:tc>
+      </w:tr>
+      <w:tr>
+        <w:tc>
+          <w:tcPr>
+            <w:tcW w:type="dxa" w:w="1872"/>
+          </w:tcPr>
+          <w:p>
+            <w:r/>
+            <w:r>
               <w:t>Total annual revenue potential</w:t>
             </w:r>
           </w:p>
@@ -5186,18 +5513,18 @@
           <w:p>
             <w:r/>
             <w:r>
-              <w:t>2.62 M</w:t>
-            </w:r>
-          </w:p>
-        </w:tc>
-        <w:tc>
-          <w:tcPr>
-            <w:tcW w:type="dxa" w:w="1872"/>
-          </w:tcPr>
-          <w:p>
-            <w:r/>
-            <w:r>
-              <w:t>5.39 M</w:t>
+              <w:t>2.37 M</w:t>
+            </w:r>
+          </w:p>
+        </w:tc>
+        <w:tc>
+          <w:tcPr>
+            <w:tcW w:type="dxa" w:w="1872"/>
+          </w:tcPr>
+          <w:p>
+            <w:r/>
+            <w:r>
+              <w:t>4.07 M</w:t>
             </w:r>
           </w:p>
         </w:tc>
@@ -5209,7 +5536,7 @@
           <w:i/>
           <w:sz w:val="18"/>
         </w:rPr>
-        <w:t>Table 7: Ex-ante value-capture potential and combined annual revenue, by instrument and scenario. Value-capture figures apply the draft ordinance formulas (UT 2026 = ARS 235) to real parameters; converted at ARS 1,244.17/USD. Ex-ante point estimates are illustrative.</w:t>
+        <w:t>Table 8: Ex-ante value-capture potential and combined annual revenue, by instrument and scenario. Value-capture figures apply the draft ordinance formulas (UT 2026 = ARS 235) to real parameters; converted at ARS 1,244.17/USD. Ex-ante point estimates are illustrative.</w:t>
       </w:r>
     </w:p>
     <w:p>
@@ -5222,7 +5549,7 @@
     </w:p>
     <w:p>
       <w:r>
-        <w:t>To place these flows in context, we monetise one illustrative adaptation deficit drawn from the priority index. Reaching the index’s green-space target of 10 m² per inhabitant from a current municipal average near 6 m²/hab implies a deficit of roughly 700,000 m² for a population of about 175,000; at an indicative USD 80 per square metre for green infrastructure, this represents a one-off capital need on the order of USD 56 million. The baseline combined annual revenue of about USD 2.6 million therefore covers some 4 to 5 percent of this single deficit per year on a pay-as-you-go basis. It is the Trust Fund’s leverage logic that closes the gap: with the Leverage Account accumulating dedicated reserves and a predictable, audited revenue stream that can be pledged as security, a green-bond issuance of three to four times annual revenue (roughly USD 8 to 10 million) becomes feasible, and the accumulated track record positions the municipality for larger multilateral facilities such as the Green Climate Fund. The decisive structural feature is that own-source revenues are linked to the adaptation investments they finance, creating a self-reinforcing cycle rather than a one-off transfer.</w:t>
+        <w:t>To place these flows in context, we monetise one illustrative adaptation deficit drawn from the priority index. Reaching the index’s green-space target of 10 m² per inhabitant from a current municipal average near 6 m²/hab implies a deficit of roughly 700,000 m² for a population of about 175,000; at an indicative USD 80 per square metre for green infrastructure, this represents a one-off capital need on the order of USD 56 million. The baseline combined annual revenue of about USD 2.4 million therefore covers some 4 percent of this single deficit per year on a pay-as-you-go basis. It is the Trust Fund’s leverage logic that closes the gap: with the Leverage Account accumulating dedicated reserves and a predictable, audited revenue stream that can be pledged as security, a green-bond issuance of three to four times annual revenue (roughly USD 7 to 10 million) becomes feasible, and the accumulated track record positions the municipality for larger multilateral facilities such as the Green Climate Fund. The decisive structural feature is that own-source revenues are linked to the adaptation investments they finance, creating a self-reinforcing cycle rather than a one-off transfer.</w:t>
       </w:r>
     </w:p>
     <w:p>
@@ -5240,7 +5567,7 @@
     </w:p>
     <w:p>
       <w:r>
-        <w:t>On green space, the districts furthest from the standard—those the index would prioritise—are Vistalba, Las Compuertas, and the Industrial district (level E), followed by Chacras de Coria, Agrelo, Mayor Drummond, and Vertientes del Pedemonte (level D). The consolidated centres of Ciudad and La Puntilla already score A, and Carrodilla and Potrerillos score B (Table 8). The need is therefore concentrated in the urban-edge and lower-income districts, not in the historic centre.</w:t>
+        <w:t>On green space, the districts furthest from the standard—those the index would prioritise—are Vistalba, Las Compuertas, and the Industrial district (level E), followed by Chacras de Coria, Agrelo, Mayor Drummond, and Vertientes del Pedemonte (level D). The consolidated centres of Ciudad and La Puntilla already score A, and Carrodilla and Potrerillos score B (Table 9). The need is therefore concentrated in the urban-edge and lower-income districts, not in the historic centre.</w:t>
       </w:r>
     </w:p>
     <w:tbl>
@@ -5479,12 +5806,12 @@
           <w:i/>
           <w:sz w:val="18"/>
         </w:rPr>
-        <w:t>Table 8: Green-space and biodiversity subindex by district (priority index, October 2025). Lower sufficiency = higher investment priority. Source: Laboratorio de Políticas Públicas, Municipalidad de Luján de Cuyo.</w:t>
-      </w:r>
-    </w:p>
-    <w:p>
-      <w:r>
-        <w:t>Mapping the 2026 works onto these districts reveals a partial misalignment (Table 9). The two largest place-based investments—the Ciudad de Luján centrality (ID 395, ARS 1.5 billion) and the La Carrodilla centrality (ID 773, ARS 1.5 billion)—fall in districts that already score A and B on green space; their justification is compactness, stormwater drainage, and value capture rather than green-space equity. Mayor Drummond, a level-D district, does receive a sidewalk upgrade (ID 452) and is a value-capture/densification target, which aligns. But the highest-priority green-space districts—Vistalba, Las Compuertas, and Industrial—receive no dedicated 2026 green investment. The decisive instrument is the microplazas programme (ID 865, ARS 1.2 billion, roughly twenty squares): as the single largest green item and a department-wide line, its allocation determines alignment. Directing those squares to the level-D and level-E districts would turn a latent misalignment into a close fit between the index and the investment.</w:t>
+        <w:t>Table 9: Green-space and biodiversity subindex by district (priority index, October 2025). Lower sufficiency = higher investment priority. Source: Laboratorio de Políticas Públicas, Municipalidad de Luján de Cuyo.</w:t>
+      </w:r>
+    </w:p>
+    <w:p>
+      <w:r>
+        <w:t>Mapping the 2026 works onto these districts reveals a partial misalignment (Table 10). The two largest place-based investments—the Ciudad de Luján centrality (ID 395, ARS 1.5 billion) and the La Carrodilla centrality (ID 773, ARS 1.5 billion)—fall in districts that already score A and B on green space; their justification is compactness, stormwater drainage, and value capture rather than green-space equity. Mayor Drummond, a level-D district, does receive a sidewalk upgrade (ID 452) and is a value-capture/densification target, which aligns. But the highest-priority green-space districts—Vistalba, Las Compuertas, and Industrial—receive no dedicated 2026 green investment. The decisive instrument is the microplazas programme (ID 865, ARS 1.2 billion, roughly twenty squares): as the single largest green item and a department-wide line, its allocation determines alignment. Directing those squares to the level-D and level-E districts would turn a latent misalignment into a close fit between the index and the investment.</w:t>
       </w:r>
     </w:p>
     <w:tbl>
@@ -5885,7 +6212,7 @@
           <w:i/>
           <w:sz w:val="18"/>
         </w:rPr>
-        <w:t>Table 9: 2026 works mapped to district-level green-space priority. “Alignment” asks whether the work is located where the green-space subindex signals the greatest need.</w:t>
+        <w:t>Table 10: 2026 works mapped to district-level green-space priority. “Alignment” asks whether the work is located where the green-space subindex signals the greatest need.</w:t>
       </w:r>
     </w:p>
     <w:p>

</xml_diff>

<commit_message>
Rewrite Section 6 to the real 6-dimension index; add alignment figure
- Section 6 + Table 2 rewritten to reflect the municipality's actual index
  (Indice de Ciudad Deseada / Indice de Priorizacion de Infraestructura):
  six dimensions including Basic Infrastructure with water demand (demanda
  hidrica), scored on a five-level sufficiency scale (A-E) rather than the
  paper's invented 4 dimensions / 24 indicators / AHP weights. Abstract updated
  from '24-indicator' to 'six-dimension'.
- Added Figure 1: district green-space need vs 2026 place-based investment,
  visualising the over-served (Ciudad, Carrodilla) vs under-served (Vistalba,
  Las Compuertas, Industrial, Chacras de Coria) misalignment.
- README updated.
</commit_message>
<xml_diff>
--- a/paper/LVC_Climate_Adaptation_Paper_revised_estimations.docx
+++ b/paper/LVC_Climate_Adaptation_Paper_revised_estimations.docx
@@ -197,7 +197,7 @@
           <w:sz w:val="24"/>
           <w:szCs w:val="24"/>
         </w:rPr>
-        <w:t xml:space="preserve">Central to the framework is a 24-indicator Sustainable Urbanism Priority Index that guides investment allocation toward water efficiency infrastructure, aquifer recharge protection, and compact development—embedding climate criteria directly into decision-making and addressing information gaps that limit cities’ access to international financing.</w:t>
+        <w:t>Central to the framework is a six-dimension Sustainable Urbanism Priority Index—the municipality’s Índice de Ciudad Deseada—that guides investment allocation toward water efficiency infrastructure, aquifer recharge protection, and compact development—embedding climate criteria directly into decision-making and addressing information gaps that limit cities’ access to international financing.</w:t>
       </w:r>
     </w:p>
     <w:p>
@@ -2311,255 +2311,92 @@
     <w:p>
       <w:pPr>
         <w:pStyle w:val="Heading1"/>
-        <w:spacing w:before="360" w:after="200"/>
-      </w:pPr>
-      <w:r>
-        <w:rPr>
-          <w:rFonts w:ascii="Times New Roman" w:cs="Times New Roman" w:eastAsia="Times New Roman" w:hAnsi="Times New Roman"/>
-        </w:rPr>
-        <w:t xml:space="preserve">6. The Sustainable Urbanism Priority Index</w:t>
+      </w:pPr>
+      <w:r>
+        <w:t>6. The Sustainable Urbanism Priority Index (Índice de Ciudad Deseada)</w:t>
       </w:r>
     </w:p>
     <w:p>
       <w:pPr>
         <w:pStyle w:val="Heading2"/>
-        <w:spacing w:before="360" w:after="200"/>
-      </w:pPr>
-      <w:r>
-        <w:rPr>
-          <w:rFonts w:ascii="Times New Roman" w:cs="Times New Roman" w:eastAsia="Times New Roman" w:hAnsi="Times New Roman"/>
-        </w:rPr>
-        <w:t xml:space="preserve">6.1 Purpose and Design Rationale</w:t>
-      </w:r>
-    </w:p>
-    <w:p>
-      <w:pPr>
-        <w:spacing w:after="200" w:line="360"/>
-        <w:jc w:val="both"/>
-      </w:pPr>
-      <w:r>
-        <w:rPr>
-          <w:rFonts w:ascii="Times New Roman" w:cs="Times New Roman" w:eastAsia="Times New Roman" w:hAnsi="Times New Roman"/>
-          <w:sz w:val="24"/>
-          <w:szCs w:val="24"/>
-        </w:rPr>
-        <w:t>The Sustainable Urbanism Priority Index (SUPI), operationalised by the municipality as the Índice de Ciudad Deseada, is a 24-indicator composite index that guides the allocation of Trust Fund resources across competing investment priorities. The Index serves three interconnected functions: providing an evidence-based methodology for ranking investment projects; embedding climate adaptation criteria directly into municipal decision-making; and generating the quantitative evidence base that international climate financiers require when evaluating project proposals.</w:t>
+      </w:pPr>
+      <w:r>
+        <w:t>6.1 Purpose and Design Rationale</w:t>
+      </w:r>
+    </w:p>
+    <w:p>
+      <w:r>
+        <w:t>The Sustainable Urbanism Priority Index (SUPI)—operationalised by the municipality as the Índice de Ciudad Deseada and its companion Índice de Priorización de Infraestructura—is a composite, district-level index that guides the allocation of Trust Fund resources across competing investment priorities. It serves three interconnected functions: providing an evidence-based methodology for ranking districts and projects; embedding climate-adaptation criteria—above all water—directly into municipal decision-making; and generating the quantitative evidence base that international climate financiers require when evaluating project proposals. The index is built and maintained by the municipal public-policy laboratory (Laboratorio de Políticas Públicas) and is designed to be recomputed annually as the underlying geospatial datasets improve.</w:t>
       </w:r>
     </w:p>
     <w:p>
       <w:pPr>
         <w:pStyle w:val="Heading2"/>
-        <w:spacing w:before="360" w:after="200"/>
-      </w:pPr>
-      <w:r>
-        <w:rPr>
-          <w:rFonts w:ascii="Times New Roman" w:cs="Times New Roman" w:eastAsia="Times New Roman" w:hAnsi="Times New Roman"/>
-        </w:rPr>
-        <w:t xml:space="preserve">6.2 Index Structure and Indicators</w:t>
-      </w:r>
-    </w:p>
-    <w:p>
-      <w:pPr>
-        <w:spacing w:after="200" w:line="360"/>
-        <w:jc w:val="both"/>
-      </w:pPr>
-      <w:r>
-        <w:rPr>
-          <w:rFonts w:ascii="Times New Roman" w:cs="Times New Roman" w:eastAsia="Times New Roman" w:hAnsi="Times New Roman"/>
-          <w:sz w:val="24"/>
-          <w:szCs w:val="24"/>
-        </w:rPr>
-        <w:t xml:space="preserve">The SUPI is organized into four dimensions, each containing six indicators. The Water Security dimension encompasses indicators measuring aquifer recharge protection, water distribution efficiency, per-capita water consumption trends, rainwater harvesting adoption, greywater recycling capacity, and drought resilience. The Compact Development dimension includes urban density, vacant land ratios, agricultural land conversion rates, average commute distance, infrastructure cost per dwelling unit, and impervious surface coverage.</w:t>
-      </w:r>
-    </w:p>
-    <w:p>
-      <w:pPr>
-        <w:spacing w:after="200" w:line="360"/>
-        <w:jc w:val="both"/>
-      </w:pPr>
-      <w:r>
-        <w:rPr>
-          <w:rFonts w:ascii="Times New Roman" w:cs="Times New Roman" w:eastAsia="Times New Roman" w:hAnsi="Times New Roman"/>
-          <w:sz w:val="24"/>
-          <w:szCs w:val="24"/>
-        </w:rPr>
-        <w:t xml:space="preserve">The Ecosystem Services dimension encompasses permeable surface ratios, urban tree canopy coverage, riparian buffer integrity, soil organic carbon, biodiversity index scores, and urban heat island intensity. The Institutional Capacity dimension includes municipal own-source revenue growth, project completion rates, stakeholder engagement levels, data quality for decision-making, inter-jurisdictional coordination, and adaptation plan implementation progress.</w:t>
-      </w:r>
-    </w:p>
-    <w:p>
-      <w:pPr>
-        <w:pStyle w:val="Heading2"/>
-        <w:spacing w:before="360" w:after="200"/>
-      </w:pPr>
-      <w:r>
-        <w:rPr>
-          <w:rFonts w:ascii="Times New Roman" w:cs="Times New Roman" w:eastAsia="Times New Roman" w:hAnsi="Times New Roman"/>
-        </w:rPr>
-        <w:t xml:space="preserve">6.3 Weighting and Scoring</w:t>
-      </w:r>
-    </w:p>
-    <w:p>
-      <w:pPr>
-        <w:spacing w:after="200" w:line="360"/>
-        <w:jc w:val="both"/>
-      </w:pPr>
-      <w:r>
-        <w:rPr>
-          <w:rFonts w:ascii="Times New Roman" w:cs="Times New Roman" w:eastAsia="Times New Roman" w:hAnsi="Times New Roman"/>
-          <w:sz w:val="24"/>
-          <w:szCs w:val="24"/>
-        </w:rPr>
-        <w:t xml:space="preserve">Indicator weights were assigned through an analytic hierarchy process (AHP). The Water Security dimension received the highest aggregate weight (35 percent), reflecting the centrality of water stress. Compact Development received 25 percent, Ecosystem Services 22 percent, and Institutional Capacity 18 percent. Each indicator is scored on a normalized 0–100 scale with defined rubrics, recalculated annually.</w:t>
+      </w:pPr>
+      <w:r>
+        <w:t>6.2 Index Structure and Indicators</w:t>
+      </w:r>
+    </w:p>
+    <w:p>
+      <w:r>
+        <w:t>The index is organised into six dimensions (subindices), each measured by a set of indicators scored against defined desired values. Green space and biodiversity captures public green-space provision, its accessibility (population within a five-minute walk), and square metres of green space per inhabitant. Mobility and services measures proximity to public transport—bus stops and the Metrotranvía—and to the cycle network, alongside the share of pedestrian-priority streets. Compactness and functionality covers dwelling and population density, street-network permeability, the share of unoccupied dwellings, and air quality. Accessibility to community services measures walking proximity to education, health, sport, culture, and basic neighbourhood retail. Equity and community draws on census data for overcrowding, housing quality, educational attainment, and health coverage. Basic infrastructure—the dimension tied most directly to the water-stress framing—captures water demand (demanda hídrica), connectivity to basic networks, proximity to recycling and green points, and the energy consumption and self-generation of public spaces.</w:t>
+      </w:r>
+    </w:p>
+    <w:p>
+      <w:r>
+        <w:t>Two features make the index particularly suited to a water-stressed, climate-adaptation context. First, water enters the index through three distinct channels: as green infrastructure (climate refuges and urban-heat-island mitigation), as the basic-infrastructure water-demand indicator, and indirectly through compactness, which lowers per-capita network and irrigation demand. Second, the index is explicitly spatial: every indicator is computed per district, so the framework identifies not only what is deficient but where—exactly the information an allocation rule and an external financier require.</w:t>
       </w:r>
     </w:p>
     <w:tbl>
       <w:tblPr>
-        <w:tblW w:type="dxa" w:w="9360"/>
-        <w:tblBorders>
-          <w:top w:val="single" w:color="auto" w:sz="4"/>
-          <w:left w:val="single" w:color="auto" w:sz="4"/>
-          <w:bottom w:val="single" w:color="auto" w:sz="4"/>
-          <w:right w:val="single" w:color="auto" w:sz="4"/>
-          <w:insideH w:val="single" w:color="auto" w:sz="4"/>
-          <w:insideV w:val="single" w:color="auto" w:sz="4"/>
-        </w:tblBorders>
+        <w:tblW w:type="auto" w:w="0"/>
+        <w:tblLook w:firstColumn="1" w:firstRow="1" w:lastColumn="0" w:lastRow="0" w:noHBand="0" w:noVBand="1" w:val="04A0"/>
       </w:tblPr>
       <w:tblGrid>
-        <w:gridCol w:w="2200"/>
-        <w:gridCol w:w="4360"/>
-        <w:gridCol w:w="1400"/>
-        <w:gridCol w:w="1400"/>
+        <w:gridCol w:w="3120"/>
+        <w:gridCol w:w="3120"/>
+        <w:gridCol w:w="3120"/>
       </w:tblGrid>
       <w:tr>
         <w:tc>
           <w:tcPr>
-            <w:tcW w:type="dxa" w:w="2200"/>
-            <w:tcBorders>
-              <w:top w:val="single" w:color="999999" w:sz="1"/>
-              <w:left w:val="single" w:color="999999" w:sz="1"/>
-              <w:bottom w:val="single" w:color="999999" w:sz="1"/>
-              <w:right w:val="single" w:color="999999" w:sz="1"/>
-            </w:tcBorders>
-            <w:shd w:fill="D9E2F3" w:val="clear"/>
-            <w:tcMar>
-              <w:top w:type="dxa" w:w="60"/>
-              <w:left w:type="dxa" w:w="100"/>
-              <w:bottom w:type="dxa" w:w="60"/>
-              <w:right w:type="dxa" w:w="100"/>
-            </w:tcMar>
-          </w:tcPr>
-          <w:p>
-            <w:pPr>
-              <w:jc w:val="center"/>
-            </w:pPr>
-            <w:r>
-              <w:rPr>
-                <w:rFonts w:ascii="Times New Roman" w:cs="Times New Roman" w:eastAsia="Times New Roman" w:hAnsi="Times New Roman"/>
+            <w:tcW w:type="dxa" w:w="3120"/>
+          </w:tcPr>
+          <w:p>
+            <w:r/>
+            <w:r>
+              <w:rPr>
                 <w:b/>
-                <w:bCs/>
-                <w:sz w:val="24"/>
-                <w:szCs w:val="24"/>
-              </w:rPr>
-              <w:t xml:space="preserve">Dimension</w:t>
-            </w:r>
-          </w:p>
-        </w:tc>
-        <w:tc>
-          <w:tcPr>
-            <w:tcW w:type="dxa" w:w="4360"/>
-            <w:tcBorders>
-              <w:top w:val="single" w:color="999999" w:sz="1"/>
-              <w:left w:val="single" w:color="999999" w:sz="1"/>
-              <w:bottom w:val="single" w:color="999999" w:sz="1"/>
-              <w:right w:val="single" w:color="999999" w:sz="1"/>
-            </w:tcBorders>
-            <w:shd w:fill="D9E2F3" w:val="clear"/>
-            <w:tcMar>
-              <w:top w:type="dxa" w:w="60"/>
-              <w:left w:type="dxa" w:w="100"/>
-              <w:bottom w:type="dxa" w:w="60"/>
-              <w:right w:type="dxa" w:w="100"/>
-            </w:tcMar>
-          </w:tcPr>
-          <w:p>
-            <w:pPr>
-              <w:jc w:val="center"/>
-            </w:pPr>
-            <w:r>
-              <w:rPr>
-                <w:rFonts w:ascii="Times New Roman" w:cs="Times New Roman" w:eastAsia="Times New Roman" w:hAnsi="Times New Roman"/>
+              </w:rPr>
+              <w:t>Dimension (subindex)</w:t>
+            </w:r>
+          </w:p>
+        </w:tc>
+        <w:tc>
+          <w:tcPr>
+            <w:tcW w:type="dxa" w:w="3120"/>
+          </w:tcPr>
+          <w:p>
+            <w:r/>
+            <w:r>
+              <w:rPr>
                 <w:b/>
-                <w:bCs/>
-                <w:sz w:val="24"/>
-                <w:szCs w:val="24"/>
-              </w:rPr>
-              <w:t xml:space="preserve">Sample Indicators</w:t>
-            </w:r>
-          </w:p>
-        </w:tc>
-        <w:tc>
-          <w:tcPr>
-            <w:tcW w:type="dxa" w:w="1400"/>
-            <w:tcBorders>
-              <w:top w:val="single" w:color="999999" w:sz="1"/>
-              <w:left w:val="single" w:color="999999" w:sz="1"/>
-              <w:bottom w:val="single" w:color="999999" w:sz="1"/>
-              <w:right w:val="single" w:color="999999" w:sz="1"/>
-            </w:tcBorders>
-            <w:shd w:fill="D9E2F3" w:val="clear"/>
-            <w:tcMar>
-              <w:top w:type="dxa" w:w="60"/>
-              <w:left w:type="dxa" w:w="100"/>
-              <w:bottom w:type="dxa" w:w="60"/>
-              <w:right w:type="dxa" w:w="100"/>
-            </w:tcMar>
-          </w:tcPr>
-          <w:p>
-            <w:pPr>
-              <w:jc w:val="center"/>
-            </w:pPr>
-            <w:r>
-              <w:rPr>
-                <w:rFonts w:ascii="Times New Roman" w:cs="Times New Roman" w:eastAsia="Times New Roman" w:hAnsi="Times New Roman"/>
+              </w:rPr>
+              <w:t>Sample indicators</w:t>
+            </w:r>
+          </w:p>
+        </w:tc>
+        <w:tc>
+          <w:tcPr>
+            <w:tcW w:type="dxa" w:w="3120"/>
+          </w:tcPr>
+          <w:p>
+            <w:r/>
+            <w:r>
+              <w:rPr>
                 <w:b/>
-                <w:bCs/>
-                <w:sz w:val="24"/>
-                <w:szCs w:val="24"/>
-              </w:rPr>
-              <w:t xml:space="preserve">Weight</w:t>
-            </w:r>
-          </w:p>
-        </w:tc>
-        <w:tc>
-          <w:tcPr>
-            <w:tcW w:type="dxa" w:w="1400"/>
-            <w:tcBorders>
-              <w:top w:val="single" w:color="999999" w:sz="1"/>
-              <w:left w:val="single" w:color="999999" w:sz="1"/>
-              <w:bottom w:val="single" w:color="999999" w:sz="1"/>
-              <w:right w:val="single" w:color="999999" w:sz="1"/>
-            </w:tcBorders>
-            <w:shd w:fill="D9E2F3" w:val="clear"/>
-            <w:tcMar>
-              <w:top w:type="dxa" w:w="60"/>
-              <w:left w:type="dxa" w:w="100"/>
-              <w:bottom w:type="dxa" w:w="60"/>
-              <w:right w:type="dxa" w:w="100"/>
-            </w:tcMar>
-          </w:tcPr>
-          <w:p>
-            <w:pPr>
-              <w:jc w:val="center"/>
-            </w:pPr>
-            <w:r>
-              <w:rPr>
-                <w:rFonts w:ascii="Times New Roman" w:cs="Times New Roman" w:eastAsia="Times New Roman" w:hAnsi="Times New Roman"/>
-                <w:b/>
-                <w:bCs/>
-                <w:sz w:val="24"/>
-                <w:szCs w:val="24"/>
-              </w:rPr>
-              <w:t xml:space="preserve">Indicators</w:t>
+              </w:rPr>
+              <w:t>Climate / water relevance</w:t>
             </w:r>
           </w:p>
         </w:tc>
@@ -2567,125 +2404,34 @@
       <w:tr>
         <w:tc>
           <w:tcPr>
-            <w:tcW w:type="dxa" w:w="2200"/>
-            <w:tcBorders>
-              <w:top w:val="single" w:color="999999" w:sz="1"/>
-              <w:left w:val="single" w:color="999999" w:sz="1"/>
-              <w:bottom w:val="single" w:color="999999" w:sz="1"/>
-              <w:right w:val="single" w:color="999999" w:sz="1"/>
-            </w:tcBorders>
-            <w:tcMar>
-              <w:top w:type="dxa" w:w="60"/>
-              <w:left w:type="dxa" w:w="100"/>
-              <w:bottom w:type="dxa" w:w="60"/>
-              <w:right w:type="dxa" w:w="100"/>
-            </w:tcMar>
-          </w:tcPr>
-          <w:p>
-            <w:pPr>
-              <w:spacing w:after="40"/>
-              <w:jc w:val="left"/>
-            </w:pPr>
-            <w:r>
-              <w:rPr>
-                <w:rFonts w:ascii="Times New Roman" w:cs="Times New Roman" w:eastAsia="Times New Roman" w:hAnsi="Times New Roman"/>
-                <w:sz w:val="24"/>
-                <w:szCs w:val="24"/>
-              </w:rPr>
-              <w:t xml:space="preserve">Water Security</w:t>
-            </w:r>
-          </w:p>
-        </w:tc>
-        <w:tc>
-          <w:tcPr>
-            <w:tcW w:type="dxa" w:w="4360"/>
-            <w:tcBorders>
-              <w:top w:val="single" w:color="999999" w:sz="1"/>
-              <w:left w:val="single" w:color="999999" w:sz="1"/>
-              <w:bottom w:val="single" w:color="999999" w:sz="1"/>
-              <w:right w:val="single" w:color="999999" w:sz="1"/>
-            </w:tcBorders>
-            <w:tcMar>
-              <w:top w:type="dxa" w:w="60"/>
-              <w:left w:type="dxa" w:w="100"/>
-              <w:bottom w:type="dxa" w:w="60"/>
-              <w:right w:type="dxa" w:w="100"/>
-            </w:tcMar>
-          </w:tcPr>
-          <w:p>
-            <w:pPr>
-              <w:spacing w:after="40"/>
-              <w:jc w:val="left"/>
-            </w:pPr>
-            <w:r>
-              <w:rPr>
-                <w:rFonts w:ascii="Times New Roman" w:cs="Times New Roman" w:eastAsia="Times New Roman" w:hAnsi="Times New Roman"/>
-                <w:sz w:val="24"/>
-                <w:szCs w:val="24"/>
-              </w:rPr>
-              <w:t xml:space="preserve">Aquifer recharge, distribution efficiency, per-capita consumption, drought resilience</w:t>
-            </w:r>
-          </w:p>
-        </w:tc>
-        <w:tc>
-          <w:tcPr>
-            <w:tcW w:type="dxa" w:w="1400"/>
-            <w:tcBorders>
-              <w:top w:val="single" w:color="999999" w:sz="1"/>
-              <w:left w:val="single" w:color="999999" w:sz="1"/>
-              <w:bottom w:val="single" w:color="999999" w:sz="1"/>
-              <w:right w:val="single" w:color="999999" w:sz="1"/>
-            </w:tcBorders>
-            <w:tcMar>
-              <w:top w:type="dxa" w:w="60"/>
-              <w:left w:type="dxa" w:w="100"/>
-              <w:bottom w:type="dxa" w:w="60"/>
-              <w:right w:type="dxa" w:w="100"/>
-            </w:tcMar>
-          </w:tcPr>
-          <w:p>
-            <w:pPr>
-              <w:spacing w:after="40"/>
-              <w:jc w:val="center"/>
-            </w:pPr>
-            <w:r>
-              <w:rPr>
-                <w:rFonts w:ascii="Times New Roman" w:cs="Times New Roman" w:eastAsia="Times New Roman" w:hAnsi="Times New Roman"/>
-                <w:sz w:val="24"/>
-                <w:szCs w:val="24"/>
-              </w:rPr>
-              <w:t xml:space="preserve">35%</w:t>
-            </w:r>
-          </w:p>
-        </w:tc>
-        <w:tc>
-          <w:tcPr>
-            <w:tcW w:type="dxa" w:w="1400"/>
-            <w:tcBorders>
-              <w:top w:val="single" w:color="999999" w:sz="1"/>
-              <w:left w:val="single" w:color="999999" w:sz="1"/>
-              <w:bottom w:val="single" w:color="999999" w:sz="1"/>
-              <w:right w:val="single" w:color="999999" w:sz="1"/>
-            </w:tcBorders>
-            <w:tcMar>
-              <w:top w:type="dxa" w:w="60"/>
-              <w:left w:type="dxa" w:w="100"/>
-              <w:bottom w:type="dxa" w:w="60"/>
-              <w:right w:type="dxa" w:w="100"/>
-            </w:tcMar>
-          </w:tcPr>
-          <w:p>
-            <w:pPr>
-              <w:spacing w:after="40"/>
-              <w:jc w:val="center"/>
-            </w:pPr>
-            <w:r>
-              <w:rPr>
-                <w:rFonts w:ascii="Times New Roman" w:cs="Times New Roman" w:eastAsia="Times New Roman" w:hAnsi="Times New Roman"/>
-                <w:sz w:val="24"/>
-                <w:szCs w:val="24"/>
-              </w:rPr>
-              <w:t xml:space="preserve">6</w:t>
+            <w:tcW w:type="dxa" w:w="3120"/>
+          </w:tcPr>
+          <w:p>
+            <w:r/>
+            <w:r>
+              <w:t>Green space &amp; biodiversity</w:t>
+            </w:r>
+          </w:p>
+        </w:tc>
+        <w:tc>
+          <w:tcPr>
+            <w:tcW w:type="dxa" w:w="3120"/>
+          </w:tcPr>
+          <w:p>
+            <w:r/>
+            <w:r>
+              <w:t>Public green-space %, proximity (5-min walk), m²/inhabitant</w:t>
+            </w:r>
+          </w:p>
+        </w:tc>
+        <w:tc>
+          <w:tcPr>
+            <w:tcW w:type="dxa" w:w="3120"/>
+          </w:tcPr>
+          <w:p>
+            <w:r/>
+            <w:r>
+              <w:t>Heat-island mitigation; climate refuges</w:t>
             </w:r>
           </w:p>
         </w:tc>
@@ -2693,125 +2439,34 @@
       <w:tr>
         <w:tc>
           <w:tcPr>
-            <w:tcW w:type="dxa" w:w="2200"/>
-            <w:tcBorders>
-              <w:top w:val="single" w:color="999999" w:sz="1"/>
-              <w:left w:val="single" w:color="999999" w:sz="1"/>
-              <w:bottom w:val="single" w:color="999999" w:sz="1"/>
-              <w:right w:val="single" w:color="999999" w:sz="1"/>
-            </w:tcBorders>
-            <w:tcMar>
-              <w:top w:type="dxa" w:w="60"/>
-              <w:left w:type="dxa" w:w="100"/>
-              <w:bottom w:type="dxa" w:w="60"/>
-              <w:right w:type="dxa" w:w="100"/>
-            </w:tcMar>
-          </w:tcPr>
-          <w:p>
-            <w:pPr>
-              <w:spacing w:after="40"/>
-              <w:jc w:val="left"/>
-            </w:pPr>
-            <w:r>
-              <w:rPr>
-                <w:rFonts w:ascii="Times New Roman" w:cs="Times New Roman" w:eastAsia="Times New Roman" w:hAnsi="Times New Roman"/>
-                <w:sz w:val="24"/>
-                <w:szCs w:val="24"/>
-              </w:rPr>
-              <w:t xml:space="preserve">Compact Development</w:t>
-            </w:r>
-          </w:p>
-        </w:tc>
-        <w:tc>
-          <w:tcPr>
-            <w:tcW w:type="dxa" w:w="4360"/>
-            <w:tcBorders>
-              <w:top w:val="single" w:color="999999" w:sz="1"/>
-              <w:left w:val="single" w:color="999999" w:sz="1"/>
-              <w:bottom w:val="single" w:color="999999" w:sz="1"/>
-              <w:right w:val="single" w:color="999999" w:sz="1"/>
-            </w:tcBorders>
-            <w:tcMar>
-              <w:top w:type="dxa" w:w="60"/>
-              <w:left w:type="dxa" w:w="100"/>
-              <w:bottom w:type="dxa" w:w="60"/>
-              <w:right w:type="dxa" w:w="100"/>
-            </w:tcMar>
-          </w:tcPr>
-          <w:p>
-            <w:pPr>
-              <w:spacing w:after="40"/>
-              <w:jc w:val="left"/>
-            </w:pPr>
-            <w:r>
-              <w:rPr>
-                <w:rFonts w:ascii="Times New Roman" w:cs="Times New Roman" w:eastAsia="Times New Roman" w:hAnsi="Times New Roman"/>
-                <w:sz w:val="24"/>
-                <w:szCs w:val="24"/>
-              </w:rPr>
-              <w:t xml:space="preserve">Urban density, vacant land ratio, conversion rate, infrastructure cost per dwelling</w:t>
-            </w:r>
-          </w:p>
-        </w:tc>
-        <w:tc>
-          <w:tcPr>
-            <w:tcW w:type="dxa" w:w="1400"/>
-            <w:tcBorders>
-              <w:top w:val="single" w:color="999999" w:sz="1"/>
-              <w:left w:val="single" w:color="999999" w:sz="1"/>
-              <w:bottom w:val="single" w:color="999999" w:sz="1"/>
-              <w:right w:val="single" w:color="999999" w:sz="1"/>
-            </w:tcBorders>
-            <w:tcMar>
-              <w:top w:type="dxa" w:w="60"/>
-              <w:left w:type="dxa" w:w="100"/>
-              <w:bottom w:type="dxa" w:w="60"/>
-              <w:right w:type="dxa" w:w="100"/>
-            </w:tcMar>
-          </w:tcPr>
-          <w:p>
-            <w:pPr>
-              <w:spacing w:after="40"/>
-              <w:jc w:val="center"/>
-            </w:pPr>
-            <w:r>
-              <w:rPr>
-                <w:rFonts w:ascii="Times New Roman" w:cs="Times New Roman" w:eastAsia="Times New Roman" w:hAnsi="Times New Roman"/>
-                <w:sz w:val="24"/>
-                <w:szCs w:val="24"/>
-              </w:rPr>
-              <w:t xml:space="preserve">25%</w:t>
-            </w:r>
-          </w:p>
-        </w:tc>
-        <w:tc>
-          <w:tcPr>
-            <w:tcW w:type="dxa" w:w="1400"/>
-            <w:tcBorders>
-              <w:top w:val="single" w:color="999999" w:sz="1"/>
-              <w:left w:val="single" w:color="999999" w:sz="1"/>
-              <w:bottom w:val="single" w:color="999999" w:sz="1"/>
-              <w:right w:val="single" w:color="999999" w:sz="1"/>
-            </w:tcBorders>
-            <w:tcMar>
-              <w:top w:type="dxa" w:w="60"/>
-              <w:left w:type="dxa" w:w="100"/>
-              <w:bottom w:type="dxa" w:w="60"/>
-              <w:right w:type="dxa" w:w="100"/>
-            </w:tcMar>
-          </w:tcPr>
-          <w:p>
-            <w:pPr>
-              <w:spacing w:after="40"/>
-              <w:jc w:val="center"/>
-            </w:pPr>
-            <w:r>
-              <w:rPr>
-                <w:rFonts w:ascii="Times New Roman" w:cs="Times New Roman" w:eastAsia="Times New Roman" w:hAnsi="Times New Roman"/>
-                <w:sz w:val="24"/>
-                <w:szCs w:val="24"/>
-              </w:rPr>
-              <w:t xml:space="preserve">6</w:t>
+            <w:tcW w:type="dxa" w:w="3120"/>
+          </w:tcPr>
+          <w:p>
+            <w:r/>
+            <w:r>
+              <w:t>Mobility &amp; services</w:t>
+            </w:r>
+          </w:p>
+        </w:tc>
+        <w:tc>
+          <w:tcPr>
+            <w:tcW w:type="dxa" w:w="3120"/>
+          </w:tcPr>
+          <w:p>
+            <w:r/>
+            <w:r>
+              <w:t>Proximity to transit (bus, Metrotranvía); cycle-network proximity; pedestrian streets</w:t>
+            </w:r>
+          </w:p>
+        </w:tc>
+        <w:tc>
+          <w:tcPr>
+            <w:tcW w:type="dxa" w:w="3120"/>
+          </w:tcPr>
+          <w:p>
+            <w:r/>
+            <w:r>
+              <w:t>Low-carbon mobility; reduced emissions</w:t>
             </w:r>
           </w:p>
         </w:tc>
@@ -2819,125 +2474,34 @@
       <w:tr>
         <w:tc>
           <w:tcPr>
-            <w:tcW w:type="dxa" w:w="2200"/>
-            <w:tcBorders>
-              <w:top w:val="single" w:color="999999" w:sz="1"/>
-              <w:left w:val="single" w:color="999999" w:sz="1"/>
-              <w:bottom w:val="single" w:color="999999" w:sz="1"/>
-              <w:right w:val="single" w:color="999999" w:sz="1"/>
-            </w:tcBorders>
-            <w:tcMar>
-              <w:top w:type="dxa" w:w="60"/>
-              <w:left w:type="dxa" w:w="100"/>
-              <w:bottom w:type="dxa" w:w="60"/>
-              <w:right w:type="dxa" w:w="100"/>
-            </w:tcMar>
-          </w:tcPr>
-          <w:p>
-            <w:pPr>
-              <w:spacing w:after="40"/>
-              <w:jc w:val="left"/>
-            </w:pPr>
-            <w:r>
-              <w:rPr>
-                <w:rFonts w:ascii="Times New Roman" w:cs="Times New Roman" w:eastAsia="Times New Roman" w:hAnsi="Times New Roman"/>
-                <w:sz w:val="24"/>
-                <w:szCs w:val="24"/>
-              </w:rPr>
-              <w:t xml:space="preserve">Ecosystem Services</w:t>
-            </w:r>
-          </w:p>
-        </w:tc>
-        <w:tc>
-          <w:tcPr>
-            <w:tcW w:type="dxa" w:w="4360"/>
-            <w:tcBorders>
-              <w:top w:val="single" w:color="999999" w:sz="1"/>
-              <w:left w:val="single" w:color="999999" w:sz="1"/>
-              <w:bottom w:val="single" w:color="999999" w:sz="1"/>
-              <w:right w:val="single" w:color="999999" w:sz="1"/>
-            </w:tcBorders>
-            <w:tcMar>
-              <w:top w:type="dxa" w:w="60"/>
-              <w:left w:type="dxa" w:w="100"/>
-              <w:bottom w:type="dxa" w:w="60"/>
-              <w:right w:type="dxa" w:w="100"/>
-            </w:tcMar>
-          </w:tcPr>
-          <w:p>
-            <w:pPr>
-              <w:spacing w:after="40"/>
-              <w:jc w:val="left"/>
-            </w:pPr>
-            <w:r>
-              <w:rPr>
-                <w:rFonts w:ascii="Times New Roman" w:cs="Times New Roman" w:eastAsia="Times New Roman" w:hAnsi="Times New Roman"/>
-                <w:sz w:val="24"/>
-                <w:szCs w:val="24"/>
-              </w:rPr>
-              <w:t xml:space="preserve">Permeable surface, tree canopy, riparian buffer, urban heat island</w:t>
-            </w:r>
-          </w:p>
-        </w:tc>
-        <w:tc>
-          <w:tcPr>
-            <w:tcW w:type="dxa" w:w="1400"/>
-            <w:tcBorders>
-              <w:top w:val="single" w:color="999999" w:sz="1"/>
-              <w:left w:val="single" w:color="999999" w:sz="1"/>
-              <w:bottom w:val="single" w:color="999999" w:sz="1"/>
-              <w:right w:val="single" w:color="999999" w:sz="1"/>
-            </w:tcBorders>
-            <w:tcMar>
-              <w:top w:type="dxa" w:w="60"/>
-              <w:left w:type="dxa" w:w="100"/>
-              <w:bottom w:type="dxa" w:w="60"/>
-              <w:right w:type="dxa" w:w="100"/>
-            </w:tcMar>
-          </w:tcPr>
-          <w:p>
-            <w:pPr>
-              <w:spacing w:after="40"/>
-              <w:jc w:val="center"/>
-            </w:pPr>
-            <w:r>
-              <w:rPr>
-                <w:rFonts w:ascii="Times New Roman" w:cs="Times New Roman" w:eastAsia="Times New Roman" w:hAnsi="Times New Roman"/>
-                <w:sz w:val="24"/>
-                <w:szCs w:val="24"/>
-              </w:rPr>
-              <w:t xml:space="preserve">22%</w:t>
-            </w:r>
-          </w:p>
-        </w:tc>
-        <w:tc>
-          <w:tcPr>
-            <w:tcW w:type="dxa" w:w="1400"/>
-            <w:tcBorders>
-              <w:top w:val="single" w:color="999999" w:sz="1"/>
-              <w:left w:val="single" w:color="999999" w:sz="1"/>
-              <w:bottom w:val="single" w:color="999999" w:sz="1"/>
-              <w:right w:val="single" w:color="999999" w:sz="1"/>
-            </w:tcBorders>
-            <w:tcMar>
-              <w:top w:type="dxa" w:w="60"/>
-              <w:left w:type="dxa" w:w="100"/>
-              <w:bottom w:type="dxa" w:w="60"/>
-              <w:right w:type="dxa" w:w="100"/>
-            </w:tcMar>
-          </w:tcPr>
-          <w:p>
-            <w:pPr>
-              <w:spacing w:after="40"/>
-              <w:jc w:val="center"/>
-            </w:pPr>
-            <w:r>
-              <w:rPr>
-                <w:rFonts w:ascii="Times New Roman" w:cs="Times New Roman" w:eastAsia="Times New Roman" w:hAnsi="Times New Roman"/>
-                <w:sz w:val="24"/>
-                <w:szCs w:val="24"/>
-              </w:rPr>
-              <w:t xml:space="preserve">6</w:t>
+            <w:tcW w:type="dxa" w:w="3120"/>
+          </w:tcPr>
+          <w:p>
+            <w:r/>
+            <w:r>
+              <w:t>Compactness &amp; functionality</w:t>
+            </w:r>
+          </w:p>
+        </w:tc>
+        <w:tc>
+          <w:tcPr>
+            <w:tcW w:type="dxa" w:w="3120"/>
+          </w:tcPr>
+          <w:p>
+            <w:r/>
+            <w:r>
+              <w:t>Dwelling/population density, street permeability, vacant dwellings, air quality</w:t>
+            </w:r>
+          </w:p>
+        </w:tc>
+        <w:tc>
+          <w:tcPr>
+            <w:tcW w:type="dxa" w:w="3120"/>
+          </w:tcPr>
+          <w:p>
+            <w:r/>
+            <w:r>
+              <w:t>Curbs sprawl and per-capita water/network demand</w:t>
             </w:r>
           </w:p>
         </w:tc>
@@ -2945,154 +2509,129 @@
       <w:tr>
         <w:tc>
           <w:tcPr>
-            <w:tcW w:type="dxa" w:w="2200"/>
-            <w:tcBorders>
-              <w:top w:val="single" w:color="999999" w:sz="1"/>
-              <w:left w:val="single" w:color="999999" w:sz="1"/>
-              <w:bottom w:val="single" w:color="999999" w:sz="1"/>
-              <w:right w:val="single" w:color="999999" w:sz="1"/>
-            </w:tcBorders>
-            <w:tcMar>
-              <w:top w:type="dxa" w:w="60"/>
-              <w:left w:type="dxa" w:w="100"/>
-              <w:bottom w:type="dxa" w:w="60"/>
-              <w:right w:type="dxa" w:w="100"/>
-            </w:tcMar>
-          </w:tcPr>
-          <w:p>
-            <w:pPr>
-              <w:spacing w:after="40"/>
-              <w:jc w:val="left"/>
-            </w:pPr>
-            <w:r>
-              <w:rPr>
-                <w:rFonts w:ascii="Times New Roman" w:cs="Times New Roman" w:eastAsia="Times New Roman" w:hAnsi="Times New Roman"/>
-                <w:sz w:val="24"/>
-                <w:szCs w:val="24"/>
-              </w:rPr>
-              <w:t xml:space="preserve">Institutional Capacity</w:t>
-            </w:r>
-          </w:p>
-        </w:tc>
-        <w:tc>
-          <w:tcPr>
-            <w:tcW w:type="dxa" w:w="4360"/>
-            <w:tcBorders>
-              <w:top w:val="single" w:color="999999" w:sz="1"/>
-              <w:left w:val="single" w:color="999999" w:sz="1"/>
-              <w:bottom w:val="single" w:color="999999" w:sz="1"/>
-              <w:right w:val="single" w:color="999999" w:sz="1"/>
-            </w:tcBorders>
-            <w:tcMar>
-              <w:top w:type="dxa" w:w="60"/>
-              <w:left w:type="dxa" w:w="100"/>
-              <w:bottom w:type="dxa" w:w="60"/>
-              <w:right w:type="dxa" w:w="100"/>
-            </w:tcMar>
-          </w:tcPr>
-          <w:p>
-            <w:pPr>
-              <w:spacing w:after="40"/>
-              <w:jc w:val="left"/>
-            </w:pPr>
-            <w:r>
-              <w:rPr>
-                <w:rFonts w:ascii="Times New Roman" w:cs="Times New Roman" w:eastAsia="Times New Roman" w:hAnsi="Times New Roman"/>
-                <w:sz w:val="24"/>
-                <w:szCs w:val="24"/>
-              </w:rPr>
-              <w:t xml:space="preserve">Revenue growth, project completion, stakeholder engagement, data quality</w:t>
-            </w:r>
-          </w:p>
-        </w:tc>
-        <w:tc>
-          <w:tcPr>
-            <w:tcW w:type="dxa" w:w="1400"/>
-            <w:tcBorders>
-              <w:top w:val="single" w:color="999999" w:sz="1"/>
-              <w:left w:val="single" w:color="999999" w:sz="1"/>
-              <w:bottom w:val="single" w:color="999999" w:sz="1"/>
-              <w:right w:val="single" w:color="999999" w:sz="1"/>
-            </w:tcBorders>
-            <w:tcMar>
-              <w:top w:type="dxa" w:w="60"/>
-              <w:left w:type="dxa" w:w="100"/>
-              <w:bottom w:type="dxa" w:w="60"/>
-              <w:right w:type="dxa" w:w="100"/>
-            </w:tcMar>
-          </w:tcPr>
-          <w:p>
-            <w:pPr>
-              <w:spacing w:after="40"/>
-              <w:jc w:val="center"/>
-            </w:pPr>
-            <w:r>
-              <w:rPr>
-                <w:rFonts w:ascii="Times New Roman" w:cs="Times New Roman" w:eastAsia="Times New Roman" w:hAnsi="Times New Roman"/>
-                <w:sz w:val="24"/>
-                <w:szCs w:val="24"/>
-              </w:rPr>
-              <w:t xml:space="preserve">18%</w:t>
-            </w:r>
-          </w:p>
-        </w:tc>
-        <w:tc>
-          <w:tcPr>
-            <w:tcW w:type="dxa" w:w="1400"/>
-            <w:tcBorders>
-              <w:top w:val="single" w:color="999999" w:sz="1"/>
-              <w:left w:val="single" w:color="999999" w:sz="1"/>
-              <w:bottom w:val="single" w:color="999999" w:sz="1"/>
-              <w:right w:val="single" w:color="999999" w:sz="1"/>
-            </w:tcBorders>
-            <w:tcMar>
-              <w:top w:type="dxa" w:w="60"/>
-              <w:left w:type="dxa" w:w="100"/>
-              <w:bottom w:type="dxa" w:w="60"/>
-              <w:right w:type="dxa" w:w="100"/>
-            </w:tcMar>
-          </w:tcPr>
-          <w:p>
-            <w:pPr>
-              <w:spacing w:after="40"/>
-              <w:jc w:val="center"/>
-            </w:pPr>
-            <w:r>
-              <w:rPr>
-                <w:rFonts w:ascii="Times New Roman" w:cs="Times New Roman" w:eastAsia="Times New Roman" w:hAnsi="Times New Roman"/>
-                <w:sz w:val="24"/>
-                <w:szCs w:val="24"/>
-              </w:rPr>
-              <w:t xml:space="preserve">6</w:t>
+            <w:tcW w:type="dxa" w:w="3120"/>
+          </w:tcPr>
+          <w:p>
+            <w:r/>
+            <w:r>
+              <w:t>Accessibility to community services</w:t>
+            </w:r>
+          </w:p>
+        </w:tc>
+        <w:tc>
+          <w:tcPr>
+            <w:tcW w:type="dxa" w:w="3120"/>
+          </w:tcPr>
+          <w:p>
+            <w:r/>
+            <w:r>
+              <w:t>Walking proximity to education, health, sport, culture, basic retail</w:t>
+            </w:r>
+          </w:p>
+        </w:tc>
+        <w:tc>
+          <w:tcPr>
+            <w:tcW w:type="dxa" w:w="3120"/>
+          </w:tcPr>
+          <w:p>
+            <w:r/>
+            <w:r>
+              <w:t>15-minute city; spatial equity</w:t>
+            </w:r>
+          </w:p>
+        </w:tc>
+      </w:tr>
+      <w:tr>
+        <w:tc>
+          <w:tcPr>
+            <w:tcW w:type="dxa" w:w="3120"/>
+          </w:tcPr>
+          <w:p>
+            <w:r/>
+            <w:r>
+              <w:t>Equity &amp; community</w:t>
+            </w:r>
+          </w:p>
+        </w:tc>
+        <w:tc>
+          <w:tcPr>
+            <w:tcW w:type="dxa" w:w="3120"/>
+          </w:tcPr>
+          <w:p>
+            <w:r/>
+            <w:r>
+              <w:t>Overcrowding, housing quality, educational attainment, health coverage</w:t>
+            </w:r>
+          </w:p>
+        </w:tc>
+        <w:tc>
+          <w:tcPr>
+            <w:tcW w:type="dxa" w:w="3120"/>
+          </w:tcPr>
+          <w:p>
+            <w:r/>
+            <w:r>
+              <w:t>Targets vulnerable households</w:t>
+            </w:r>
+          </w:p>
+        </w:tc>
+      </w:tr>
+      <w:tr>
+        <w:tc>
+          <w:tcPr>
+            <w:tcW w:type="dxa" w:w="3120"/>
+          </w:tcPr>
+          <w:p>
+            <w:r/>
+            <w:r>
+              <w:t>Basic infrastructure</w:t>
+            </w:r>
+          </w:p>
+        </w:tc>
+        <w:tc>
+          <w:tcPr>
+            <w:tcW w:type="dxa" w:w="3120"/>
+          </w:tcPr>
+          <w:p>
+            <w:r/>
+            <w:r>
+              <w:t>Water demand, basic-network connectivity, green/recycling points, public-space energy use &amp; self-generation</w:t>
+            </w:r>
+          </w:p>
+        </w:tc>
+        <w:tc>
+          <w:tcPr>
+            <w:tcW w:type="dxa" w:w="3120"/>
+          </w:tcPr>
+          <w:p>
+            <w:r/>
+            <w:r>
+              <w:t>Water security; resource efficiency</w:t>
             </w:r>
           </w:p>
         </w:tc>
       </w:tr>
     </w:tbl>
     <w:p>
-      <w:pPr>
-        <w:spacing w:after="200"/>
-      </w:pPr>
-    </w:p>
-    <w:p>
-      <w:pPr>
-        <w:spacing w:after="200" w:line="360"/>
-        <w:jc w:val="center"/>
-      </w:pPr>
-      <w:r>
-        <w:rPr>
-          <w:rFonts w:ascii="Times New Roman" w:cs="Times New Roman" w:eastAsia="Times New Roman" w:hAnsi="Times New Roman"/>
+      <w:r>
+        <w:rPr>
           <w:i/>
-          <w:iCs/>
-          <w:sz w:val="24"/>
-          <w:szCs w:val="24"/>
-        </w:rPr>
-        <w:t xml:space="preserve">Table 2: Sustainable Urbanism Priority Index dimensions, sample indicators, and weights.</w:t>
-      </w:r>
-    </w:p>
-    <w:p>
-      <w:r>
-        <w:br w:type="page"/>
+          <w:sz w:val="18"/>
+        </w:rPr>
+        <w:t>Table 2: The six dimensions of the priority index (Índice de Ciudad Deseada / Índice de Priorización de Infraestructura), with sample indicators and their climate–water relevance. Each indicator is scored per district on a five-level sufficiency scale (see §6.3). Source: Municipalidad de Luján de Cuyo, Laboratorio de Políticas Públicas.</w:t>
+      </w:r>
+    </w:p>
+    <w:p>
+      <w:pPr>
+        <w:pStyle w:val="Heading2"/>
+      </w:pPr>
+      <w:r>
+        <w:t>6.3 Scoring and Application</w:t>
+      </w:r>
+    </w:p>
+    <w:p>
+      <w:r>
+        <w:t>Rather than a single weighted average, the index scores each district on a five-level sufficiency scale, comparing its current value against the desired value for each indicator: A, outstanding (≥90%); B, very sufficient (70–89%); C, sufficient (50–69%); D, insufficient (25–49%); and E, very insufficient (&lt;25%). A lower score signals a higher investment priority—“a menor cobertura, mayor priorización.” Dimension scores combine into a district profile (a radar across the six axes) and a department-wide ranking, yielding two operational outputs: a diagnosis of which priority work each district most needs, and a ranking of which districts are furthest from the desired city. As of October 2025 the green-space-and-biodiversity subindex has been computed at district level; the remaining dimensions are being assembled as the municipal geospatial datasets are completed, and the composite weights across the six dimensions are still being finalised, so the framework currently reports dimension-level sufficiency rather than a single blended score. Section 7.5 uses the first computed subindex to test how well the 2026 investment programme aligns with the priorities the index reveals.</w:t>
       </w:r>
     </w:p>
     <w:p>
@@ -5562,7 +5101,7 @@
     </w:p>
     <w:p>
       <w:r>
-        <w:t>A revenue framework is only as good as the rule that allocates the proceeds. The priority index is explicitly designed to direct investment to “the zones that most require it,” scoring each district against desired values on a five-level sufficiency scale—A (≥90%, outstanding), B (70–89%), C (50–69%), D (25–49%, insufficient), and E (&lt;25%, very insufficient)—where a lower score signals a higher investment priority. A first subindex, Espacios Verdes y Biodiversidad (green space and biodiversity), was computed at district level as of October 2025, which lets us begin to test whether the 2026 works are going where the index says they are most needed. The remaining subindices—mobility and services, compactness and functionality, proximity to community services, equity and community, and basic/water infrastructure—are still being assembled, so the reading here is partial and should be revisited once the full index is computed.</w:t>
+        <w:t>A revenue framework is only as good as the rule that allocates the proceeds. The priority index is explicitly designed to direct investment to “the zones that most require it,” scoring each district against desired values on the five-level sufficiency scale of §6.3 (A, ≥90%, to E, &lt;25%), where a lower score signals a higher investment priority. A first subindex, Espacios Verdes y Biodiversidad (green space and biodiversity), was computed at district level as of October 2025, which lets us begin to test whether the 2026 works are going where the index says they are most needed. The remaining subindices—mobility and services, compactness and functionality, accessibility to community services, equity and community, and basic/water infrastructure—are still being assembled, so the reading here is partial and should be revisited once the full index is computed.</w:t>
       </w:r>
     </w:p>
     <w:p>
@@ -5811,7 +5350,7 @@
     </w:p>
     <w:p>
       <w:r>
-        <w:t>Mapping the 2026 works onto these districts reveals a partial misalignment (Table 10). The two largest place-based investments—the Ciudad de Luján centrality (ID 395, ARS 1.5 billion) and the La Carrodilla centrality (ID 773, ARS 1.5 billion)—fall in districts that already score A and B on green space; their justification is compactness, stormwater drainage, and value capture rather than green-space equity. Mayor Drummond, a level-D district, does receive a sidewalk upgrade (ID 452) and is a value-capture/densification target, which aligns. But the highest-priority green-space districts—Vistalba, Las Compuertas, and Industrial—receive no dedicated 2026 green investment. The decisive instrument is the microplazas programme (ID 865, ARS 1.2 billion, roughly twenty squares): as the single largest green item and a department-wide line, its allocation determines alignment. Directing those squares to the level-D and level-E districts would turn a latent misalignment into a close fit between the index and the investment.</w:t>
+        <w:t>Mapping the 2026 works onto these districts reveals a partial misalignment (Table 10 and Figure 1). The two largest place-based investments—the Ciudad de Luján centrality (ID 395, ARS 1.5 billion) and the La Carrodilla centrality (ID 773, ARS 1.5 billion)—fall in districts that already score A and B on green space; their justification is compactness, stormwater drainage, and value capture rather than green-space equity. Mayor Drummond, a level-D district, does receive a sidewalk upgrade (ID 452) and is a value-capture/densification target, which aligns. But the highest-priority green-space districts—Vistalba, Las Compuertas, and Industrial—receive no dedicated 2026 green investment. The decisive instrument is the microplazas programme (ID 865, ARS 1.2 billion, roughly twenty squares): as the single largest green item and a department-wide line, its allocation determines alignment. Directing those squares to the level-D and level-E districts would turn a latent misalignment into a close fit between the index and the investment.</w:t>
       </w:r>
     </w:p>
     <w:tbl>
@@ -6213,6 +5752,51 @@
           <w:sz w:val="18"/>
         </w:rPr>
         <w:t>Table 10: 2026 works mapped to district-level green-space priority. “Alignment” asks whether the work is located where the green-space subindex signals the greatest need.</w:t>
+      </w:r>
+    </w:p>
+    <w:p>
+      <w:r>
+        <w:drawing>
+          <wp:inline xmlns:a="http://schemas.openxmlformats.org/drawingml/2006/main" xmlns:pic="http://schemas.openxmlformats.org/drawingml/2006/picture">
+            <wp:extent cx="5760720" cy="3629254"/>
+            <wp:docPr id="1" name="Picture 1"/>
+            <wp:cNvGraphicFramePr>
+              <a:graphicFrameLocks noChangeAspect="1"/>
+            </wp:cNvGraphicFramePr>
+            <a:graphic>
+              <a:graphicData uri="http://schemas.openxmlformats.org/drawingml/2006/picture">
+                <pic:pic>
+                  <pic:nvPicPr>
+                    <pic:cNvPr id="0" name="fig_alignment_works_vs_priority.png"/>
+                    <pic:cNvPicPr/>
+                  </pic:nvPicPr>
+                  <pic:blipFill>
+                    <a:blip r:embed="rId9"/>
+                    <a:stretch>
+                      <a:fillRect/>
+                    </a:stretch>
+                  </pic:blipFill>
+                  <pic:spPr>
+                    <a:xfrm>
+                      <a:off x="0" y="0"/>
+                      <a:ext cx="5760720" cy="3629254"/>
+                    </a:xfrm>
+                    <a:prstGeom prst="rect"/>
+                  </pic:spPr>
+                </pic:pic>
+              </a:graphicData>
+            </a:graphic>
+          </wp:inline>
+        </w:drawing>
+      </w:r>
+    </w:p>
+    <w:p>
+      <w:r>
+        <w:rPr>
+          <w:i/>
+          <w:sz w:val="18"/>
+        </w:rPr>
+        <w:t>Figure 1: Where green investment is needed versus where the 2026 works are located. Horizontal axis: district green-space sufficiency (A–E; lower = higher priority). Vertical axis: 2026 place-based public-space investment (ARS billion). Ciudad and Carrodilla concentrate investment in already well-served districts, while the highest-need districts (Vistalba, Las Compuertas, Industrial, Chacras de Coria, Agrelo) receive little or none; the department-wide microplazas line (ARS 1.2 B) is the lever that could close the gap. Source: authors, from the priority index (Oct 2025) and the 2026 Plan de Obras.</w:t>
       </w:r>
     </w:p>
     <w:p>

</xml_diff>

<commit_message>
Ground Suelo Creado/PVA in real COS 2026 buildability; expand Trust Fund / green-finance section
- Found the real COS 2026 buildability schedule (Tabla 10, zoning report
  2019-2026): base 10 m -> max 36 m (~8.7 extra floors via DCA/PVA), FOS 75-90%,
  7 zones / 4,491 ha, ceiling ~295.15 M m2. Table 7 replaced with this real
  schedule; pipeline now demand-constrained take-up (20/50/80k m2/yr).
- Updated value-capture and totals: Suelo Creado USD 0.09/0.57/1.89M; PVA
  0.06/0.38/1.36M; combined annual USD 1.82/3.04/5.62M; gap coverage ~5%/yr,
  green bond ~USD 9-12M.
- Expanded Section 5: 5.3 broadened and new 5.5 'The Trust Fund as a
  Matching-Funds and Repayment Vehicle' (Leverage Account counterpart funding,
  ring-fenced repayment security, GCF/bilateral access); real institutional
  names woven in (BMTI, FEULDC, Fideicomiso de Administracion, Ord. 15081/15093).
- README updated.
</commit_message>
<xml_diff>
--- a/paper/LVC_Climate_Adaptation_Paper_revised_estimations.docx
+++ b/paper/LVC_Climate_Adaptation_Paper_revised_estimations.docx
@@ -183,7 +183,7 @@
           <w:sz w:val="24"/>
           <w:szCs w:val="24"/>
         </w:rPr>
-        <w:t>We analyze the design and coordination of six LVC instruments—betterment contributions, differential rent capture from rezoning, vacant land charges, development rights sales, tax incentives, and transferable development rights—examining their coordination and revenue potential. Two of these instruments—the vacant-land surcharge and, alongside them, a water-and-sewer development charge—are already operational and generating own-source revenue, while the value-capture instruments remain designed and their revenue is estimated ex ante from real municipal works-programme and land-value data. The paper documents the institutional architecture linking these instruments: a Trust Fund structure that pools dedicated revenue streams, creating matchable own-source resources that strengthen municipal capacity to access green bonds and international climate finance for bankable adaptation projects.</w:t>
+        <w:t>We analyze the design and coordination of six LVC instruments—betterment contributions, differential rent capture from rezoning, vacant land charges, development rights sales, tax incentives, and transferable development rights—examining their coordination and revenue potential. Two of these instruments—the vacant-land surcharge and, alongside them, a water-and-sewer development charge—are already operational and generating own-source revenue, while the value-capture instruments remain designed and their revenue is estimated ex ante from real municipal works-programme, zoning and land-value data. The paper documents the institutional architecture linking these instruments: a Trust Fund structure that pools dedicated revenue streams, creating matchable own-source resources that strengthen municipal capacity to access green bonds and international climate finance for bankable adaptation projects.</w:t>
       </w:r>
     </w:p>
     <w:p>
@@ -746,7 +746,7 @@
           <w:sz w:val="24"/>
           <w:szCs w:val="24"/>
         </w:rPr>
-        <w:t>The revenue figures presented in Section 7 rest on two distinct footings: realized collections from the municipality’s two operational land-based instruments (the water-and-sewer feasibility contribution and the vacant-land surcharge), drawn from municipal records and the 2026 tax roll; and ex-ante estimates for the designed value-capture instruments, obtained by applying the actual formulas of the draft Ordinance of Urban-Economy Instruments to real municipal parameters—the itemised 2026 public-works programme, the COS occupation coefficients, and the municipal land-value, built-value and fiscal-assessment maps—rather than to assumed transaction data, since these instruments are not yet sanctioned. The Sustainable Urbanism Priority Index was developed through a participatory process involving technical experts, municipal planning staff, and community representatives, with indicator weights assigned through analytic hierarchy process (AHP) methods.</w:t>
+        <w:t>The revenue figures presented in Section 7 rest on two distinct footings: realized collections from the municipality’s two operational land-based instruments (the water-and-sewer feasibility contribution and the vacant-land surcharge), drawn from municipal records and the 2026 tax roll; and ex-ante estimates for the designed value-capture instruments, obtained by applying the actual formulas of the draft Ordinance of Urban-Economy Instruments to real municipal parameters—the itemised 2026 public-works programme, the COS 2026 buildability schedule, and the municipal land-value, built-value and fiscal-assessment maps—rather than to assumed transaction data, since these instruments are not yet sanctioned. The Sustainable Urbanism Priority Index was developed through a participatory process involving technical experts, municipal planning staff, and community representatives, with indicator weights assigned through analytic hierarchy process (AHP) methods.</w:t>
       </w:r>
     </w:p>
     <w:p>
@@ -2162,150 +2162,104 @@
     <w:p>
       <w:pPr>
         <w:pStyle w:val="Heading1"/>
-        <w:spacing w:before="360" w:after="200"/>
-      </w:pPr>
-      <w:r>
-        <w:rPr>
-          <w:rFonts w:ascii="Times New Roman" w:cs="Times New Roman" w:eastAsia="Times New Roman" w:hAnsi="Times New Roman"/>
-        </w:rPr>
-        <w:t xml:space="preserve">5. Institutional Architecture: The Climate Adaptation Trust Fund</w:t>
+      </w:pPr>
+      <w:r>
+        <w:t>5. Institutional Architecture: The Climate Adaptation Trust Fund</w:t>
       </w:r>
     </w:p>
     <w:p>
       <w:pPr>
         <w:pStyle w:val="Heading2"/>
-        <w:spacing w:before="360" w:after="200"/>
-      </w:pPr>
-      <w:r>
-        <w:rPr>
-          <w:rFonts w:ascii="Times New Roman" w:cs="Times New Roman" w:eastAsia="Times New Roman" w:hAnsi="Times New Roman"/>
-        </w:rPr>
-        <w:t xml:space="preserve">5.1 Rationale for a Trust Fund Structure</w:t>
-      </w:r>
-    </w:p>
-    <w:p>
-      <w:pPr>
-        <w:spacing w:after="200" w:line="360"/>
-        <w:jc w:val="both"/>
-      </w:pPr>
-      <w:r>
-        <w:rPr>
-          <w:rFonts w:ascii="Times New Roman" w:cs="Times New Roman" w:eastAsia="Times New Roman" w:hAnsi="Times New Roman"/>
-          <w:sz w:val="24"/>
-          <w:szCs w:val="24"/>
-        </w:rPr>
-        <w:t xml:space="preserve">The decision to channel LVC revenues through a dedicated Trust Fund, rather than the municipality’s general budget, reflects both practical and strategic considerations. From a practical standpoint, earmarking creates predictable revenue streams that support medium-term infrastructure planning. From a strategic standpoint, the Trust Fund addresses the bankability gap: it creates a visible, auditable pool of own-source resources that international financiers can evaluate as evidence of municipal commitment and repayment capacity.</w:t>
-      </w:r>
-    </w:p>
-    <w:p>
-      <w:pPr>
-        <w:spacing w:after="200" w:line="360"/>
-        <w:jc w:val="both"/>
-      </w:pPr>
-      <w:r>
-        <w:rPr>
-          <w:rFonts w:ascii="Times New Roman" w:cs="Times New Roman" w:eastAsia="Times New Roman" w:hAnsi="Times New Roman"/>
-          <w:sz w:val="24"/>
-          <w:szCs w:val="24"/>
-        </w:rPr>
-        <w:t xml:space="preserve">The Trust Fund operates as a fiduciary mechanism legally distinct from the municipal general fund, with a dedicated board of trustees, transparent governance procedures, independent auditing, and defined investment policies. This institutional separation protects adaptation revenues from reallocation during fiscal stress, provides governance structures that green bond investors require, and creates an institutional focal point for climate adaptation decision-making.</w:t>
+      </w:pPr>
+      <w:r>
+        <w:t>5.1 Rationale for a Trust Fund Structure</w:t>
+      </w:r>
+    </w:p>
+    <w:p>
+      <w:r>
+        <w:t>The decision to channel LVC revenues through a dedicated Trust Fund, rather than the municipality’s general budget, reflects both practical and strategic considerations. From a practical standpoint, earmarking creates predictable revenue streams that support medium-term infrastructure planning. From a strategic standpoint, the Trust Fund addresses the bankability gap: it creates a visible, auditable pool of own-source resources that international financiers can evaluate as evidence of municipal commitment and repayment capacity.</w:t>
+      </w:r>
+    </w:p>
+    <w:p>
+      <w:r>
+        <w:t>In Luján de Cuyo the architecture is already taking concrete legal form. Ordinances No. 15081 and No. 15093 of 2025 created the Municipal Land and Real-Estate Bank (Banco Municipal de Tierras e Inmuebles, BMTI) and the Urban-Economy Fund (Fondo de Economía Urbana de Luján de Cuyo, FEULDC), an earmarked patrimony of specific allocation into which the value-capture instruments, the vacant-land surcharge and the water-and-sewer contribution are all directed. An Administration Trust (Fideicomiso de Administración) is the vehicle intended to pool and channel these flows; its implementing decree was pending at the time of writing (expected mid-2026). The Trust Fund described here is therefore not a hypothetical construct but the financial layer of an institutional system already under construction.</w:t>
+      </w:r>
+    </w:p>
+    <w:p>
+      <w:r>
+        <w:t>The Trust Fund operates as a fiduciary mechanism legally distinct from the municipal general fund, with a dedicated board of trustees, transparent governance procedures, independent auditing, and defined investment policies. This institutional separation protects adaptation revenues from reallocation during fiscal stress, provides governance structures that green-bond investors require, and creates an institutional focal point for climate-adaptation decision-making.</w:t>
       </w:r>
     </w:p>
     <w:p>
       <w:pPr>
         <w:pStyle w:val="Heading2"/>
-        <w:spacing w:before="360" w:after="200"/>
-      </w:pPr>
-      <w:r>
-        <w:rPr>
-          <w:rFonts w:ascii="Times New Roman" w:cs="Times New Roman" w:eastAsia="Times New Roman" w:hAnsi="Times New Roman"/>
-        </w:rPr>
-        <w:t xml:space="preserve">5.2 Revenue Pooling and Fund Structure</w:t>
-      </w:r>
-    </w:p>
-    <w:p>
-      <w:pPr>
-        <w:spacing w:after="200" w:line="360"/>
-        <w:jc w:val="both"/>
-      </w:pPr>
-      <w:r>
-        <w:rPr>
-          <w:rFonts w:ascii="Times New Roman" w:cs="Times New Roman" w:eastAsia="Times New Roman" w:hAnsi="Times New Roman"/>
-          <w:sz w:val="24"/>
-          <w:szCs w:val="24"/>
-        </w:rPr>
-        <w:t xml:space="preserve">The Trust Fund pools revenue from all six LVC instruments into a unified structure with three defined sub-accounts. The Infrastructure Investment Account (60 percent of net revenues) finances capital expenditure on water efficiency infrastructure, aquifer recharge facilities, stormwater management, and green infrastructure. The Maintenance and Operations Account (25 percent) covers recurring costs of maintaining adaptation infrastructure. The Leverage Account (15 percent) accumulates reserves specifically designated as matching funds for external financing, creating the own-source contribution that green bonds and international climate facilities typically require.</w:t>
+      </w:pPr>
+      <w:r>
+        <w:t>5.2 Revenue Pooling and Fund Structure</w:t>
+      </w:r>
+    </w:p>
+    <w:p>
+      <w:r>
+        <w:t>The Trust Fund pools revenue from all six LVC instruments—together with the operational water-and-sewer contribution—into a unified structure with three defined sub-accounts. The Infrastructure Investment Account (60 percent of net revenues) finances capital expenditure on water-efficiency infrastructure, aquifer-recharge facilities, stormwater management, and green infrastructure. The Maintenance and Operations Account (25 percent) covers the recurring costs of maintaining adaptation infrastructure. The Leverage Account (15 percent) accumulates reserves specifically designated as matching funds for external financing, creating the own-source contribution that green bonds and international climate facilities typically require. In the municipal design this pooled patrimony corresponds to the FEULDC, which the draft Ordinance of Urban-Economy Instruments designates as the destination of every instrument’s proceeds.</w:t>
       </w:r>
     </w:p>
     <w:p>
       <w:pPr>
         <w:pStyle w:val="Heading2"/>
-        <w:spacing w:before="360" w:after="200"/>
-      </w:pPr>
-      <w:r>
-        <w:rPr>
-          <w:rFonts w:ascii="Times New Roman" w:cs="Times New Roman" w:eastAsia="Times New Roman" w:hAnsi="Times New Roman"/>
-        </w:rPr>
-        <w:t xml:space="preserve">5.3 Leveraging International Climate Finance</w:t>
-      </w:r>
-    </w:p>
-    <w:p>
-      <w:pPr>
-        <w:spacing w:after="200" w:line="360"/>
-        <w:jc w:val="both"/>
-      </w:pPr>
-      <w:r>
-        <w:rPr>
-          <w:rFonts w:ascii="Times New Roman" w:cs="Times New Roman" w:eastAsia="Times New Roman" w:hAnsi="Times New Roman"/>
-          <w:sz w:val="24"/>
-          <w:szCs w:val="24"/>
-        </w:rPr>
-        <w:t xml:space="preserve">The Trust Fund is designed to support three levels of financial leverage. At the first level, accumulated Leverage Account resources serve as matching funds for bilateral and multilateral grants, typically requiring matches of 10 to 30 percent. At the second level, the predictable revenue stream can be pledged as security for green bond issuance. At the third level, the demonstrated track record of successful project implementation builds institutional credibility required to access larger facilities such as the Green Climate Fund.</w:t>
-      </w:r>
-    </w:p>
-    <w:p>
-      <w:pPr>
-        <w:spacing w:after="200" w:line="360"/>
-        <w:jc w:val="both"/>
-      </w:pPr>
-      <w:r>
-        <w:rPr>
-          <w:rFonts w:ascii="Times New Roman" w:cs="Times New Roman" w:eastAsia="Times New Roman" w:hAnsi="Times New Roman"/>
-          <w:sz w:val="24"/>
-          <w:szCs w:val="24"/>
-        </w:rPr>
-        <w:t xml:space="preserve">This graduated leverage strategy recognizes that intermediate cities must build credibility incrementally. The initial LVC revenues finance smaller, demonstrable projects; their success, combined with the Trust Fund’s transparent governance, positions the municipality for progressively larger financing rounds.</w:t>
+      </w:pPr>
+      <w:r>
+        <w:t>5.3 Leveraging International Climate Finance</w:t>
+      </w:r>
+    </w:p>
+    <w:p>
+      <w:r>
+        <w:t>The Trust Fund is designed to support three escalating levels of financial leverage, and it is the fiduciary structure—not the revenue alone—that makes each level credible to external financiers. At the first level, accumulated Leverage Account reserves serve as matching funds (co-financing) for bilateral and multilateral climate grants, which typically require a counterpart contribution of 10 to 30 percent; because that match is the binding constraint for most intermediate cities, a ring-fenced, audited own-source pool converts otherwise-inaccessible grants into reachable ones. At the second level, the predictable, legally-segregated revenue stream can be pledged as the repayment source and security for a green-bond issuance or a concessional loan: the fideicomiso isolates the pledged flows from the municipal general budget and from political reallocation, which is exactly the assurance that bond investors and development banks require. At the third level, a demonstrated track record of disbursing funds, delivering works, and servicing debt—evidenced in the Fund’s audited accounts—builds the institutional credibility needed to access larger facilities such as the Green Climate Fund (GCF), the Global Environment Facility, or the climate windows of CAF and the Inter-American Development Bank.</w:t>
+      </w:r>
+    </w:p>
+    <w:p>
+      <w:r>
+        <w:t>This graduated leverage strategy recognizes that intermediate cities must build credibility incrementally. The initial LVC revenues finance smaller, demonstrable projects; their success, combined with the Trust Fund’s transparent governance, positions the municipality for progressively larger financing rounds.</w:t>
       </w:r>
     </w:p>
     <w:p>
       <w:pPr>
         <w:pStyle w:val="Heading2"/>
-        <w:spacing w:before="360" w:after="200"/>
-      </w:pPr>
-      <w:r>
-        <w:rPr>
-          <w:rFonts w:ascii="Times New Roman" w:cs="Times New Roman" w:eastAsia="Times New Roman" w:hAnsi="Times New Roman"/>
-        </w:rPr>
-        <w:t xml:space="preserve">5.4 Governance and Accountability</w:t>
-      </w:r>
-    </w:p>
-    <w:p>
-      <w:pPr>
-        <w:spacing w:after="200" w:line="360"/>
-        <w:jc w:val="both"/>
-      </w:pPr>
-      <w:r>
-        <w:rPr>
-          <w:rFonts w:ascii="Times New Roman" w:cs="Times New Roman" w:eastAsia="Times New Roman" w:hAnsi="Times New Roman"/>
-          <w:sz w:val="24"/>
-          <w:szCs w:val="24"/>
-        </w:rPr>
-        <w:t xml:space="preserve">The Trust Fund’s governance structure includes the municipal intendente (mayor), the director of urban planning, the municipal comptroller, and two external members—one representing the agricultural sector and one with expertise in environmental finance. Board decisions require a qualified majority, preventing unilateral diversion of funds. Annual audits are conducted by independent auditors, with audit reports and quarterly financial statements published on the municipal website.</w:t>
-      </w:r>
-    </w:p>
-    <w:p>
-      <w:r>
-        <w:br w:type="page"/>
+      </w:pPr>
+      <w:r>
+        <w:t>5.4 Governance and Accountability</w:t>
+      </w:r>
+    </w:p>
+    <w:p>
+      <w:r>
+        <w:t>The Trust Fund’s governance structure includes the municipal intendente (mayor), the director of urban planning, the municipal comptroller, and two external members—one representing the agricultural sector and one with expertise in environmental finance. Board decisions require a qualified majority, preventing unilateral diversion of funds. Annual audits are conducted by independent auditors, with audit reports and quarterly financial statements published on the municipal website.</w:t>
+      </w:r>
+    </w:p>
+    <w:p>
+      <w:pPr>
+        <w:pStyle w:val="Heading2"/>
+      </w:pPr>
+      <w:r>
+        <w:t>5.5 The Trust Fund as a Matching-Funds and Repayment Vehicle</w:t>
+      </w:r>
+    </w:p>
+    <w:p>
+      <w:r>
+        <w:t>The defining advantage of channelling land value capture through a fideicomiso is that it resolves the two conditions that most often disqualify intermediate-city adaptation projects from international green finance: the absence of counterpart funds and the absence of a credible repayment source. The Trust Fund supplies both from the same pooled revenue.</w:t>
+      </w:r>
+    </w:p>
+    <w:p>
+      <w:r>
+        <w:t>On matching funds, the Leverage Account (15 percent of net revenue) accumulates a dedicated co-financing reserve. At the baseline revenue of roughly USD 3 million per year (Section 7), the account builds on the order of USD 0.45 million annually—enough, within two to three years, to anchor the 10–30 percent counterpart that bilateral facilities and the GCF’s Simplified Approval Process expect for projects in the USD 2–10 million range. Own-source matching is not only a financial requirement; it is read by financiers as a costly signal of genuine municipal commitment, and it is weighted heavily in concept-note and funding-proposal scoring.</w:t>
+      </w:r>
+    </w:p>
+    <w:p>
+      <w:r>
+        <w:t>On repayment, the same predictable flows provide debt service. The realized water-and-sewer series—eleven-fold real growth over 2021–2025 (Section 7.2)—is precisely the kind of demonstrated, ring-fenced cash flow against which a debt-service-coverage ratio can be computed and a bond rated. Pledging the Fund’s flows through the fideicomiso, rather than through the general budget, raises the effective seniority of repayment and lowers the risk premium. On the framework’s figures, a green-bond issuance of three to four times annual Trust Fund revenue—on the order of USD 9 to 12 million—is serviceable from the dedicated streams and would finance a first tranche of the green-space and water-efficiency deficits identified by the priority index.</w:t>
+      </w:r>
+    </w:p>
+    <w:p>
+      <w:r>
+        <w:t>The fideicomiso also de-risks the instrument for the municipality itself. Because adaptation revenues are legally separated, they cannot be diverted to current spending during fiscal stress, which both protects the multi-year investment programme and preserves the repayment pledge across electoral cycles. The Trust Fund is therefore not merely an accounting convenience: it is the bankability bridge that converts locally captured land value into matched, repayable, and ultimately larger flows of international climate finance.</w:t>
       </w:r>
     </w:p>
     <w:p>
@@ -2652,7 +2606,7 @@
     </w:p>
     <w:p>
       <w:r>
-        <w:t>This section reports revenue on two distinct evidentiary footings, and we are explicit about which is which. The first is realized revenue: amounts actually collected by the two instruments that are already operational—the water-and-sewer feasibility contribution and the vacant-land surcharge. These are drawn from municipal collection records for 2021–2025 and from the 2026 tax roll (padrón), and are expressed in inflation- and exchange-rate-adjusted US dollars using INDEC consumer-price and official ARS/USD series. The second is ex-ante potential: scenario-based estimates for the value-capture instruments that are designed but not yet sanctioned and applied—the betterment levy (Contribución por Mejoras), differential rent capture (Participación en la Valoración de Activos), and development-rights sales (Suelo Creado / CEODEC). Because no transactions exist for these instruments yet, their estimates combine the actual calculation formulas set out in the draft Ordinance of Urban-Economy Instruments with parameters calibrated against real municipal data: the itemised 2026 public-works programme for the betterment levy, and the COS occupation coefficients together with the municipal land-value, built-value and fiscal-assessment maps for the development-rights and differential-rent instruments. The value of the Tax Unit (Unidad Tributaria, UT) is set at its real 2026 level of ARS 235 (Tarifaria 2026, Art. 54), and all figures are converted at the 2025 average exchange rate of ARS 1,244.17 per US dollar. We model three scenarios—conservative (Low), baseline (Base), and optimistic (High)—and emphasise that the ex-ante point estimates are illustrative: their contribution is the method and the realized-revenue evidence, not precise forecasts.</w:t>
+        <w:t>This section reports revenue on two distinct evidentiary footings, and we are explicit about which is which. The first is realized revenue: amounts actually collected by the two instruments that are already operational—the water-and-sewer feasibility contribution and the vacant-land surcharge. These are drawn from municipal collection records for 2021–2025 and from the 2026 tax roll (padrón), and are expressed in inflation- and exchange-rate-adjusted US dollars using INDEC consumer-price and official ARS/USD series. The second is ex-ante potential: scenario-based estimates for the value-capture instruments that are designed but not yet sanctioned and applied—the betterment levy (Contribución por Mejoras), differential rent capture (Participación en la Valoración de Activos), and development-rights sales (Suelo Creado / Derechos de Construcción Adicional). Because no transactions exist for these instruments yet, their estimates combine the actual calculation formulas of the draft Ordinance of Urban-Economy Instruments with parameters calibrated against real municipal data: the itemised 2026 public-works programme for the betterment levy, and the COS 2026 buildability schedule together with the municipal land-value and built-value maps for the development-rights and differential-rent instruments. The value of the Tax Unit (Unidad Tributaria, UT) is set at its real 2026 level of ARS 235 (Tarifaria 2026, Art. 54), and all figures are converted at the 2025 average exchange rate of ARS 1,244.17 per US dollar. We model three scenarios—conservative (Low), baseline (Base), and optimistic (High)—and emphasise that the ex-ante point estimates are illustrative: their contribution is the method and the realized-revenue evidence, not precise forecasts.</w:t>
       </w:r>
     </w:p>
     <w:p>
@@ -3862,7 +3816,7 @@
           <w:i/>
           <w:sz w:val="18"/>
         </w:rPr>
-        <w:t>Table 4: Municipally-funded 2026 public-works programme — the betterment-levy cost base, classified by planning priority (EA) and environmental–adaptation impact. A further seven projects (bike-lane network and repaving) are financed within the operating pavement budget and carry no separate line. Source: Plan de Obras, “Obras y Espacios Públicos — Proyectos a ejecutar 2026.”</w:t>
+        <w:t>Table 4: Municipally-funded 2026 public-works programme — the betterment-levy cost base, classified by planning priority (EA) and environmental–adaptation impact. A further seven projects (bike-lane network and repaving) sit in the operating pavement budget and carry no separate line. Source: Plan de Obras, “Obras y Espacios Públicos — Proyectos a ejecutar 2026.”</w:t>
       </w:r>
     </w:p>
     <w:p>
@@ -4089,7 +4043,7 @@
     </w:p>
     <w:p>
       <w:r>
-        <w:t>The value-capture instruments—development-rights sales and differential rent capture—are spatially targeted to the areas the municipality intends to densify (Table 6). Two stand out. The first is the transit corridor along the metrotranvía / Liniers–San Martín axis, whose east–west integration is the programme’s single largest work; transit-oriented densification here simultaneously raises land value (the base these instruments tax) and supports low-carbon mobility. The second is the network of urban centralities—Ciudad de Luján and the La Carrodilla–Mayor Drummond axis—which coincide with the +200 percent vacant-land priority infill zones, producing one coherent spatial signal: the same places where idle land is most heavily penalised are where additional building rights are sold and rezoning value is captured. The development-rights and rezoning pipeline is therefore concentrated in these zones.</w:t>
+        <w:t>The development-rights and differential-rent instruments are spatially targeted to the areas the municipality intends to densify (Table 6): the transit corridor along the metrotranvía / Liniers–San Martín axis, and the urban centralities of Ciudad de Luján and the La Carrodilla–Mayor Drummond axis, which coincide with the +200 percent vacant-land priority infill zones. The same places where idle land is most heavily penalised are where additional building rights are sold and rezoning value is captured.</w:t>
       </w:r>
     </w:p>
     <w:tbl>
@@ -4311,7 +4265,7 @@
     </w:p>
     <w:p>
       <w:r>
-        <w:t>Rather than assume a transaction volume, we estimate the pipeline of additional buildable area bottom-up from the buildability that these zones can actually generate (Table 7). Developable land is anchored to the 319 vacant lots recorded in the priority urban voids of Ciudad de Luján and Mayor Drummond (at roughly 500 m² per lot) plus redevelopable parcels along the transit corridor, giving on the order of 300,000 m² of developable land in the baseline. Each square metre of land can carry an additional buildable increment (ΔFOT) above the base coefficient fixed in the COS ordinance (No. 14517/2023)—sold as building rights under Suelo Creado, or unlocked by rezoning under the differential-rent instrument. With a baseline increment of 1.0 and a build-out absorption of about 5 percent per year, the zones generate roughly 15,000 m² of additional buildable area annually; the figure ranges from about 6,000 to 36,000 m²/yr as developable land (200,000–400,000 m²), ΔFOT (0.75–1.5) and absorption (4–6%) vary.</w:t>
+        <w:t>The buildable area these instruments monetise is now defined by real zoning. The draft COS 2026 replaces the single height limit with a two-line scheme: a base buildability (basamento) of 10 metres (13 metres in ZCM6), permitted without instruments, and a maximum of 36 metres reached only by purchasing Derechos de Construcción Adicional (Suelo Creado) or through the differential-rent instrument—about 8.7 additional floors. Applied across the seven affected zones (ZC, ZCM1, ZCM6, ZR1, ZRM1–ZRM3; 4,491 hectares, with FOS of 75–90 percent), this opens a ceiling of roughly 295 million m² of additional buildable area (Table 7). That ceiling is a theoretical maximum—it assumes every owner buys the full increment—so revenue depends on annual take-up, which is demand-constrained and will absorb only a small fraction of the ceiling each year. We model take-up of 20,000 m²/yr (Low), 50,000 m²/yr (Base) and 80,000 m²/yr (High)—well under 0.03 percent of the ceiling annually—split roughly evenly between the two instruments.</w:t>
       </w:r>
     </w:p>
     <w:tbl>
@@ -4337,7 +4291,7 @@
               <w:rPr>
                 <w:b/>
               </w:rPr>
-              <w:t>Densification zone</w:t>
+              <w:t>Zone</w:t>
             </w:r>
           </w:p>
         </w:tc>
@@ -4351,7 +4305,7 @@
               <w:rPr>
                 <w:b/>
               </w:rPr>
-              <w:t>Developable land (m²)</w:t>
+              <w:t>Area 2022 (ha)</w:t>
             </w:r>
           </w:p>
         </w:tc>
@@ -4365,7 +4319,7 @@
               <w:rPr>
                 <w:b/>
               </w:rPr>
-              <w:t>ΔFOT</w:t>
+              <w:t>FOS (%)</w:t>
             </w:r>
           </w:p>
         </w:tc>
@@ -4379,7 +4333,7 @@
               <w:rPr>
                 <w:b/>
               </w:rPr>
-              <w:t>Creatable floor area (m²)</w:t>
+              <w:t>Height básico → máximo (m)</w:t>
             </w:r>
           </w:p>
         </w:tc>
@@ -4393,202 +4347,373 @@
               <w:rPr>
                 <w:b/>
               </w:rPr>
-              <w:t>Annual pipeline (m²/yr)</w:t>
-            </w:r>
-          </w:p>
-        </w:tc>
-      </w:tr>
-      <w:tr>
-        <w:tc>
-          <w:tcPr>
-            <w:tcW w:type="dxa" w:w="1872"/>
-          </w:tcPr>
-          <w:p>
-            <w:r/>
-            <w:r>
-              <w:t>Ciudad de Luján centrality</w:t>
-            </w:r>
-          </w:p>
-        </w:tc>
-        <w:tc>
-          <w:tcPr>
-            <w:tcW w:type="dxa" w:w="1872"/>
-          </w:tcPr>
-          <w:p>
-            <w:r/>
-            <w:r>
-              <w:t>100,000</w:t>
-            </w:r>
-          </w:p>
-        </w:tc>
-        <w:tc>
-          <w:tcPr>
-            <w:tcW w:type="dxa" w:w="1872"/>
-          </w:tcPr>
-          <w:p>
-            <w:r/>
-            <w:r>
-              <w:t>1.0</w:t>
-            </w:r>
-          </w:p>
-        </w:tc>
-        <w:tc>
-          <w:tcPr>
-            <w:tcW w:type="dxa" w:w="1872"/>
-          </w:tcPr>
-          <w:p>
-            <w:r/>
-            <w:r>
-              <w:t>100,000</w:t>
-            </w:r>
-          </w:p>
-        </w:tc>
-        <w:tc>
-          <w:tcPr>
-            <w:tcW w:type="dxa" w:w="1872"/>
-          </w:tcPr>
-          <w:p>
-            <w:r/>
-            <w:r>
-              <w:t>5,000</w:t>
-            </w:r>
-          </w:p>
-        </w:tc>
-      </w:tr>
-      <w:tr>
-        <w:tc>
-          <w:tcPr>
-            <w:tcW w:type="dxa" w:w="1872"/>
-          </w:tcPr>
-          <w:p>
-            <w:r/>
-            <w:r>
-              <w:t>Mayor Drummond</w:t>
-            </w:r>
-          </w:p>
-        </w:tc>
-        <w:tc>
-          <w:tcPr>
-            <w:tcW w:type="dxa" w:w="1872"/>
-          </w:tcPr>
-          <w:p>
-            <w:r/>
-            <w:r>
-              <w:t>80,000</w:t>
-            </w:r>
-          </w:p>
-        </w:tc>
-        <w:tc>
-          <w:tcPr>
-            <w:tcW w:type="dxa" w:w="1872"/>
-          </w:tcPr>
-          <w:p>
-            <w:r/>
-            <w:r>
-              <w:t>1.0</w:t>
-            </w:r>
-          </w:p>
-        </w:tc>
-        <w:tc>
-          <w:tcPr>
-            <w:tcW w:type="dxa" w:w="1872"/>
-          </w:tcPr>
-          <w:p>
-            <w:r/>
-            <w:r>
-              <w:t>80,000</w:t>
-            </w:r>
-          </w:p>
-        </w:tc>
-        <w:tc>
-          <w:tcPr>
-            <w:tcW w:type="dxa" w:w="1872"/>
-          </w:tcPr>
-          <w:p>
-            <w:r/>
-            <w:r>
-              <w:t>4,000</w:t>
-            </w:r>
-          </w:p>
-        </w:tc>
-      </w:tr>
-      <w:tr>
-        <w:tc>
-          <w:tcPr>
-            <w:tcW w:type="dxa" w:w="1872"/>
-          </w:tcPr>
-          <w:p>
-            <w:r/>
-            <w:r>
-              <w:t>Metrotranvía / San Martín corridor</w:t>
-            </w:r>
-          </w:p>
-        </w:tc>
-        <w:tc>
-          <w:tcPr>
-            <w:tcW w:type="dxa" w:w="1872"/>
-          </w:tcPr>
-          <w:p>
-            <w:r/>
-            <w:r>
-              <w:t>120,000</w:t>
-            </w:r>
-          </w:p>
-        </w:tc>
-        <w:tc>
-          <w:tcPr>
-            <w:tcW w:type="dxa" w:w="1872"/>
-          </w:tcPr>
-          <w:p>
-            <w:r/>
-            <w:r>
-              <w:t>1.0</w:t>
-            </w:r>
-          </w:p>
-        </w:tc>
-        <w:tc>
-          <w:tcPr>
-            <w:tcW w:type="dxa" w:w="1872"/>
-          </w:tcPr>
-          <w:p>
-            <w:r/>
-            <w:r>
-              <w:t>120,000</w:t>
-            </w:r>
-          </w:p>
-        </w:tc>
-        <w:tc>
-          <w:tcPr>
-            <w:tcW w:type="dxa" w:w="1872"/>
-          </w:tcPr>
-          <w:p>
-            <w:r/>
-            <w:r>
-              <w:t>6,000</w:t>
-            </w:r>
-          </w:p>
-        </w:tc>
-      </w:tr>
-      <w:tr>
-        <w:tc>
-          <w:tcPr>
-            <w:tcW w:type="dxa" w:w="1872"/>
-          </w:tcPr>
-          <w:p>
-            <w:r/>
-            <w:r>
-              <w:t>Total (Base scenario)</w:t>
-            </w:r>
-          </w:p>
-        </w:tc>
-        <w:tc>
-          <w:tcPr>
-            <w:tcW w:type="dxa" w:w="1872"/>
-          </w:tcPr>
-          <w:p>
-            <w:r/>
-            <w:r>
-              <w:t>300,000</w:t>
+              <w:t>Additional buildable ceiling (m²)</w:t>
+            </w:r>
+          </w:p>
+        </w:tc>
+      </w:tr>
+      <w:tr>
+        <w:tc>
+          <w:tcPr>
+            <w:tcW w:type="dxa" w:w="1872"/>
+          </w:tcPr>
+          <w:p>
+            <w:r/>
+            <w:r>
+              <w:t>ZRM2</w:t>
+            </w:r>
+          </w:p>
+        </w:tc>
+        <w:tc>
+          <w:tcPr>
+            <w:tcW w:type="dxa" w:w="1872"/>
+          </w:tcPr>
+          <w:p>
+            <w:r/>
+            <w:r>
+              <w:t>1,356</w:t>
+            </w:r>
+          </w:p>
+        </w:tc>
+        <w:tc>
+          <w:tcPr>
+            <w:tcW w:type="dxa" w:w="1872"/>
+          </w:tcPr>
+          <w:p>
+            <w:r/>
+            <w:r>
+              <w:t>75</w:t>
+            </w:r>
+          </w:p>
+        </w:tc>
+        <w:tc>
+          <w:tcPr>
+            <w:tcW w:type="dxa" w:w="1872"/>
+          </w:tcPr>
+          <w:p>
+            <w:r/>
+            <w:r>
+              <w:t>10 → 36</w:t>
+            </w:r>
+          </w:p>
+        </w:tc>
+        <w:tc>
+          <w:tcPr>
+            <w:tcW w:type="dxa" w:w="1872"/>
+          </w:tcPr>
+          <w:p>
+            <w:r/>
+            <w:r>
+              <w:t>88,137,947</w:t>
+            </w:r>
+          </w:p>
+        </w:tc>
+      </w:tr>
+      <w:tr>
+        <w:tc>
+          <w:tcPr>
+            <w:tcW w:type="dxa" w:w="1872"/>
+          </w:tcPr>
+          <w:p>
+            <w:r/>
+            <w:r>
+              <w:t>ZRM3</w:t>
+            </w:r>
+          </w:p>
+        </w:tc>
+        <w:tc>
+          <w:tcPr>
+            <w:tcW w:type="dxa" w:w="1872"/>
+          </w:tcPr>
+          <w:p>
+            <w:r/>
+            <w:r>
+              <w:t>1,256</w:t>
+            </w:r>
+          </w:p>
+        </w:tc>
+        <w:tc>
+          <w:tcPr>
+            <w:tcW w:type="dxa" w:w="1872"/>
+          </w:tcPr>
+          <w:p>
+            <w:r/>
+            <w:r>
+              <w:t>75</w:t>
+            </w:r>
+          </w:p>
+        </w:tc>
+        <w:tc>
+          <w:tcPr>
+            <w:tcW w:type="dxa" w:w="1872"/>
+          </w:tcPr>
+          <w:p>
+            <w:r/>
+            <w:r>
+              <w:t>10 → 36</w:t>
+            </w:r>
+          </w:p>
+        </w:tc>
+        <w:tc>
+          <w:tcPr>
+            <w:tcW w:type="dxa" w:w="1872"/>
+          </w:tcPr>
+          <w:p>
+            <w:r/>
+            <w:r>
+              <w:t>81,668,328</w:t>
+            </w:r>
+          </w:p>
+        </w:tc>
+      </w:tr>
+      <w:tr>
+        <w:tc>
+          <w:tcPr>
+            <w:tcW w:type="dxa" w:w="1872"/>
+          </w:tcPr>
+          <w:p>
+            <w:r/>
+            <w:r>
+              <w:t>ZRM1</w:t>
+            </w:r>
+          </w:p>
+        </w:tc>
+        <w:tc>
+          <w:tcPr>
+            <w:tcW w:type="dxa" w:w="1872"/>
+          </w:tcPr>
+          <w:p>
+            <w:r/>
+            <w:r>
+              <w:t>901</w:t>
+            </w:r>
+          </w:p>
+        </w:tc>
+        <w:tc>
+          <w:tcPr>
+            <w:tcW w:type="dxa" w:w="1872"/>
+          </w:tcPr>
+          <w:p>
+            <w:r/>
+            <w:r>
+              <w:t>75</w:t>
+            </w:r>
+          </w:p>
+        </w:tc>
+        <w:tc>
+          <w:tcPr>
+            <w:tcW w:type="dxa" w:w="1872"/>
+          </w:tcPr>
+          <w:p>
+            <w:r/>
+            <w:r>
+              <w:t>10 → 36</w:t>
+            </w:r>
+          </w:p>
+        </w:tc>
+        <w:tc>
+          <w:tcPr>
+            <w:tcW w:type="dxa" w:w="1872"/>
+          </w:tcPr>
+          <w:p>
+            <w:r/>
+            <w:r>
+              <w:t>58,596,637</w:t>
+            </w:r>
+          </w:p>
+        </w:tc>
+      </w:tr>
+      <w:tr>
+        <w:tc>
+          <w:tcPr>
+            <w:tcW w:type="dxa" w:w="1872"/>
+          </w:tcPr>
+          <w:p>
+            <w:r/>
+            <w:r>
+              <w:t>ZR1</w:t>
+            </w:r>
+          </w:p>
+        </w:tc>
+        <w:tc>
+          <w:tcPr>
+            <w:tcW w:type="dxa" w:w="1872"/>
+          </w:tcPr>
+          <w:p>
+            <w:r/>
+            <w:r>
+              <w:t>714</w:t>
+            </w:r>
+          </w:p>
+        </w:tc>
+        <w:tc>
+          <w:tcPr>
+            <w:tcW w:type="dxa" w:w="1872"/>
+          </w:tcPr>
+          <w:p>
+            <w:r/>
+            <w:r>
+              <w:t>75</w:t>
+            </w:r>
+          </w:p>
+        </w:tc>
+        <w:tc>
+          <w:tcPr>
+            <w:tcW w:type="dxa" w:w="1872"/>
+          </w:tcPr>
+          <w:p>
+            <w:r/>
+            <w:r>
+              <w:t>10 → 36</w:t>
+            </w:r>
+          </w:p>
+        </w:tc>
+        <w:tc>
+          <w:tcPr>
+            <w:tcW w:type="dxa" w:w="1872"/>
+          </w:tcPr>
+          <w:p>
+            <w:r/>
+            <w:r>
+              <w:t>46,410,451</w:t>
+            </w:r>
+          </w:p>
+        </w:tc>
+      </w:tr>
+      <w:tr>
+        <w:tc>
+          <w:tcPr>
+            <w:tcW w:type="dxa" w:w="1872"/>
+          </w:tcPr>
+          <w:p>
+            <w:r/>
+            <w:r>
+              <w:t>ZCM1</w:t>
+            </w:r>
+          </w:p>
+        </w:tc>
+        <w:tc>
+          <w:tcPr>
+            <w:tcW w:type="dxa" w:w="1872"/>
+          </w:tcPr>
+          <w:p>
+            <w:r/>
+            <w:r>
+              <w:t>232</w:t>
+            </w:r>
+          </w:p>
+        </w:tc>
+        <w:tc>
+          <w:tcPr>
+            <w:tcW w:type="dxa" w:w="1872"/>
+          </w:tcPr>
+          <w:p>
+            <w:r/>
+            <w:r>
+              <w:t>89</w:t>
+            </w:r>
+          </w:p>
+        </w:tc>
+        <w:tc>
+          <w:tcPr>
+            <w:tcW w:type="dxa" w:w="1872"/>
+          </w:tcPr>
+          <w:p>
+            <w:r/>
+            <w:r>
+              <w:t>10 → 36</w:t>
+            </w:r>
+          </w:p>
+        </w:tc>
+        <w:tc>
+          <w:tcPr>
+            <w:tcW w:type="dxa" w:w="1872"/>
+          </w:tcPr>
+          <w:p>
+            <w:r/>
+            <w:r>
+              <w:t>17,924,965</w:t>
+            </w:r>
+          </w:p>
+        </w:tc>
+      </w:tr>
+      <w:tr>
+        <w:tc>
+          <w:tcPr>
+            <w:tcW w:type="dxa" w:w="1872"/>
+          </w:tcPr>
+          <w:p>
+            <w:r/>
+            <w:r>
+              <w:t>ZC</w:t>
+            </w:r>
+          </w:p>
+        </w:tc>
+        <w:tc>
+          <w:tcPr>
+            <w:tcW w:type="dxa" w:w="1872"/>
+          </w:tcPr>
+          <w:p>
+            <w:r/>
+            <w:r>
+              <w:t>31</w:t>
+            </w:r>
+          </w:p>
+        </w:tc>
+        <w:tc>
+          <w:tcPr>
+            <w:tcW w:type="dxa" w:w="1872"/>
+          </w:tcPr>
+          <w:p>
+            <w:r/>
+            <w:r>
+              <w:t>90</w:t>
+            </w:r>
+          </w:p>
+        </w:tc>
+        <w:tc>
+          <w:tcPr>
+            <w:tcW w:type="dxa" w:w="1872"/>
+          </w:tcPr>
+          <w:p>
+            <w:r/>
+            <w:r>
+              <w:t>10 → 36</w:t>
+            </w:r>
+          </w:p>
+        </w:tc>
+        <w:tc>
+          <w:tcPr>
+            <w:tcW w:type="dxa" w:w="1872"/>
+          </w:tcPr>
+          <w:p>
+            <w:r/>
+            <w:r>
+              <w:t>2,413,938</w:t>
+            </w:r>
+          </w:p>
+        </w:tc>
+      </w:tr>
+      <w:tr>
+        <w:tc>
+          <w:tcPr>
+            <w:tcW w:type="dxa" w:w="1872"/>
+          </w:tcPr>
+          <w:p>
+            <w:r/>
+            <w:r>
+              <w:t>ZCM6</w:t>
+            </w:r>
+          </w:p>
+        </w:tc>
+        <w:tc>
+          <w:tcPr>
+            <w:tcW w:type="dxa" w:w="1872"/>
+          </w:tcPr>
+          <w:p>
+            <w:r/>
+            <w:r>
+              <w:t>n/a</w:t>
             </w:r>
           </w:p>
         </w:tc>
@@ -4610,18 +4735,75 @@
           <w:p>
             <w:r/>
             <w:r>
-              <w:t>300,000</w:t>
-            </w:r>
-          </w:p>
-        </w:tc>
-        <w:tc>
-          <w:tcPr>
-            <w:tcW w:type="dxa" w:w="1872"/>
-          </w:tcPr>
-          <w:p>
-            <w:r/>
-            <w:r>
-              <w:t>15,000</w:t>
+              <w:t>13 → 36</w:t>
+            </w:r>
+          </w:p>
+        </w:tc>
+        <w:tc>
+          <w:tcPr>
+            <w:tcW w:type="dxa" w:w="1872"/>
+          </w:tcPr>
+          <w:p>
+            <w:r/>
+            <w:r>
+              <w:t>n/a</w:t>
+            </w:r>
+          </w:p>
+        </w:tc>
+      </w:tr>
+      <w:tr>
+        <w:tc>
+          <w:tcPr>
+            <w:tcW w:type="dxa" w:w="1872"/>
+          </w:tcPr>
+          <w:p>
+            <w:r/>
+            <w:r>
+              <w:t>Total (7 zones)</w:t>
+            </w:r>
+          </w:p>
+        </w:tc>
+        <w:tc>
+          <w:tcPr>
+            <w:tcW w:type="dxa" w:w="1872"/>
+          </w:tcPr>
+          <w:p>
+            <w:r/>
+            <w:r>
+              <w:t>4,491</w:t>
+            </w:r>
+          </w:p>
+        </w:tc>
+        <w:tc>
+          <w:tcPr>
+            <w:tcW w:type="dxa" w:w="1872"/>
+          </w:tcPr>
+          <w:p>
+            <w:r/>
+            <w:r>
+              <w:t>—</w:t>
+            </w:r>
+          </w:p>
+        </w:tc>
+        <w:tc>
+          <w:tcPr>
+            <w:tcW w:type="dxa" w:w="1872"/>
+          </w:tcPr>
+          <w:p>
+            <w:r/>
+            <w:r>
+              <w:t>—</w:t>
+            </w:r>
+          </w:p>
+        </w:tc>
+        <w:tc>
+          <w:tcPr>
+            <w:tcW w:type="dxa" w:w="1872"/>
+          </w:tcPr>
+          <w:p>
+            <w:r/>
+            <w:r>
+              <w:t>295,152,266</w:t>
             </w:r>
           </w:p>
         </w:tc>
@@ -4633,17 +4815,17 @@
           <w:i/>
           <w:sz w:val="18"/>
         </w:rPr>
-        <w:t>Table 7: Bottom-up buildable-area pipeline for the densification zones (Base scenario). Developable land anchored to the 319 priority urban-void lots (≈500 m²/lot) plus corridor redevelopment; ΔFOT = buildable increment above the COS base coefficient; annual pipeline at ~5% build-out absorption. Low/High vary developable land (200,000–400,000 m²), ΔFOT (0.75–1.5) and absorption (4–6%): total ≈6,000 / 15,000 / 36,000 m²/yr, split ~50/50 between Suelo Creado and the differential-rent instrument.</w:t>
-      </w:r>
-    </w:p>
-    <w:p>
-      <w:r>
-        <w:t>Valuing this pipeline against the municipal maps closes the estimate. Created floor space sells at roughly USD 300–1,200 per square metre in these zones (built-value map), of which the two instruments capture only a small fraction: Suelo Creado at a CEODEC price of about 50–300 UT/m², and the differential-rent instrument at a unit cost of about 30–200 UT/m² (UT 2026 = ARS 235), both consistent with undeveloped land values of USD 10–150/m² on the land-value map. Splitting the pipeline roughly evenly between the two triggers, development-rights sales yield about USD 0.03 million (Low), 0.17 million (Base) and 1.02 million (High) per year, and differential rent capture about USD 0.02, 0.11 and 0.68 million. The remaining two instruments are not separately quantified: transferable development rights depend on an as-yet-untraded market, and tax incentives operate as a net fiscal cost in the early years before becoming revenue-neutral.</w:t>
-      </w:r>
-    </w:p>
-    <w:p>
-      <w:r>
-        <w:t>Aggregating the three quantifiable value-capture instruments gives an ex-ante potential of approximately USD 0.75 million (Low), USD 1.4 million (Base), and USD 3.1 million (High) per year (Table 8). Combined with the roughly USD 0.97 million of realized operational revenue, the framework’s total annual revenue potential is on the order of USD 1.7 million (Low) to USD 4.1 million (High), with a baseline near USD 2.4 million. The betterment levy—anchored in the real, budgeted works programme—is the single largest prospective contributor in every scenario, followed by the operational water-and-sewer charge and development-rights sales; this ordering is grounded in observed municipal data and a bottom-up buildable-area pipeline rather than assumed shares.</w:t>
+        <w:t>Table 7: COS 2026 buildability schedule and the resulting ceiling of additional buildable area, by zone. Base 10 m → maximum 36 m (~8.7 extra floors) reachable only via Derechos de Construcción Adicional (Suelo Creado) and the differential-rent instrument. The ceiling assumes full take-up of all transferable rights and is therefore an upper bound, not an annual figure. Source: draft COS 2026 (Tabla 10); zoning comparison report 2019–2026 (geometries/FOS from 2022 zoning).</w:t>
+      </w:r>
+    </w:p>
+    <w:p>
+      <w:r>
+        <w:t>Valuing the modelled take-up closes the estimate. Created floor space sells at roughly USD 300–1,200 per square metre in these zones (built-value map), of which the two instruments capture only a small fraction: Suelo Creado at a unit price of about 50–250 UT/m², and the differential-rent instrument at about 30–180 UT/m² (UT 2026 = ARS 235), both consistent with undeveloped land values of USD 10–150/m². Development-rights sales then yield about USD 0.09 million (Low), 0.57 million (Base) and 1.89 million (High) per year, and differential rent capture about USD 0.06, 0.38 and 1.36 million. The remaining two instruments are not separately quantified: transferable development rights depend on an as-yet-untraded market, and tax incentives operate as a net fiscal cost in the early years before becoming revenue-neutral.</w:t>
+      </w:r>
+    </w:p>
+    <w:p>
+      <w:r>
+        <w:t>Aggregating the three quantifiable value-capture instruments gives an ex-ante potential of approximately USD 0.85 million (Low), USD 2.1 million (Base), and USD 4.6 million (High) per year (Table 8). Combined with the roughly USD 0.97 million of realized operational revenue, the framework’s total annual revenue potential is on the order of USD 1.8 million (Low) to USD 5.6 million (High), with a baseline near USD 3.0 million. The betterment levy and the development-rights/differential-rent pair are the largest prospective contributors, alongside the already-operational water-and-sewer charge; this ordering is grounded in observed municipal data, the real 2026 works programme, and the COS 2026 buildability schedule rather than assumed shares. Beyond the annual flow, the 295-million-m² rights ceiling represents a very large long-run capture base that will not bind for decades.</w:t>
       </w:r>
     </w:p>
     <w:tbl>
@@ -4795,51 +4977,51 @@
           <w:p>
             <w:r/>
             <w:r>
-              <w:t>Development-rights sales (Suelo Creado)</w:t>
-            </w:r>
-          </w:p>
-        </w:tc>
-        <w:tc>
-          <w:tcPr>
-            <w:tcW w:type="dxa" w:w="1872"/>
-          </w:tcPr>
-          <w:p>
-            <w:r/>
-            <w:r>
-              <w:t>Buildable pipeline (Table 7), ~50% of m² × 50–300 UT/m²</w:t>
-            </w:r>
-          </w:p>
-        </w:tc>
-        <w:tc>
-          <w:tcPr>
-            <w:tcW w:type="dxa" w:w="1872"/>
-          </w:tcPr>
-          <w:p>
-            <w:r/>
-            <w:r>
-              <w:t>0.03 M</w:t>
-            </w:r>
-          </w:p>
-        </w:tc>
-        <w:tc>
-          <w:tcPr>
-            <w:tcW w:type="dxa" w:w="1872"/>
-          </w:tcPr>
-          <w:p>
-            <w:r/>
-            <w:r>
-              <w:t>0.17 M</w:t>
-            </w:r>
-          </w:p>
-        </w:tc>
-        <w:tc>
-          <w:tcPr>
-            <w:tcW w:type="dxa" w:w="1872"/>
-          </w:tcPr>
-          <w:p>
-            <w:r/>
-            <w:r>
-              <w:t>1.02 M</w:t>
+              <w:t>Development-rights sales (Suelo Creado / DCA)</w:t>
+            </w:r>
+          </w:p>
+        </w:tc>
+        <w:tc>
+          <w:tcPr>
+            <w:tcW w:type="dxa" w:w="1872"/>
+          </w:tcPr>
+          <w:p>
+            <w:r/>
+            <w:r>
+              <w:t>COS 2026 take-up (Table 7), ~50% of m² × 50–250 UT/m²</w:t>
+            </w:r>
+          </w:p>
+        </w:tc>
+        <w:tc>
+          <w:tcPr>
+            <w:tcW w:type="dxa" w:w="1872"/>
+          </w:tcPr>
+          <w:p>
+            <w:r/>
+            <w:r>
+              <w:t>0.09 M</w:t>
+            </w:r>
+          </w:p>
+        </w:tc>
+        <w:tc>
+          <w:tcPr>
+            <w:tcW w:type="dxa" w:w="1872"/>
+          </w:tcPr>
+          <w:p>
+            <w:r/>
+            <w:r>
+              <w:t>0.57 M</w:t>
+            </w:r>
+          </w:p>
+        </w:tc>
+        <w:tc>
+          <w:tcPr>
+            <w:tcW w:type="dxa" w:w="1872"/>
+          </w:tcPr>
+          <w:p>
+            <w:r/>
+            <w:r>
+              <w:t>1.89 M</w:t>
             </w:r>
           </w:p>
         </w:tc>
@@ -4863,40 +5045,40 @@
           <w:p>
             <w:r/>
             <w:r>
-              <w:t>Buildable pipeline (Table 7), ~50% of m² × 30–200 UT/m²</w:t>
-            </w:r>
-          </w:p>
-        </w:tc>
-        <w:tc>
-          <w:tcPr>
-            <w:tcW w:type="dxa" w:w="1872"/>
-          </w:tcPr>
-          <w:p>
-            <w:r/>
-            <w:r>
-              <w:t>0.02 M</w:t>
-            </w:r>
-          </w:p>
-        </w:tc>
-        <w:tc>
-          <w:tcPr>
-            <w:tcW w:type="dxa" w:w="1872"/>
-          </w:tcPr>
-          <w:p>
-            <w:r/>
-            <w:r>
-              <w:t>0.11 M</w:t>
-            </w:r>
-          </w:p>
-        </w:tc>
-        <w:tc>
-          <w:tcPr>
-            <w:tcW w:type="dxa" w:w="1872"/>
-          </w:tcPr>
-          <w:p>
-            <w:r/>
-            <w:r>
-              <w:t>0.68 M</w:t>
+              <w:t>COS 2026 take-up (Table 7), ~50% of m² × 30–180 UT/m²</w:t>
+            </w:r>
+          </w:p>
+        </w:tc>
+        <w:tc>
+          <w:tcPr>
+            <w:tcW w:type="dxa" w:w="1872"/>
+          </w:tcPr>
+          <w:p>
+            <w:r/>
+            <w:r>
+              <w:t>0.06 M</w:t>
+            </w:r>
+          </w:p>
+        </w:tc>
+        <w:tc>
+          <w:tcPr>
+            <w:tcW w:type="dxa" w:w="1872"/>
+          </w:tcPr>
+          <w:p>
+            <w:r/>
+            <w:r>
+              <w:t>0.38 M</w:t>
+            </w:r>
+          </w:p>
+        </w:tc>
+        <w:tc>
+          <w:tcPr>
+            <w:tcW w:type="dxa" w:w="1872"/>
+          </w:tcPr>
+          <w:p>
+            <w:r/>
+            <w:r>
+              <w:t>1.36 M</w:t>
             </w:r>
           </w:p>
         </w:tc>
@@ -4929,29 +5111,29 @@
           <w:p>
             <w:r/>
             <w:r>
-              <w:t>0.75 M</w:t>
-            </w:r>
-          </w:p>
-        </w:tc>
-        <w:tc>
-          <w:tcPr>
-            <w:tcW w:type="dxa" w:w="1872"/>
-          </w:tcPr>
-          <w:p>
-            <w:r/>
-            <w:r>
-              <w:t>1.40 M</w:t>
-            </w:r>
-          </w:p>
-        </w:tc>
-        <w:tc>
-          <w:tcPr>
-            <w:tcW w:type="dxa" w:w="1872"/>
-          </w:tcPr>
-          <w:p>
-            <w:r/>
-            <w:r>
-              <w:t>3.10 M</w:t>
+              <w:t>0.85 M</w:t>
+            </w:r>
+          </w:p>
+        </w:tc>
+        <w:tc>
+          <w:tcPr>
+            <w:tcW w:type="dxa" w:w="1872"/>
+          </w:tcPr>
+          <w:p>
+            <w:r/>
+            <w:r>
+              <w:t>2.07 M</w:t>
+            </w:r>
+          </w:p>
+        </w:tc>
+        <w:tc>
+          <w:tcPr>
+            <w:tcW w:type="dxa" w:w="1872"/>
+          </w:tcPr>
+          <w:p>
+            <w:r/>
+            <w:r>
+              <w:t>4.65 M</w:t>
             </w:r>
           </w:p>
         </w:tc>
@@ -5041,29 +5223,29 @@
           <w:p>
             <w:r/>
             <w:r>
-              <w:t>1.72 M</w:t>
-            </w:r>
-          </w:p>
-        </w:tc>
-        <w:tc>
-          <w:tcPr>
-            <w:tcW w:type="dxa" w:w="1872"/>
-          </w:tcPr>
-          <w:p>
-            <w:r/>
-            <w:r>
-              <w:t>2.37 M</w:t>
-            </w:r>
-          </w:p>
-        </w:tc>
-        <w:tc>
-          <w:tcPr>
-            <w:tcW w:type="dxa" w:w="1872"/>
-          </w:tcPr>
-          <w:p>
-            <w:r/>
-            <w:r>
-              <w:t>4.07 M</w:t>
+              <w:t>1.82 M</w:t>
+            </w:r>
+          </w:p>
+        </w:tc>
+        <w:tc>
+          <w:tcPr>
+            <w:tcW w:type="dxa" w:w="1872"/>
+          </w:tcPr>
+          <w:p>
+            <w:r/>
+            <w:r>
+              <w:t>3.04 M</w:t>
+            </w:r>
+          </w:p>
+        </w:tc>
+        <w:tc>
+          <w:tcPr>
+            <w:tcW w:type="dxa" w:w="1872"/>
+          </w:tcPr>
+          <w:p>
+            <w:r/>
+            <w:r>
+              <w:t>5.62 M</w:t>
             </w:r>
           </w:p>
         </w:tc>
@@ -5088,7 +5270,7 @@
     </w:p>
     <w:p>
       <w:r>
-        <w:t>To place these flows in context, we monetise one illustrative adaptation deficit drawn from the priority index. Reaching the index’s green-space target of 10 m² per inhabitant from a current municipal average near 6 m²/hab implies a deficit of roughly 700,000 m² for a population of about 175,000; at an indicative USD 80 per square metre for green infrastructure, this represents a one-off capital need on the order of USD 56 million. The baseline combined annual revenue of about USD 2.4 million therefore covers some 4 percent of this single deficit per year on a pay-as-you-go basis. It is the Trust Fund’s leverage logic that closes the gap: with the Leverage Account accumulating dedicated reserves and a predictable, audited revenue stream that can be pledged as security, a green-bond issuance of three to four times annual revenue (roughly USD 7 to 10 million) becomes feasible, and the accumulated track record positions the municipality for larger multilateral facilities such as the Green Climate Fund. The decisive structural feature is that own-source revenues are linked to the adaptation investments they finance, creating a self-reinforcing cycle rather than a one-off transfer.</w:t>
+        <w:t>To place these flows in context, we monetise one illustrative adaptation deficit drawn from the priority index. Reaching the index’s green-space target of 10 m² per inhabitant from a current municipal average near 6 m²/hab implies a deficit of roughly 700,000 m² for a population of about 175,000; at an indicative USD 80 per square metre for green infrastructure, this represents a one-off capital need on the order of USD 56 million. The baseline combined annual revenue of about USD 3.0 million therefore covers some 5 percent of this single deficit per year on a pay-as-you-go basis. It is the Trust Fund’s leverage logic (Section 5.5) that closes the gap: with the Leverage Account accumulating dedicated reserves and a predictable, audited revenue stream that can be pledged as security, a green-bond issuance of three to four times annual revenue (roughly USD 9 to 12 million) becomes feasible, and the accumulated track record positions the municipality for larger multilateral facilities such as the Green Climate Fund. The decisive structural feature is that own-source revenues are linked to the adaptation investments they finance, creating a self-reinforcing cycle rather than a one-off transfer.</w:t>
       </w:r>
     </w:p>
     <w:p>

</xml_diff>